<commit_message>
Polish docx layout: widen the legs table time column, hyperlink photo credits
Rendered every page through real Word: the "Время" column no longer
wraps mid-phrase, and the long Commons URLs became single-line
clickable "страница файла на Wikimedia Commons" links.

🤖 Generated with Codebuff
Co-Authored-By: Codebuff <noreply@codebuff.com>
</commit_message>
<xml_diff>
--- a/Дорогами-духовности-сайт.docx
+++ b/Дорогами-духовности-сайт.docx
@@ -351,11 +351,11 @@
         </w:tblBorders>
       </w:tblPr>
       <w:tblGrid>
-        <w:gridCol w:w="700"/>
-        <w:gridCol w:w="2900"/>
-        <w:gridCol w:w="1900"/>
-        <w:gridCol w:w="1400"/>
-        <w:gridCol w:w="2940"/>
+        <w:gridCol w:w="600"/>
+        <w:gridCol w:w="2700"/>
+        <w:gridCol w:w="1600"/>
+        <w:gridCol w:w="1300"/>
+        <w:gridCol w:w="3640"/>
       </w:tblGrid>
       <w:tr>
         <w:trPr>
@@ -363,7 +363,7 @@
         </w:trPr>
         <w:tc>
           <w:tcPr>
-            <w:tcW w:type="dxa" w:w="700"/>
+            <w:tcW w:type="dxa" w:w="600"/>
             <w:shd w:fill="EDE7DA" w:val="clear"/>
             <w:tcMar>
               <w:top w:type="dxa" w:w="60"/>
@@ -391,7 +391,7 @@
         </w:tc>
         <w:tc>
           <w:tcPr>
-            <w:tcW w:type="dxa" w:w="2900"/>
+            <w:tcW w:type="dxa" w:w="2700"/>
             <w:shd w:fill="EDE7DA" w:val="clear"/>
             <w:tcMar>
               <w:top w:type="dxa" w:w="60"/>
@@ -419,7 +419,7 @@
         </w:tc>
         <w:tc>
           <w:tcPr>
-            <w:tcW w:type="dxa" w:w="1900"/>
+            <w:tcW w:type="dxa" w:w="1600"/>
             <w:shd w:fill="EDE7DA" w:val="clear"/>
             <w:tcMar>
               <w:top w:type="dxa" w:w="60"/>
@@ -447,7 +447,7 @@
         </w:tc>
         <w:tc>
           <w:tcPr>
-            <w:tcW w:type="dxa" w:w="1400"/>
+            <w:tcW w:type="dxa" w:w="1300"/>
             <w:shd w:fill="EDE7DA" w:val="clear"/>
             <w:tcMar>
               <w:top w:type="dxa" w:w="60"/>
@@ -475,7 +475,7 @@
         </w:tc>
         <w:tc>
           <w:tcPr>
-            <w:tcW w:type="dxa" w:w="2940"/>
+            <w:tcW w:type="dxa" w:w="3640"/>
             <w:shd w:fill="EDE7DA" w:val="clear"/>
             <w:tcMar>
               <w:top w:type="dxa" w:w="60"/>
@@ -505,7 +505,7 @@
       <w:tr>
         <w:tc>
           <w:tcPr>
-            <w:tcW w:type="dxa" w:w="700"/>
+            <w:tcW w:type="dxa" w:w="600"/>
             <w:tcMar>
               <w:top w:type="dxa" w:w="60"/>
               <w:left w:type="dxa" w:w="100"/>
@@ -532,7 +532,7 @@
         </w:tc>
         <w:tc>
           <w:tcPr>
-            <w:tcW w:type="dxa" w:w="2900"/>
+            <w:tcW w:type="dxa" w:w="2700"/>
             <w:tcMar>
               <w:top w:type="dxa" w:w="60"/>
               <w:left w:type="dxa" w:w="100"/>
@@ -559,7 +559,7 @@
         </w:tc>
         <w:tc>
           <w:tcPr>
-            <w:tcW w:type="dxa" w:w="1900"/>
+            <w:tcW w:type="dxa" w:w="1600"/>
             <w:tcMar>
               <w:top w:type="dxa" w:w="60"/>
               <w:left w:type="dxa" w:w="100"/>
@@ -586,7 +586,7 @@
         </w:tc>
         <w:tc>
           <w:tcPr>
-            <w:tcW w:type="dxa" w:w="1400"/>
+            <w:tcW w:type="dxa" w:w="1300"/>
             <w:tcMar>
               <w:top w:type="dxa" w:w="60"/>
               <w:left w:type="dxa" w:w="100"/>
@@ -613,7 +613,7 @@
         </w:tc>
         <w:tc>
           <w:tcPr>
-            <w:tcW w:type="dxa" w:w="2940"/>
+            <w:tcW w:type="dxa" w:w="3640"/>
             <w:tcMar>
               <w:top w:type="dxa" w:w="60"/>
               <w:left w:type="dxa" w:w="100"/>
@@ -642,7 +642,7 @@
       <w:tr>
         <w:tc>
           <w:tcPr>
-            <w:tcW w:type="dxa" w:w="700"/>
+            <w:tcW w:type="dxa" w:w="600"/>
             <w:tcMar>
               <w:top w:type="dxa" w:w="60"/>
               <w:left w:type="dxa" w:w="100"/>
@@ -669,7 +669,7 @@
         </w:tc>
         <w:tc>
           <w:tcPr>
-            <w:tcW w:type="dxa" w:w="2900"/>
+            <w:tcW w:type="dxa" w:w="2700"/>
             <w:tcMar>
               <w:top w:type="dxa" w:w="60"/>
               <w:left w:type="dxa" w:w="100"/>
@@ -696,7 +696,7 @@
         </w:tc>
         <w:tc>
           <w:tcPr>
-            <w:tcW w:type="dxa" w:w="1900"/>
+            <w:tcW w:type="dxa" w:w="1600"/>
             <w:tcMar>
               <w:top w:type="dxa" w:w="60"/>
               <w:left w:type="dxa" w:w="100"/>
@@ -723,7 +723,7 @@
         </w:tc>
         <w:tc>
           <w:tcPr>
-            <w:tcW w:type="dxa" w:w="1400"/>
+            <w:tcW w:type="dxa" w:w="1300"/>
             <w:tcMar>
               <w:top w:type="dxa" w:w="60"/>
               <w:left w:type="dxa" w:w="100"/>
@@ -750,7 +750,7 @@
         </w:tc>
         <w:tc>
           <w:tcPr>
-            <w:tcW w:type="dxa" w:w="2940"/>
+            <w:tcW w:type="dxa" w:w="3640"/>
             <w:tcMar>
               <w:top w:type="dxa" w:w="60"/>
               <w:left w:type="dxa" w:w="100"/>
@@ -779,7 +779,7 @@
       <w:tr>
         <w:tc>
           <w:tcPr>
-            <w:tcW w:type="dxa" w:w="700"/>
+            <w:tcW w:type="dxa" w:w="600"/>
             <w:tcMar>
               <w:top w:type="dxa" w:w="60"/>
               <w:left w:type="dxa" w:w="100"/>
@@ -806,7 +806,7 @@
         </w:tc>
         <w:tc>
           <w:tcPr>
-            <w:tcW w:type="dxa" w:w="2900"/>
+            <w:tcW w:type="dxa" w:w="2700"/>
             <w:tcMar>
               <w:top w:type="dxa" w:w="60"/>
               <w:left w:type="dxa" w:w="100"/>
@@ -833,7 +833,7 @@
         </w:tc>
         <w:tc>
           <w:tcPr>
-            <w:tcW w:type="dxa" w:w="1900"/>
+            <w:tcW w:type="dxa" w:w="1600"/>
             <w:tcMar>
               <w:top w:type="dxa" w:w="60"/>
               <w:left w:type="dxa" w:w="100"/>
@@ -860,7 +860,7 @@
         </w:tc>
         <w:tc>
           <w:tcPr>
-            <w:tcW w:type="dxa" w:w="1400"/>
+            <w:tcW w:type="dxa" w:w="1300"/>
             <w:tcMar>
               <w:top w:type="dxa" w:w="60"/>
               <w:left w:type="dxa" w:w="100"/>
@@ -887,7 +887,7 @@
         </w:tc>
         <w:tc>
           <w:tcPr>
-            <w:tcW w:type="dxa" w:w="2940"/>
+            <w:tcW w:type="dxa" w:w="3640"/>
             <w:tcMar>
               <w:top w:type="dxa" w:w="60"/>
               <w:left w:type="dxa" w:w="100"/>
@@ -916,7 +916,7 @@
       <w:tr>
         <w:tc>
           <w:tcPr>
-            <w:tcW w:type="dxa" w:w="700"/>
+            <w:tcW w:type="dxa" w:w="600"/>
             <w:tcMar>
               <w:top w:type="dxa" w:w="60"/>
               <w:left w:type="dxa" w:w="100"/>
@@ -943,7 +943,7 @@
         </w:tc>
         <w:tc>
           <w:tcPr>
-            <w:tcW w:type="dxa" w:w="2900"/>
+            <w:tcW w:type="dxa" w:w="2700"/>
             <w:tcMar>
               <w:top w:type="dxa" w:w="60"/>
               <w:left w:type="dxa" w:w="100"/>
@@ -970,7 +970,7 @@
         </w:tc>
         <w:tc>
           <w:tcPr>
-            <w:tcW w:type="dxa" w:w="1900"/>
+            <w:tcW w:type="dxa" w:w="1600"/>
             <w:tcMar>
               <w:top w:type="dxa" w:w="60"/>
               <w:left w:type="dxa" w:w="100"/>
@@ -997,7 +997,7 @@
         </w:tc>
         <w:tc>
           <w:tcPr>
-            <w:tcW w:type="dxa" w:w="1400"/>
+            <w:tcW w:type="dxa" w:w="1300"/>
             <w:tcMar>
               <w:top w:type="dxa" w:w="60"/>
               <w:left w:type="dxa" w:w="100"/>
@@ -1024,7 +1024,7 @@
         </w:tc>
         <w:tc>
           <w:tcPr>
-            <w:tcW w:type="dxa" w:w="2940"/>
+            <w:tcW w:type="dxa" w:w="3640"/>
             <w:tcMar>
               <w:top w:type="dxa" w:w="60"/>
               <w:left w:type="dxa" w:w="100"/>
@@ -1053,7 +1053,7 @@
       <w:tr>
         <w:tc>
           <w:tcPr>
-            <w:tcW w:type="dxa" w:w="700"/>
+            <w:tcW w:type="dxa" w:w="600"/>
             <w:tcMar>
               <w:top w:type="dxa" w:w="60"/>
               <w:left w:type="dxa" w:w="100"/>
@@ -1080,7 +1080,7 @@
         </w:tc>
         <w:tc>
           <w:tcPr>
-            <w:tcW w:type="dxa" w:w="2900"/>
+            <w:tcW w:type="dxa" w:w="2700"/>
             <w:tcMar>
               <w:top w:type="dxa" w:w="60"/>
               <w:left w:type="dxa" w:w="100"/>
@@ -1107,7 +1107,7 @@
         </w:tc>
         <w:tc>
           <w:tcPr>
-            <w:tcW w:type="dxa" w:w="1900"/>
+            <w:tcW w:type="dxa" w:w="1600"/>
             <w:tcMar>
               <w:top w:type="dxa" w:w="60"/>
               <w:left w:type="dxa" w:w="100"/>
@@ -1134,7 +1134,7 @@
         </w:tc>
         <w:tc>
           <w:tcPr>
-            <w:tcW w:type="dxa" w:w="1400"/>
+            <w:tcW w:type="dxa" w:w="1300"/>
             <w:tcMar>
               <w:top w:type="dxa" w:w="60"/>
               <w:left w:type="dxa" w:w="100"/>
@@ -1161,7 +1161,7 @@
         </w:tc>
         <w:tc>
           <w:tcPr>
-            <w:tcW w:type="dxa" w:w="2940"/>
+            <w:tcW w:type="dxa" w:w="3640"/>
             <w:tcMar>
               <w:top w:type="dxa" w:w="60"/>
               <w:left w:type="dxa" w:w="100"/>
@@ -2527,11 +2527,11 @@
         </w:tblBorders>
       </w:tblPr>
       <w:tblGrid>
-        <w:gridCol w:w="700"/>
-        <w:gridCol w:w="2900"/>
-        <w:gridCol w:w="1900"/>
-        <w:gridCol w:w="1400"/>
-        <w:gridCol w:w="2940"/>
+        <w:gridCol w:w="600"/>
+        <w:gridCol w:w="2700"/>
+        <w:gridCol w:w="1600"/>
+        <w:gridCol w:w="1300"/>
+        <w:gridCol w:w="3640"/>
       </w:tblGrid>
       <w:tr>
         <w:trPr>
@@ -2539,7 +2539,7 @@
         </w:trPr>
         <w:tc>
           <w:tcPr>
-            <w:tcW w:type="dxa" w:w="700"/>
+            <w:tcW w:type="dxa" w:w="600"/>
             <w:shd w:fill="EDE7DA" w:val="clear"/>
             <w:tcMar>
               <w:top w:type="dxa" w:w="60"/>
@@ -2567,7 +2567,7 @@
         </w:tc>
         <w:tc>
           <w:tcPr>
-            <w:tcW w:type="dxa" w:w="2900"/>
+            <w:tcW w:type="dxa" w:w="2700"/>
             <w:shd w:fill="EDE7DA" w:val="clear"/>
             <w:tcMar>
               <w:top w:type="dxa" w:w="60"/>
@@ -2595,7 +2595,7 @@
         </w:tc>
         <w:tc>
           <w:tcPr>
-            <w:tcW w:type="dxa" w:w="1900"/>
+            <w:tcW w:type="dxa" w:w="1600"/>
             <w:shd w:fill="EDE7DA" w:val="clear"/>
             <w:tcMar>
               <w:top w:type="dxa" w:w="60"/>
@@ -2623,7 +2623,7 @@
         </w:tc>
         <w:tc>
           <w:tcPr>
-            <w:tcW w:type="dxa" w:w="1400"/>
+            <w:tcW w:type="dxa" w:w="1300"/>
             <w:shd w:fill="EDE7DA" w:val="clear"/>
             <w:tcMar>
               <w:top w:type="dxa" w:w="60"/>
@@ -2651,7 +2651,7 @@
         </w:tc>
         <w:tc>
           <w:tcPr>
-            <w:tcW w:type="dxa" w:w="2940"/>
+            <w:tcW w:type="dxa" w:w="3640"/>
             <w:shd w:fill="EDE7DA" w:val="clear"/>
             <w:tcMar>
               <w:top w:type="dxa" w:w="60"/>
@@ -2681,7 +2681,7 @@
       <w:tr>
         <w:tc>
           <w:tcPr>
-            <w:tcW w:type="dxa" w:w="700"/>
+            <w:tcW w:type="dxa" w:w="600"/>
             <w:tcMar>
               <w:top w:type="dxa" w:w="60"/>
               <w:left w:type="dxa" w:w="100"/>
@@ -2708,7 +2708,7 @@
         </w:tc>
         <w:tc>
           <w:tcPr>
-            <w:tcW w:type="dxa" w:w="2900"/>
+            <w:tcW w:type="dxa" w:w="2700"/>
             <w:tcMar>
               <w:top w:type="dxa" w:w="60"/>
               <w:left w:type="dxa" w:w="100"/>
@@ -2735,7 +2735,7 @@
         </w:tc>
         <w:tc>
           <w:tcPr>
-            <w:tcW w:type="dxa" w:w="1900"/>
+            <w:tcW w:type="dxa" w:w="1600"/>
             <w:tcMar>
               <w:top w:type="dxa" w:w="60"/>
               <w:left w:type="dxa" w:w="100"/>
@@ -2762,7 +2762,7 @@
         </w:tc>
         <w:tc>
           <w:tcPr>
-            <w:tcW w:type="dxa" w:w="1400"/>
+            <w:tcW w:type="dxa" w:w="1300"/>
             <w:tcMar>
               <w:top w:type="dxa" w:w="60"/>
               <w:left w:type="dxa" w:w="100"/>
@@ -2789,7 +2789,7 @@
         </w:tc>
         <w:tc>
           <w:tcPr>
-            <w:tcW w:type="dxa" w:w="2940"/>
+            <w:tcW w:type="dxa" w:w="3640"/>
             <w:tcMar>
               <w:top w:type="dxa" w:w="60"/>
               <w:left w:type="dxa" w:w="100"/>
@@ -2818,7 +2818,7 @@
       <w:tr>
         <w:tc>
           <w:tcPr>
-            <w:tcW w:type="dxa" w:w="700"/>
+            <w:tcW w:type="dxa" w:w="600"/>
             <w:tcMar>
               <w:top w:type="dxa" w:w="60"/>
               <w:left w:type="dxa" w:w="100"/>
@@ -2845,7 +2845,7 @@
         </w:tc>
         <w:tc>
           <w:tcPr>
-            <w:tcW w:type="dxa" w:w="2900"/>
+            <w:tcW w:type="dxa" w:w="2700"/>
             <w:tcMar>
               <w:top w:type="dxa" w:w="60"/>
               <w:left w:type="dxa" w:w="100"/>
@@ -2872,7 +2872,7 @@
         </w:tc>
         <w:tc>
           <w:tcPr>
-            <w:tcW w:type="dxa" w:w="1900"/>
+            <w:tcW w:type="dxa" w:w="1600"/>
             <w:tcMar>
               <w:top w:type="dxa" w:w="60"/>
               <w:left w:type="dxa" w:w="100"/>
@@ -2899,7 +2899,7 @@
         </w:tc>
         <w:tc>
           <w:tcPr>
-            <w:tcW w:type="dxa" w:w="1400"/>
+            <w:tcW w:type="dxa" w:w="1300"/>
             <w:tcMar>
               <w:top w:type="dxa" w:w="60"/>
               <w:left w:type="dxa" w:w="100"/>
@@ -2926,7 +2926,7 @@
         </w:tc>
         <w:tc>
           <w:tcPr>
-            <w:tcW w:type="dxa" w:w="2940"/>
+            <w:tcW w:type="dxa" w:w="3640"/>
             <w:tcMar>
               <w:top w:type="dxa" w:w="60"/>
               <w:left w:type="dxa" w:w="100"/>
@@ -2955,7 +2955,7 @@
       <w:tr>
         <w:tc>
           <w:tcPr>
-            <w:tcW w:type="dxa" w:w="700"/>
+            <w:tcW w:type="dxa" w:w="600"/>
             <w:tcMar>
               <w:top w:type="dxa" w:w="60"/>
               <w:left w:type="dxa" w:w="100"/>
@@ -2982,7 +2982,7 @@
         </w:tc>
         <w:tc>
           <w:tcPr>
-            <w:tcW w:type="dxa" w:w="2900"/>
+            <w:tcW w:type="dxa" w:w="2700"/>
             <w:tcMar>
               <w:top w:type="dxa" w:w="60"/>
               <w:left w:type="dxa" w:w="100"/>
@@ -3009,7 +3009,7 @@
         </w:tc>
         <w:tc>
           <w:tcPr>
-            <w:tcW w:type="dxa" w:w="1900"/>
+            <w:tcW w:type="dxa" w:w="1600"/>
             <w:tcMar>
               <w:top w:type="dxa" w:w="60"/>
               <w:left w:type="dxa" w:w="100"/>
@@ -3036,7 +3036,7 @@
         </w:tc>
         <w:tc>
           <w:tcPr>
-            <w:tcW w:type="dxa" w:w="1400"/>
+            <w:tcW w:type="dxa" w:w="1300"/>
             <w:tcMar>
               <w:top w:type="dxa" w:w="60"/>
               <w:left w:type="dxa" w:w="100"/>
@@ -3063,7 +3063,7 @@
         </w:tc>
         <w:tc>
           <w:tcPr>
-            <w:tcW w:type="dxa" w:w="2940"/>
+            <w:tcW w:type="dxa" w:w="3640"/>
             <w:tcMar>
               <w:top w:type="dxa" w:w="60"/>
               <w:left w:type="dxa" w:w="100"/>
@@ -3092,7 +3092,7 @@
       <w:tr>
         <w:tc>
           <w:tcPr>
-            <w:tcW w:type="dxa" w:w="700"/>
+            <w:tcW w:type="dxa" w:w="600"/>
             <w:tcMar>
               <w:top w:type="dxa" w:w="60"/>
               <w:left w:type="dxa" w:w="100"/>
@@ -3119,7 +3119,7 @@
         </w:tc>
         <w:tc>
           <w:tcPr>
-            <w:tcW w:type="dxa" w:w="2900"/>
+            <w:tcW w:type="dxa" w:w="2700"/>
             <w:tcMar>
               <w:top w:type="dxa" w:w="60"/>
               <w:left w:type="dxa" w:w="100"/>
@@ -3146,7 +3146,7 @@
         </w:tc>
         <w:tc>
           <w:tcPr>
-            <w:tcW w:type="dxa" w:w="1900"/>
+            <w:tcW w:type="dxa" w:w="1600"/>
             <w:tcMar>
               <w:top w:type="dxa" w:w="60"/>
               <w:left w:type="dxa" w:w="100"/>
@@ -3173,7 +3173,7 @@
         </w:tc>
         <w:tc>
           <w:tcPr>
-            <w:tcW w:type="dxa" w:w="1400"/>
+            <w:tcW w:type="dxa" w:w="1300"/>
             <w:tcMar>
               <w:top w:type="dxa" w:w="60"/>
               <w:left w:type="dxa" w:w="100"/>
@@ -3200,7 +3200,7 @@
         </w:tc>
         <w:tc>
           <w:tcPr>
-            <w:tcW w:type="dxa" w:w="2940"/>
+            <w:tcW w:type="dxa" w:w="3640"/>
             <w:tcMar>
               <w:top w:type="dxa" w:w="60"/>
               <w:left w:type="dxa" w:w="100"/>
@@ -3229,7 +3229,7 @@
       <w:tr>
         <w:tc>
           <w:tcPr>
-            <w:tcW w:type="dxa" w:w="700"/>
+            <w:tcW w:type="dxa" w:w="600"/>
             <w:tcMar>
               <w:top w:type="dxa" w:w="60"/>
               <w:left w:type="dxa" w:w="100"/>
@@ -3256,7 +3256,7 @@
         </w:tc>
         <w:tc>
           <w:tcPr>
-            <w:tcW w:type="dxa" w:w="2900"/>
+            <w:tcW w:type="dxa" w:w="2700"/>
             <w:tcMar>
               <w:top w:type="dxa" w:w="60"/>
               <w:left w:type="dxa" w:w="100"/>
@@ -3283,7 +3283,7 @@
         </w:tc>
         <w:tc>
           <w:tcPr>
-            <w:tcW w:type="dxa" w:w="1900"/>
+            <w:tcW w:type="dxa" w:w="1600"/>
             <w:tcMar>
               <w:top w:type="dxa" w:w="60"/>
               <w:left w:type="dxa" w:w="100"/>
@@ -3310,7 +3310,7 @@
         </w:tc>
         <w:tc>
           <w:tcPr>
-            <w:tcW w:type="dxa" w:w="1400"/>
+            <w:tcW w:type="dxa" w:w="1300"/>
             <w:tcMar>
               <w:top w:type="dxa" w:w="60"/>
               <w:left w:type="dxa" w:w="100"/>
@@ -3337,7 +3337,7 @@
         </w:tc>
         <w:tc>
           <w:tcPr>
-            <w:tcW w:type="dxa" w:w="2940"/>
+            <w:tcW w:type="dxa" w:w="3640"/>
             <w:tcMar>
               <w:top w:type="dxa" w:w="60"/>
               <w:left w:type="dxa" w:w="100"/>
@@ -4908,8 +4908,22 @@
           <w:sz w:val="18"/>
           <w:szCs w:val="18"/>
         </w:rPr>
-        <w:t xml:space="preserve">Автор: Сяргей Яраховіч (Валацуга), Wikimedia Commons, CC BY-SA 3.0 — https://commons.wikimedia.org/wiki/File:%D0%93%D1%83%D0%B4%D0%B7%D0%B5%D0%B2%D1%96%D1%87%D1%8B._%D0%A1%D0%B2%D1%8F%D1%82%D0%B0-%D0%A0%D0%B0%D1%81%D1%82%D0%B2%D0%B0-%D0%91%D0%B0%D0%B3%D0%B0%D1%80%D0%BE%D0%B4%D0%B7%D1%96%D1%86%D0%BA%D0%B0%D1%8F_%D1%86%D0%B0%D1%80%D0%BA%D0%B2%D0%B0.jpg</w:t>
-      </w:r>
+        <w:t xml:space="preserve">Автор: Сяргей Яраховіч (Валацуга), Wikimedia Commons, CC BY-SA 3.0 — </w:t>
+      </w:r>
+      <w:hyperlink w:history="1" r:id="rIdbj9dsz6chssrg6fsebyzt">
+        <w:r>
+          <w:rPr>
+            <w:rFonts w:ascii="Times New Roman" w:cs="Times New Roman" w:eastAsia="Times New Roman" w:hAnsi="Times New Roman"/>
+            <w:i/>
+            <w:iCs/>
+            <w:color w:val="1F4E79"/>
+            <w:sz w:val="18"/>
+            <w:szCs w:val="18"/>
+            <w:u w:val="single"/>
+          </w:rPr>
+          <w:t xml:space="preserve">страница файла на Wikimedia Commons</w:t>
+        </w:r>
+      </w:hyperlink>
     </w:p>
     <w:p>
       <w:pPr>
@@ -5211,8 +5225,22 @@
           <w:sz w:val="18"/>
           <w:szCs w:val="18"/>
         </w:rPr>
-        <w:t xml:space="preserve">Автор: В.Васіленка (fgb.by), Wikimedia Commons, CC BY-SA 3.0 — https://commons.wikimedia.org/wiki/File:%D0%9B%D1%83%D0%BD%D0%BD%D0%BE._%D0%A6%D0%B0%D1%80%D0%BA%D0%B2%D0%B0.jpg</w:t>
-      </w:r>
+        <w:t xml:space="preserve">Автор: В.Васіленка (fgb.by), Wikimedia Commons, CC BY-SA 3.0 — </w:t>
+      </w:r>
+      <w:hyperlink w:history="1" r:id="rIdc_ob1hhe8br4rj4lrhmxc">
+        <w:r>
+          <w:rPr>
+            <w:rFonts w:ascii="Times New Roman" w:cs="Times New Roman" w:eastAsia="Times New Roman" w:hAnsi="Times New Roman"/>
+            <w:i/>
+            <w:iCs/>
+            <w:color w:val="1F4E79"/>
+            <w:sz w:val="18"/>
+            <w:szCs w:val="18"/>
+            <w:u w:val="single"/>
+          </w:rPr>
+          <w:t xml:space="preserve">страница файла на Wikimedia Commons</w:t>
+        </w:r>
+      </w:hyperlink>
     </w:p>
     <w:p>
       <w:pPr>
@@ -5520,8 +5548,22 @@
           <w:sz w:val="18"/>
           <w:szCs w:val="18"/>
         </w:rPr>
-        <w:t xml:space="preserve">Автор: Борис Мавлютов, Wikimedia Commons, CC BY-SA 3.0 — https://commons.wikimedia.org/wiki/File:%D0%94%D1%83%D0%B1%D0%BD%D0%BE._%D0%A6%D0%B5%D1%80%D0%BA%D0%BE%D0%B2%D1%8C_%D0%92%D0%BE%D0%B7%D0%BD%D0%B5%D1%81%D0%B5%D0%BD%D0%B8%D1%8F_%D0%93%D0%BE%D1%81%D0%BF%D0%BE%D0%B4%D0%BD%D1%8F.jpg</w:t>
-      </w:r>
+        <w:t xml:space="preserve">Автор: Борис Мавлютов, Wikimedia Commons, CC BY-SA 3.0 — </w:t>
+      </w:r>
+      <w:hyperlink w:history="1" r:id="rIdtso7exogneqszhq8lxqeu">
+        <w:r>
+          <w:rPr>
+            <w:rFonts w:ascii="Times New Roman" w:cs="Times New Roman" w:eastAsia="Times New Roman" w:hAnsi="Times New Roman"/>
+            <w:i/>
+            <w:iCs/>
+            <w:color w:val="1F4E79"/>
+            <w:sz w:val="18"/>
+            <w:szCs w:val="18"/>
+            <w:u w:val="single"/>
+          </w:rPr>
+          <w:t xml:space="preserve">страница файла на Wikimedia Commons</w:t>
+        </w:r>
+      </w:hyperlink>
     </w:p>
     <w:p>
       <w:pPr>

</xml_diff>

<commit_message>
print: the docx repeats the site again, and checks itself
The printable copy still carried the photo report, the legs tables, «как
добраться», bus numbers, road codes and a rector who has died — every
block the site had already dropped. It is rebuilt from the same data as
the site, and the build now reads its own output back: removed blocks must
not return, headings must exist on both sides, and each photo must be
byte-identical to the file the site shows (the printed Dubno photo was
once a different church entirely). The map for print is drawn by the same
module that draws the site, rasterized at 2x, and make-docx refuses to
build on a stale map.

🤖 Generated with Codebuff
Co-Authored-By: Codebuff <noreply@codebuff.com>
</commit_message>
<xml_diff>
--- a/Дорогами-духовности-сайт.docx
+++ b/Дорогами-духовности-сайт.docx
@@ -15,24 +15,38 @@
           <w:sz w:val="24"/>
           <w:szCs w:val="24"/>
         </w:rPr>
-        <w:t xml:space="preserve">Конкурс «Гродненщина православная», Блок 1 «Дорогами духовности» (туристско-краеведческий)</w:t>
+        <w:t xml:space="preserve">Конкурс «Гродненщина православная», туристско-краеведческий</w:t>
       </w:r>
     </w:p>
     <w:p>
       <w:pPr>
         <w:pStyle w:val="Title"/>
+        <w:spacing w:after="240"/>
+        <w:jc w:val="center"/>
+      </w:pPr>
+      <w:r>
+        <w:rPr>
+          <w:rFonts w:ascii="Times New Roman" w:cs="Times New Roman" w:eastAsia="Times New Roman" w:hAnsi="Times New Roman"/>
+          <w:b/>
+          <w:bCs/>
+          <w:sz w:val="48"/>
+          <w:szCs w:val="48"/>
+        </w:rPr>
+        <w:t xml:space="preserve">Дорогами духовности</w:t>
+      </w:r>
+    </w:p>
+    <w:p>
+      <w:pPr>
         <w:spacing w:after="480"/>
         <w:jc w:val="center"/>
       </w:pPr>
       <w:r>
         <w:rPr>
           <w:rFonts w:ascii="Times New Roman" w:cs="Times New Roman" w:eastAsia="Times New Roman" w:hAnsi="Times New Roman"/>
-          <w:b/>
-          <w:bCs/>
-          <w:sz w:val="48"/>
-          <w:szCs w:val="48"/>
-        </w:rPr>
-        <w:t xml:space="preserve">«Дорогами духовности» — маршрут по храмам Мостовского района</w:t>
+          <w:sz w:val="30"/>
+          <w:szCs w:val="30"/>
+        </w:rPr>
+        <w:t xml:space="preserve">Нитка маршрута: Гродно → Гудевичи → Лунно → Дубно → Мосты</w:t>
       </w:r>
     </w:p>
     <w:p>
@@ -324,888 +338,6 @@
     </w:p>
     <w:p>
       <w:pPr>
-        <w:pStyle w:val="Heading3"/>
-        <w:spacing w:after="100" w:before="180"/>
-      </w:pPr>
-      <w:r>
-        <w:rPr>
-          <w:rFonts w:ascii="Times New Roman" w:cs="Times New Roman" w:eastAsia="Times New Roman" w:hAnsi="Times New Roman"/>
-          <w:b/>
-          <w:bCs/>
-          <w:sz w:val="24"/>
-          <w:szCs w:val="24"/>
-        </w:rPr>
-        <w:t xml:space="preserve">Перегоны</w:t>
-      </w:r>
-    </w:p>
-    <w:tbl>
-      <w:tblPr>
-        <w:tblW w:type="dxa" w:w="9840"/>
-        <w:tblBorders>
-          <w:top w:val="single" w:color="auto" w:sz="4"/>
-          <w:left w:val="single" w:color="auto" w:sz="4"/>
-          <w:bottom w:val="single" w:color="auto" w:sz="4"/>
-          <w:right w:val="single" w:color="auto" w:sz="4"/>
-          <w:insideH w:val="single" w:color="auto" w:sz="4"/>
-          <w:insideV w:val="single" w:color="auto" w:sz="4"/>
-        </w:tblBorders>
-      </w:tblPr>
-      <w:tblGrid>
-        <w:gridCol w:w="600"/>
-        <w:gridCol w:w="2700"/>
-        <w:gridCol w:w="1600"/>
-        <w:gridCol w:w="1300"/>
-        <w:gridCol w:w="3640"/>
-      </w:tblGrid>
-      <w:tr>
-        <w:trPr>
-          <w:tblHeader/>
-        </w:trPr>
-        <w:tc>
-          <w:tcPr>
-            <w:tcW w:type="dxa" w:w="600"/>
-            <w:shd w:fill="EDE7DA" w:val="clear"/>
-            <w:tcMar>
-              <w:top w:type="dxa" w:w="60"/>
-              <w:left w:type="dxa" w:w="100"/>
-              <w:bottom w:type="dxa" w:w="60"/>
-              <w:right w:type="dxa" w:w="100"/>
-            </w:tcMar>
-          </w:tcPr>
-          <w:p>
-            <w:pPr>
-              <w:spacing w:after="0"/>
-              <w:jc w:val="left"/>
-            </w:pPr>
-            <w:r>
-              <w:rPr>
-                <w:rFonts w:ascii="Times New Roman" w:cs="Times New Roman" w:eastAsia="Times New Roman" w:hAnsi="Times New Roman"/>
-                <w:b/>
-                <w:bCs/>
-                <w:sz w:val="24"/>
-                <w:szCs w:val="24"/>
-              </w:rPr>
-              <w:t xml:space="preserve">№</w:t>
-            </w:r>
-          </w:p>
-        </w:tc>
-        <w:tc>
-          <w:tcPr>
-            <w:tcW w:type="dxa" w:w="2700"/>
-            <w:shd w:fill="EDE7DA" w:val="clear"/>
-            <w:tcMar>
-              <w:top w:type="dxa" w:w="60"/>
-              <w:left w:type="dxa" w:w="100"/>
-              <w:bottom w:type="dxa" w:w="60"/>
-              <w:right w:type="dxa" w:w="100"/>
-            </w:tcMar>
-          </w:tcPr>
-          <w:p>
-            <w:pPr>
-              <w:spacing w:after="0"/>
-              <w:jc w:val="left"/>
-            </w:pPr>
-            <w:r>
-              <w:rPr>
-                <w:rFonts w:ascii="Times New Roman" w:cs="Times New Roman" w:eastAsia="Times New Roman" w:hAnsi="Times New Roman"/>
-                <w:b/>
-                <w:bCs/>
-                <w:sz w:val="24"/>
-                <w:szCs w:val="24"/>
-              </w:rPr>
-              <w:t xml:space="preserve">Участок</w:t>
-            </w:r>
-          </w:p>
-        </w:tc>
-        <w:tc>
-          <w:tcPr>
-            <w:tcW w:type="dxa" w:w="1600"/>
-            <w:shd w:fill="EDE7DA" w:val="clear"/>
-            <w:tcMar>
-              <w:top w:type="dxa" w:w="60"/>
-              <w:left w:type="dxa" w:w="100"/>
-              <w:bottom w:type="dxa" w:w="60"/>
-              <w:right w:type="dxa" w:w="100"/>
-            </w:tcMar>
-          </w:tcPr>
-          <w:p>
-            <w:pPr>
-              <w:spacing w:after="0"/>
-              <w:jc w:val="left"/>
-            </w:pPr>
-            <w:r>
-              <w:rPr>
-                <w:rFonts w:ascii="Times New Roman" w:cs="Times New Roman" w:eastAsia="Times New Roman" w:hAnsi="Times New Roman"/>
-                <w:b/>
-                <w:bCs/>
-                <w:sz w:val="24"/>
-                <w:szCs w:val="24"/>
-              </w:rPr>
-              <w:t xml:space="preserve">Способ</w:t>
-            </w:r>
-          </w:p>
-        </w:tc>
-        <w:tc>
-          <w:tcPr>
-            <w:tcW w:type="dxa" w:w="1300"/>
-            <w:shd w:fill="EDE7DA" w:val="clear"/>
-            <w:tcMar>
-              <w:top w:type="dxa" w:w="60"/>
-              <w:left w:type="dxa" w:w="100"/>
-              <w:bottom w:type="dxa" w:w="60"/>
-              <w:right w:type="dxa" w:w="100"/>
-            </w:tcMar>
-          </w:tcPr>
-          <w:p>
-            <w:pPr>
-              <w:spacing w:after="0"/>
-              <w:jc w:val="left"/>
-            </w:pPr>
-            <w:r>
-              <w:rPr>
-                <w:rFonts w:ascii="Times New Roman" w:cs="Times New Roman" w:eastAsia="Times New Roman" w:hAnsi="Times New Roman"/>
-                <w:b/>
-                <w:bCs/>
-                <w:sz w:val="24"/>
-                <w:szCs w:val="24"/>
-              </w:rPr>
-              <w:t xml:space="preserve">Расстояние</w:t>
-            </w:r>
-          </w:p>
-        </w:tc>
-        <w:tc>
-          <w:tcPr>
-            <w:tcW w:type="dxa" w:w="3640"/>
-            <w:shd w:fill="EDE7DA" w:val="clear"/>
-            <w:tcMar>
-              <w:top w:type="dxa" w:w="60"/>
-              <w:left w:type="dxa" w:w="100"/>
-              <w:bottom w:type="dxa" w:w="60"/>
-              <w:right w:type="dxa" w:w="100"/>
-            </w:tcMar>
-          </w:tcPr>
-          <w:p>
-            <w:pPr>
-              <w:spacing w:after="0"/>
-              <w:jc w:val="left"/>
-            </w:pPr>
-            <w:r>
-              <w:rPr>
-                <w:rFonts w:ascii="Times New Roman" w:cs="Times New Roman" w:eastAsia="Times New Roman" w:hAnsi="Times New Roman"/>
-                <w:b/>
-                <w:bCs/>
-                <w:sz w:val="24"/>
-                <w:szCs w:val="24"/>
-              </w:rPr>
-              <w:t xml:space="preserve">Время</w:t>
-            </w:r>
-          </w:p>
-        </w:tc>
-      </w:tr>
-      <w:tr>
-        <w:tc>
-          <w:tcPr>
-            <w:tcW w:type="dxa" w:w="600"/>
-            <w:tcMar>
-              <w:top w:type="dxa" w:w="60"/>
-              <w:left w:type="dxa" w:w="100"/>
-              <w:bottom w:type="dxa" w:w="60"/>
-              <w:right w:type="dxa" w:w="100"/>
-            </w:tcMar>
-          </w:tcPr>
-          <w:p>
-            <w:pPr>
-              <w:spacing w:after="0"/>
-              <w:jc w:val="left"/>
-            </w:pPr>
-            <w:r>
-              <w:rPr>
-                <w:rFonts w:ascii="Times New Roman" w:cs="Times New Roman" w:eastAsia="Times New Roman" w:hAnsi="Times New Roman"/>
-                <w:b w:val="false"/>
-                <w:bCs w:val="false"/>
-                <w:sz w:val="24"/>
-                <w:szCs w:val="24"/>
-              </w:rPr>
-              <w:t xml:space="preserve">1</w:t>
-            </w:r>
-          </w:p>
-        </w:tc>
-        <w:tc>
-          <w:tcPr>
-            <w:tcW w:type="dxa" w:w="2700"/>
-            <w:tcMar>
-              <w:top w:type="dxa" w:w="60"/>
-              <w:left w:type="dxa" w:w="100"/>
-              <w:bottom w:type="dxa" w:w="60"/>
-              <w:right w:type="dxa" w:w="100"/>
-            </w:tcMar>
-          </w:tcPr>
-          <w:p>
-            <w:pPr>
-              <w:spacing w:after="0"/>
-              <w:jc w:val="left"/>
-            </w:pPr>
-            <w:r>
-              <w:rPr>
-                <w:rFonts w:ascii="Times New Roman" w:cs="Times New Roman" w:eastAsia="Times New Roman" w:hAnsi="Times New Roman"/>
-                <w:b w:val="false"/>
-                <w:bCs w:val="false"/>
-                <w:sz w:val="24"/>
-                <w:szCs w:val="24"/>
-              </w:rPr>
-              <w:t xml:space="preserve">Гродно — д. Гудевичи</w:t>
-            </w:r>
-          </w:p>
-        </w:tc>
-        <w:tc>
-          <w:tcPr>
-            <w:tcW w:type="dxa" w:w="1600"/>
-            <w:tcMar>
-              <w:top w:type="dxa" w:w="60"/>
-              <w:left w:type="dxa" w:w="100"/>
-              <w:bottom w:type="dxa" w:w="60"/>
-              <w:right w:type="dxa" w:w="100"/>
-            </w:tcMar>
-          </w:tcPr>
-          <w:p>
-            <w:pPr>
-              <w:spacing w:after="0"/>
-              <w:jc w:val="left"/>
-            </w:pPr>
-            <w:r>
-              <w:rPr>
-                <w:rFonts w:ascii="Times New Roman" w:cs="Times New Roman" w:eastAsia="Times New Roman" w:hAnsi="Times New Roman"/>
-                <w:b w:val="false"/>
-                <w:bCs w:val="false"/>
-                <w:sz w:val="24"/>
-                <w:szCs w:val="24"/>
-              </w:rPr>
-              <w:t xml:space="preserve">автомобиль, автобус</w:t>
-            </w:r>
-          </w:p>
-        </w:tc>
-        <w:tc>
-          <w:tcPr>
-            <w:tcW w:type="dxa" w:w="1300"/>
-            <w:tcMar>
-              <w:top w:type="dxa" w:w="60"/>
-              <w:left w:type="dxa" w:w="100"/>
-              <w:bottom w:type="dxa" w:w="60"/>
-              <w:right w:type="dxa" w:w="100"/>
-            </w:tcMar>
-          </w:tcPr>
-          <w:p>
-            <w:pPr>
-              <w:spacing w:after="0"/>
-              <w:jc w:val="left"/>
-            </w:pPr>
-            <w:r>
-              <w:rPr>
-                <w:rFonts w:ascii="Times New Roman" w:cs="Times New Roman" w:eastAsia="Times New Roman" w:hAnsi="Times New Roman"/>
-                <w:b w:val="false"/>
-                <w:bCs w:val="false"/>
-                <w:sz w:val="24"/>
-                <w:szCs w:val="24"/>
-              </w:rPr>
-              <w:t xml:space="preserve">52,8 км</w:t>
-            </w:r>
-          </w:p>
-        </w:tc>
-        <w:tc>
-          <w:tcPr>
-            <w:tcW w:type="dxa" w:w="3640"/>
-            <w:tcMar>
-              <w:top w:type="dxa" w:w="60"/>
-              <w:left w:type="dxa" w:w="100"/>
-              <w:bottom w:type="dxa" w:w="60"/>
-              <w:right w:type="dxa" w:w="100"/>
-            </w:tcMar>
-          </w:tcPr>
-          <w:p>
-            <w:pPr>
-              <w:spacing w:after="0"/>
-              <w:jc w:val="left"/>
-            </w:pPr>
-            <w:r>
-              <w:rPr>
-                <w:rFonts w:ascii="Times New Roman" w:cs="Times New Roman" w:eastAsia="Times New Roman" w:hAnsi="Times New Roman"/>
-                <w:b w:val="false"/>
-                <w:bCs w:val="false"/>
-                <w:sz w:val="24"/>
-                <w:szCs w:val="24"/>
-              </w:rPr>
-              <w:t xml:space="preserve">≈50 минут</w:t>
-            </w:r>
-          </w:p>
-        </w:tc>
-      </w:tr>
-      <w:tr>
-        <w:tc>
-          <w:tcPr>
-            <w:tcW w:type="dxa" w:w="600"/>
-            <w:tcMar>
-              <w:top w:type="dxa" w:w="60"/>
-              <w:left w:type="dxa" w:w="100"/>
-              <w:bottom w:type="dxa" w:w="60"/>
-              <w:right w:type="dxa" w:w="100"/>
-            </w:tcMar>
-          </w:tcPr>
-          <w:p>
-            <w:pPr>
-              <w:spacing w:after="0"/>
-              <w:jc w:val="left"/>
-            </w:pPr>
-            <w:r>
-              <w:rPr>
-                <w:rFonts w:ascii="Times New Roman" w:cs="Times New Roman" w:eastAsia="Times New Roman" w:hAnsi="Times New Roman"/>
-                <w:b w:val="false"/>
-                <w:bCs w:val="false"/>
-                <w:sz w:val="24"/>
-                <w:szCs w:val="24"/>
-              </w:rPr>
-              <w:t xml:space="preserve">2</w:t>
-            </w:r>
-          </w:p>
-        </w:tc>
-        <w:tc>
-          <w:tcPr>
-            <w:tcW w:type="dxa" w:w="2700"/>
-            <w:tcMar>
-              <w:top w:type="dxa" w:w="60"/>
-              <w:left w:type="dxa" w:w="100"/>
-              <w:bottom w:type="dxa" w:w="60"/>
-              <w:right w:type="dxa" w:w="100"/>
-            </w:tcMar>
-          </w:tcPr>
-          <w:p>
-            <w:pPr>
-              <w:spacing w:after="0"/>
-              <w:jc w:val="left"/>
-            </w:pPr>
-            <w:r>
-              <w:rPr>
-                <w:rFonts w:ascii="Times New Roman" w:cs="Times New Roman" w:eastAsia="Times New Roman" w:hAnsi="Times New Roman"/>
-                <w:b w:val="false"/>
-                <w:bCs w:val="false"/>
-                <w:sz w:val="24"/>
-                <w:szCs w:val="24"/>
-              </w:rPr>
-              <w:t xml:space="preserve">д. Гудевичи — д. Лунно</w:t>
-            </w:r>
-          </w:p>
-        </w:tc>
-        <w:tc>
-          <w:tcPr>
-            <w:tcW w:type="dxa" w:w="1600"/>
-            <w:tcMar>
-              <w:top w:type="dxa" w:w="60"/>
-              <w:left w:type="dxa" w:w="100"/>
-              <w:bottom w:type="dxa" w:w="60"/>
-              <w:right w:type="dxa" w:w="100"/>
-            </w:tcMar>
-          </w:tcPr>
-          <w:p>
-            <w:pPr>
-              <w:spacing w:after="0"/>
-              <w:jc w:val="left"/>
-            </w:pPr>
-            <w:r>
-              <w:rPr>
-                <w:rFonts w:ascii="Times New Roman" w:cs="Times New Roman" w:eastAsia="Times New Roman" w:hAnsi="Times New Roman"/>
-                <w:b w:val="false"/>
-                <w:bCs w:val="false"/>
-                <w:sz w:val="24"/>
-                <w:szCs w:val="24"/>
-              </w:rPr>
-              <w:t xml:space="preserve">пешком, автомобиль</w:t>
-            </w:r>
-          </w:p>
-        </w:tc>
-        <w:tc>
-          <w:tcPr>
-            <w:tcW w:type="dxa" w:w="1300"/>
-            <w:tcMar>
-              <w:top w:type="dxa" w:w="60"/>
-              <w:left w:type="dxa" w:w="100"/>
-              <w:bottom w:type="dxa" w:w="60"/>
-              <w:right w:type="dxa" w:w="100"/>
-            </w:tcMar>
-          </w:tcPr>
-          <w:p>
-            <w:pPr>
-              <w:spacing w:after="0"/>
-              <w:jc w:val="left"/>
-            </w:pPr>
-            <w:r>
-              <w:rPr>
-                <w:rFonts w:ascii="Times New Roman" w:cs="Times New Roman" w:eastAsia="Times New Roman" w:hAnsi="Times New Roman"/>
-                <w:b w:val="false"/>
-                <w:bCs w:val="false"/>
-                <w:sz w:val="24"/>
-                <w:szCs w:val="24"/>
-              </w:rPr>
-              <w:t xml:space="preserve">12,7 км</w:t>
-            </w:r>
-          </w:p>
-        </w:tc>
-        <w:tc>
-          <w:tcPr>
-            <w:tcW w:type="dxa" w:w="3640"/>
-            <w:tcMar>
-              <w:top w:type="dxa" w:w="60"/>
-              <w:left w:type="dxa" w:w="100"/>
-              <w:bottom w:type="dxa" w:w="60"/>
-              <w:right w:type="dxa" w:w="100"/>
-            </w:tcMar>
-          </w:tcPr>
-          <w:p>
-            <w:pPr>
-              <w:spacing w:after="0"/>
-              <w:jc w:val="left"/>
-            </w:pPr>
-            <w:r>
-              <w:rPr>
-                <w:rFonts w:ascii="Times New Roman" w:cs="Times New Roman" w:eastAsia="Times New Roman" w:hAnsi="Times New Roman"/>
-                <w:b w:val="false"/>
-                <w:bCs w:val="false"/>
-                <w:sz w:val="24"/>
-                <w:szCs w:val="24"/>
-              </w:rPr>
-              <w:t xml:space="preserve">≈12 минут на машине / ≈2 ч 50 мин пешком</w:t>
-            </w:r>
-          </w:p>
-        </w:tc>
-      </w:tr>
-      <w:tr>
-        <w:tc>
-          <w:tcPr>
-            <w:tcW w:type="dxa" w:w="600"/>
-            <w:tcMar>
-              <w:top w:type="dxa" w:w="60"/>
-              <w:left w:type="dxa" w:w="100"/>
-              <w:bottom w:type="dxa" w:w="60"/>
-              <w:right w:type="dxa" w:w="100"/>
-            </w:tcMar>
-          </w:tcPr>
-          <w:p>
-            <w:pPr>
-              <w:spacing w:after="0"/>
-              <w:jc w:val="left"/>
-            </w:pPr>
-            <w:r>
-              <w:rPr>
-                <w:rFonts w:ascii="Times New Roman" w:cs="Times New Roman" w:eastAsia="Times New Roman" w:hAnsi="Times New Roman"/>
-                <w:b w:val="false"/>
-                <w:bCs w:val="false"/>
-                <w:sz w:val="24"/>
-                <w:szCs w:val="24"/>
-              </w:rPr>
-              <w:t xml:space="preserve">3</w:t>
-            </w:r>
-          </w:p>
-        </w:tc>
-        <w:tc>
-          <w:tcPr>
-            <w:tcW w:type="dxa" w:w="2700"/>
-            <w:tcMar>
-              <w:top w:type="dxa" w:w="60"/>
-              <w:left w:type="dxa" w:w="100"/>
-              <w:bottom w:type="dxa" w:w="60"/>
-              <w:right w:type="dxa" w:w="100"/>
-            </w:tcMar>
-          </w:tcPr>
-          <w:p>
-            <w:pPr>
-              <w:spacing w:after="0"/>
-              <w:jc w:val="left"/>
-            </w:pPr>
-            <w:r>
-              <w:rPr>
-                <w:rFonts w:ascii="Times New Roman" w:cs="Times New Roman" w:eastAsia="Times New Roman" w:hAnsi="Times New Roman"/>
-                <w:b w:val="false"/>
-                <w:bCs w:val="false"/>
-                <w:sz w:val="24"/>
-                <w:szCs w:val="24"/>
-              </w:rPr>
-              <w:t xml:space="preserve">д. Лунно — д. Дубно</w:t>
-            </w:r>
-          </w:p>
-        </w:tc>
-        <w:tc>
-          <w:tcPr>
-            <w:tcW w:type="dxa" w:w="1600"/>
-            <w:tcMar>
-              <w:top w:type="dxa" w:w="60"/>
-              <w:left w:type="dxa" w:w="100"/>
-              <w:bottom w:type="dxa" w:w="60"/>
-              <w:right w:type="dxa" w:w="100"/>
-            </w:tcMar>
-          </w:tcPr>
-          <w:p>
-            <w:pPr>
-              <w:spacing w:after="0"/>
-              <w:jc w:val="left"/>
-            </w:pPr>
-            <w:r>
-              <w:rPr>
-                <w:rFonts w:ascii="Times New Roman" w:cs="Times New Roman" w:eastAsia="Times New Roman" w:hAnsi="Times New Roman"/>
-                <w:b w:val="false"/>
-                <w:bCs w:val="false"/>
-                <w:sz w:val="24"/>
-                <w:szCs w:val="24"/>
-              </w:rPr>
-              <w:t xml:space="preserve">пешком, автомобиль</w:t>
-            </w:r>
-          </w:p>
-        </w:tc>
-        <w:tc>
-          <w:tcPr>
-            <w:tcW w:type="dxa" w:w="1300"/>
-            <w:tcMar>
-              <w:top w:type="dxa" w:w="60"/>
-              <w:left w:type="dxa" w:w="100"/>
-              <w:bottom w:type="dxa" w:w="60"/>
-              <w:right w:type="dxa" w:w="100"/>
-            </w:tcMar>
-          </w:tcPr>
-          <w:p>
-            <w:pPr>
-              <w:spacing w:after="0"/>
-              <w:jc w:val="left"/>
-            </w:pPr>
-            <w:r>
-              <w:rPr>
-                <w:rFonts w:ascii="Times New Roman" w:cs="Times New Roman" w:eastAsia="Times New Roman" w:hAnsi="Times New Roman"/>
-                <w:b w:val="false"/>
-                <w:bCs w:val="false"/>
-                <w:sz w:val="24"/>
-                <w:szCs w:val="24"/>
-              </w:rPr>
-              <w:t xml:space="preserve">16,3 км</w:t>
-            </w:r>
-          </w:p>
-        </w:tc>
-        <w:tc>
-          <w:tcPr>
-            <w:tcW w:type="dxa" w:w="3640"/>
-            <w:tcMar>
-              <w:top w:type="dxa" w:w="60"/>
-              <w:left w:type="dxa" w:w="100"/>
-              <w:bottom w:type="dxa" w:w="60"/>
-              <w:right w:type="dxa" w:w="100"/>
-            </w:tcMar>
-          </w:tcPr>
-          <w:p>
-            <w:pPr>
-              <w:spacing w:after="0"/>
-              <w:jc w:val="left"/>
-            </w:pPr>
-            <w:r>
-              <w:rPr>
-                <w:rFonts w:ascii="Times New Roman" w:cs="Times New Roman" w:eastAsia="Times New Roman" w:hAnsi="Times New Roman"/>
-                <w:b w:val="false"/>
-                <w:bCs w:val="false"/>
-                <w:sz w:val="24"/>
-                <w:szCs w:val="24"/>
-              </w:rPr>
-              <w:t xml:space="preserve">≈16 минут на машине / ≈3 ч 40 мин пешком</w:t>
-            </w:r>
-          </w:p>
-        </w:tc>
-      </w:tr>
-      <w:tr>
-        <w:tc>
-          <w:tcPr>
-            <w:tcW w:type="dxa" w:w="600"/>
-            <w:tcMar>
-              <w:top w:type="dxa" w:w="60"/>
-              <w:left w:type="dxa" w:w="100"/>
-              <w:bottom w:type="dxa" w:w="60"/>
-              <w:right w:type="dxa" w:w="100"/>
-            </w:tcMar>
-          </w:tcPr>
-          <w:p>
-            <w:pPr>
-              <w:spacing w:after="0"/>
-              <w:jc w:val="left"/>
-            </w:pPr>
-            <w:r>
-              <w:rPr>
-                <w:rFonts w:ascii="Times New Roman" w:cs="Times New Roman" w:eastAsia="Times New Roman" w:hAnsi="Times New Roman"/>
-                <w:b w:val="false"/>
-                <w:bCs w:val="false"/>
-                <w:sz w:val="24"/>
-                <w:szCs w:val="24"/>
-              </w:rPr>
-              <w:t xml:space="preserve">4</w:t>
-            </w:r>
-          </w:p>
-        </w:tc>
-        <w:tc>
-          <w:tcPr>
-            <w:tcW w:type="dxa" w:w="2700"/>
-            <w:tcMar>
-              <w:top w:type="dxa" w:w="60"/>
-              <w:left w:type="dxa" w:w="100"/>
-              <w:bottom w:type="dxa" w:w="60"/>
-              <w:right w:type="dxa" w:w="100"/>
-            </w:tcMar>
-          </w:tcPr>
-          <w:p>
-            <w:pPr>
-              <w:spacing w:after="0"/>
-              <w:jc w:val="left"/>
-            </w:pPr>
-            <w:r>
-              <w:rPr>
-                <w:rFonts w:ascii="Times New Roman" w:cs="Times New Roman" w:eastAsia="Times New Roman" w:hAnsi="Times New Roman"/>
-                <w:b w:val="false"/>
-                <w:bCs w:val="false"/>
-                <w:sz w:val="24"/>
-                <w:szCs w:val="24"/>
-              </w:rPr>
-              <w:t xml:space="preserve">д. Дубно — г. Мосты</w:t>
-            </w:r>
-          </w:p>
-        </w:tc>
-        <w:tc>
-          <w:tcPr>
-            <w:tcW w:type="dxa" w:w="1600"/>
-            <w:tcMar>
-              <w:top w:type="dxa" w:w="60"/>
-              <w:left w:type="dxa" w:w="100"/>
-              <w:bottom w:type="dxa" w:w="60"/>
-              <w:right w:type="dxa" w:w="100"/>
-            </w:tcMar>
-          </w:tcPr>
-          <w:p>
-            <w:pPr>
-              <w:spacing w:after="0"/>
-              <w:jc w:val="left"/>
-            </w:pPr>
-            <w:r>
-              <w:rPr>
-                <w:rFonts w:ascii="Times New Roman" w:cs="Times New Roman" w:eastAsia="Times New Roman" w:hAnsi="Times New Roman"/>
-                <w:b w:val="false"/>
-                <w:bCs w:val="false"/>
-                <w:sz w:val="24"/>
-                <w:szCs w:val="24"/>
-              </w:rPr>
-              <w:t xml:space="preserve">автомобиль, автобус</w:t>
-            </w:r>
-          </w:p>
-        </w:tc>
-        <w:tc>
-          <w:tcPr>
-            <w:tcW w:type="dxa" w:w="1300"/>
-            <w:tcMar>
-              <w:top w:type="dxa" w:w="60"/>
-              <w:left w:type="dxa" w:w="100"/>
-              <w:bottom w:type="dxa" w:w="60"/>
-              <w:right w:type="dxa" w:w="100"/>
-            </w:tcMar>
-          </w:tcPr>
-          <w:p>
-            <w:pPr>
-              <w:spacing w:after="0"/>
-              <w:jc w:val="left"/>
-            </w:pPr>
-            <w:r>
-              <w:rPr>
-                <w:rFonts w:ascii="Times New Roman" w:cs="Times New Roman" w:eastAsia="Times New Roman" w:hAnsi="Times New Roman"/>
-                <w:b w:val="false"/>
-                <w:bCs w:val="false"/>
-                <w:sz w:val="24"/>
-                <w:szCs w:val="24"/>
-              </w:rPr>
-              <w:t xml:space="preserve">14,6 км</w:t>
-            </w:r>
-          </w:p>
-        </w:tc>
-        <w:tc>
-          <w:tcPr>
-            <w:tcW w:type="dxa" w:w="3640"/>
-            <w:tcMar>
-              <w:top w:type="dxa" w:w="60"/>
-              <w:left w:type="dxa" w:w="100"/>
-              <w:bottom w:type="dxa" w:w="60"/>
-              <w:right w:type="dxa" w:w="100"/>
-            </w:tcMar>
-          </w:tcPr>
-          <w:p>
-            <w:pPr>
-              <w:spacing w:after="0"/>
-              <w:jc w:val="left"/>
-            </w:pPr>
-            <w:r>
-              <w:rPr>
-                <w:rFonts w:ascii="Times New Roman" w:cs="Times New Roman" w:eastAsia="Times New Roman" w:hAnsi="Times New Roman"/>
-                <w:b w:val="false"/>
-                <w:bCs w:val="false"/>
-                <w:sz w:val="24"/>
-                <w:szCs w:val="24"/>
-              </w:rPr>
-              <w:t xml:space="preserve">≈15 минут</w:t>
-            </w:r>
-          </w:p>
-        </w:tc>
-      </w:tr>
-      <w:tr>
-        <w:tc>
-          <w:tcPr>
-            <w:tcW w:type="dxa" w:w="600"/>
-            <w:tcMar>
-              <w:top w:type="dxa" w:w="60"/>
-              <w:left w:type="dxa" w:w="100"/>
-              <w:bottom w:type="dxa" w:w="60"/>
-              <w:right w:type="dxa" w:w="100"/>
-            </w:tcMar>
-          </w:tcPr>
-          <w:p>
-            <w:pPr>
-              <w:spacing w:after="0"/>
-              <w:jc w:val="left"/>
-            </w:pPr>
-            <w:r>
-              <w:rPr>
-                <w:rFonts w:ascii="Times New Roman" w:cs="Times New Roman" w:eastAsia="Times New Roman" w:hAnsi="Times New Roman"/>
-                <w:b w:val="false"/>
-                <w:bCs w:val="false"/>
-                <w:sz w:val="24"/>
-                <w:szCs w:val="24"/>
-              </w:rPr>
-              <w:t xml:space="preserve">5</w:t>
-            </w:r>
-          </w:p>
-        </w:tc>
-        <w:tc>
-          <w:tcPr>
-            <w:tcW w:type="dxa" w:w="2700"/>
-            <w:tcMar>
-              <w:top w:type="dxa" w:w="60"/>
-              <w:left w:type="dxa" w:w="100"/>
-              <w:bottom w:type="dxa" w:w="60"/>
-              <w:right w:type="dxa" w:w="100"/>
-            </w:tcMar>
-          </w:tcPr>
-          <w:p>
-            <w:pPr>
-              <w:spacing w:after="0"/>
-              <w:jc w:val="left"/>
-            </w:pPr>
-            <w:r>
-              <w:rPr>
-                <w:rFonts w:ascii="Times New Roman" w:cs="Times New Roman" w:eastAsia="Times New Roman" w:hAnsi="Times New Roman"/>
-                <w:b w:val="false"/>
-                <w:bCs w:val="false"/>
-                <w:sz w:val="24"/>
-                <w:szCs w:val="24"/>
-              </w:rPr>
-              <w:t xml:space="preserve">г. Мосты — г. Гродно</w:t>
-            </w:r>
-          </w:p>
-        </w:tc>
-        <w:tc>
-          <w:tcPr>
-            <w:tcW w:type="dxa" w:w="1600"/>
-            <w:tcMar>
-              <w:top w:type="dxa" w:w="60"/>
-              <w:left w:type="dxa" w:w="100"/>
-              <w:bottom w:type="dxa" w:w="60"/>
-              <w:right w:type="dxa" w:w="100"/>
-            </w:tcMar>
-          </w:tcPr>
-          <w:p>
-            <w:pPr>
-              <w:spacing w:after="0"/>
-              <w:jc w:val="left"/>
-            </w:pPr>
-            <w:r>
-              <w:rPr>
-                <w:rFonts w:ascii="Times New Roman" w:cs="Times New Roman" w:eastAsia="Times New Roman" w:hAnsi="Times New Roman"/>
-                <w:b w:val="false"/>
-                <w:bCs w:val="false"/>
-                <w:sz w:val="24"/>
-                <w:szCs w:val="24"/>
-              </w:rPr>
-              <w:t xml:space="preserve">автомобиль, автобус</w:t>
-            </w:r>
-          </w:p>
-        </w:tc>
-        <w:tc>
-          <w:tcPr>
-            <w:tcW w:type="dxa" w:w="1300"/>
-            <w:tcMar>
-              <w:top w:type="dxa" w:w="60"/>
-              <w:left w:type="dxa" w:w="100"/>
-              <w:bottom w:type="dxa" w:w="60"/>
-              <w:right w:type="dxa" w:w="100"/>
-            </w:tcMar>
-          </w:tcPr>
-          <w:p>
-            <w:pPr>
-              <w:spacing w:after="0"/>
-              <w:jc w:val="left"/>
-            </w:pPr>
-            <w:r>
-              <w:rPr>
-                <w:rFonts w:ascii="Times New Roman" w:cs="Times New Roman" w:eastAsia="Times New Roman" w:hAnsi="Times New Roman"/>
-                <w:b w:val="false"/>
-                <w:bCs w:val="false"/>
-                <w:sz w:val="24"/>
-                <w:szCs w:val="24"/>
-              </w:rPr>
-              <w:t xml:space="preserve">63,8 км</w:t>
-            </w:r>
-          </w:p>
-        </w:tc>
-        <w:tc>
-          <w:tcPr>
-            <w:tcW w:type="dxa" w:w="3640"/>
-            <w:tcMar>
-              <w:top w:type="dxa" w:w="60"/>
-              <w:left w:type="dxa" w:w="100"/>
-              <w:bottom w:type="dxa" w:w="60"/>
-              <w:right w:type="dxa" w:w="100"/>
-            </w:tcMar>
-          </w:tcPr>
-          <w:p>
-            <w:pPr>
-              <w:spacing w:after="0"/>
-              <w:jc w:val="left"/>
-            </w:pPr>
-            <w:r>
-              <w:rPr>
-                <w:rFonts w:ascii="Times New Roman" w:cs="Times New Roman" w:eastAsia="Times New Roman" w:hAnsi="Times New Roman"/>
-                <w:b w:val="false"/>
-                <w:bCs w:val="false"/>
-                <w:sz w:val="24"/>
-                <w:szCs w:val="24"/>
-              </w:rPr>
-              <w:t xml:space="preserve">≈58 минут</w:t>
-            </w:r>
-          </w:p>
-        </w:tc>
-      </w:tr>
-    </w:tbl>
-    <w:p>
-      <w:pPr>
-        <w:spacing w:before="100"/>
-        <w:jc w:val="both"/>
-      </w:pPr>
-      <w:r>
-        <w:rPr>
-          <w:rFonts w:ascii="Times New Roman" w:cs="Times New Roman" w:eastAsia="Times New Roman" w:hAnsi="Times New Roman"/>
-          <w:i/>
-          <w:iCs/>
-          <w:sz w:val="20"/>
-          <w:szCs w:val="20"/>
-        </w:rPr>
-        <w:t xml:space="preserve">Расстояния — маршруты OpenStreetMap; время в пути — оценка, пешее посчитано по 4,5 км/ч.</w:t>
-      </w:r>
-    </w:p>
-    <w:p>
-      <w:pPr>
         <w:pStyle w:val="Heading1"/>
         <w:pageBreakBefore/>
         <w:spacing w:after="120" w:before="120"/>
@@ -1233,7 +365,7 @@
           <w:sz w:val="24"/>
           <w:szCs w:val="24"/>
         </w:rPr>
-        <w:t xml:space="preserve">Схема маршрута на реальной географии: границы района, Нёман и дороги — данные OpenStreetMap; красная пунктирная нить — путь маршрута по автодорогам от Гродно через Гудевичи и Лунно к Дубно и Мостам. Номер у иконки — шаг маршрута.</w:t>
+        <w:t xml:space="preserve">Схема маршрута на реальной географии: границы района, Нёман и дороги — данные OpenStreetMap.</w:t>
       </w:r>
     </w:p>
     <w:p>
@@ -1295,7 +427,23 @@
           <w:sz w:val="20"/>
           <w:szCs w:val="20"/>
         </w:rPr>
-        <w:t xml:space="preserve">Условные знаки: иконка церкви с номером шага — остановка маршрута; красный пунктир — нитка маршрута по дорогам; жёлтые линии — автодороги Р41 и Р44; штриховая чёрная — железная дорога; синяя линия — река Нёман. Геометрия района, реки и дорог, автопуть маршрута — © OpenStreetMap contributors (ODbL 1.0), маршрут — OSRM.</w:t>
+        <w:t xml:space="preserve">Условные знаки: иконка церкви с номером шага — остановка маршрута; красный пунктир — нитка маршрута по дорогам; жёлтые линии — автодороги; штриховая чёрная — железная дорога; синяя линия — река Неман. Геометрия района, реки и дорог, автопуть маршрута — © OpenStreetMap contributors (ODbL 1.0), маршрут — OSRM.</w:t>
+      </w:r>
+    </w:p>
+    <w:p>
+      <w:pPr>
+        <w:spacing w:after="120" w:line="276"/>
+        <w:jc w:val="both"/>
+      </w:pPr>
+      <w:r>
+        <w:rPr>
+          <w:rFonts w:ascii="Times New Roman" w:cs="Times New Roman" w:eastAsia="Times New Roman" w:hAnsi="Times New Roman"/>
+          <w:i/>
+          <w:iCs/>
+          <w:sz w:val="20"/>
+          <w:szCs w:val="20"/>
+        </w:rPr>
+        <w:t xml:space="preserve">Граница района, Нёман и дороги — реальные данные OpenStreetMap. Точные координаты каждого храма открываются кнопками «Открыть на Яндекс.Картах» на странице храма.</w:t>
       </w:r>
     </w:p>
     <w:p>
@@ -1447,7 +595,7 @@
           <w:sz w:val="28"/>
           <w:szCs w:val="28"/>
         </w:rPr>
-        <w:t xml:space="preserve">Почему этот маршрут привлекателен</w:t>
+        <w:t xml:space="preserve">Привлекательность маршрута</w:t>
       </w:r>
     </w:p>
     <w:p>
@@ -1475,7 +623,7 @@
           <w:sz w:val="24"/>
           <w:szCs w:val="24"/>
         </w:rPr>
-        <w:t xml:space="preserve">Все три храма — действующие приходы, поэтому поездку можно совместить с богослужением: расписания и телефоны настоятелей собраны в разделе «Справочная информация». Дорога проходит через Мосты — районный центр, где есть кафе и магазины, а в самих деревнях пунктов питания нет.</w:t>
+        <w:t xml:space="preserve">Все три храма — действующие приходы, поэтому поездку можно совместить с богослужением: расписания и адреса приходов собраны в разделе «Справочная информация». Дорога проходит через Мосты — районный центр, где есть кафе и магазины.</w:t>
       </w:r>
     </w:p>
     <w:p>
@@ -1537,7 +685,7 @@
           <w:sz w:val="24"/>
           <w:szCs w:val="24"/>
         </w:rPr>
-        <w:t xml:space="preserve">Живая деревенская церковь с шатровой колокольней 1909 года: службы здесь не прекращались даже в военные годы, а настоятель ведёт занятия с тремя группами школьников — всего 94 человека.</w:t>
+        <w:t xml:space="preserve">Живая деревенская церковь с шатровой колокольней 1909 года: службы здесь не прекращались даже в военные годы.</w:t>
       </w:r>
     </w:p>
     <w:p>
@@ -1668,24 +816,6 @@
           <w:szCs w:val="24"/>
         </w:rPr>
         <w:t xml:space="preserve">Адрес: ул. Центральная, 6а</w:t>
-      </w:r>
-    </w:p>
-    <w:p>
-      <w:pPr>
-        <w:pStyle w:val="ListParagraph"/>
-        <w:numPr>
-          <w:ilvl w:val="0"/>
-          <w:numId w:val="2"/>
-        </w:numPr>
-        <w:spacing w:after="60" w:line="276"/>
-      </w:pPr>
-      <w:r>
-        <w:rPr>
-          <w:rFonts w:ascii="Times New Roman" w:cs="Times New Roman" w:eastAsia="Times New Roman" w:hAnsi="Times New Roman"/>
-          <w:sz w:val="24"/>
-          <w:szCs w:val="24"/>
-        </w:rPr>
-        <w:t xml:space="preserve">Настоятель ведёт занятия с тремя группами учеников школы (94 человека)</w:t>
       </w:r>
     </w:p>
     <w:p>
@@ -2109,21 +1239,21 @@
           <w:sz w:val="36"/>
           <w:szCs w:val="36"/>
         </w:rPr>
-        <w:t xml:space="preserve">4. Логистика</w:t>
-      </w:r>
-    </w:p>
-    <w:p>
-      <w:pPr>
-        <w:spacing w:after="120" w:line="276"/>
-        <w:jc w:val="both"/>
-      </w:pPr>
-      <w:r>
-        <w:rPr>
-          <w:rFonts w:ascii="Times New Roman" w:cs="Times New Roman" w:eastAsia="Times New Roman" w:hAnsi="Times New Roman"/>
-          <w:sz w:val="24"/>
-          <w:szCs w:val="24"/>
-        </w:rPr>
-        <w:t xml:space="preserve">Способы передвижения и расстояния до каждой остановки — от Гродно (областной центр) и от Мостов (районный центр). Расстояния — по дорожным маршрутам OpenStreetMap от центров городов; время на автомобиле — оценка без учёта остановок и погоды.</w:t>
+        <w:t xml:space="preserve">4. Логистика маршрута</w:t>
+      </w:r>
+    </w:p>
+    <w:p>
+      <w:pPr>
+        <w:spacing w:after="120" w:line="276"/>
+        <w:jc w:val="both"/>
+      </w:pPr>
+      <w:r>
+        <w:rPr>
+          <w:rFonts w:ascii="Times New Roman" w:cs="Times New Roman" w:eastAsia="Times New Roman" w:hAnsi="Times New Roman"/>
+          <w:sz w:val="24"/>
+          <w:szCs w:val="24"/>
+        </w:rPr>
+        <w:t xml:space="preserve">Способы передвижения и расстояния до каждой остановки — от Гродно (областной центр) и от Мостов (районный центр).</w:t>
       </w:r>
     </w:p>
     <w:p>
@@ -2139,7 +1269,7 @@
           <w:sz w:val="24"/>
           <w:szCs w:val="24"/>
         </w:rPr>
-        <w:t xml:space="preserve">Сколько ехать до каждого храма</w:t>
+        <w:t xml:space="preserve">Время</w:t>
       </w:r>
     </w:p>
     <w:tbl>
@@ -2215,7 +1345,7 @@
                 <w:sz w:val="24"/>
                 <w:szCs w:val="24"/>
               </w:rPr>
-              <w:t xml:space="preserve">От Гродно (центр)</w:t>
+              <w:t xml:space="preserve">Гродно</w:t>
             </w:r>
           </w:p>
         </w:tc>
@@ -2243,7 +1373,7 @@
                 <w:sz w:val="24"/>
                 <w:szCs w:val="24"/>
               </w:rPr>
-              <w:t xml:space="preserve">От Мостов (центр)</w:t>
+              <w:t xml:space="preserve">Мосты</w:t>
             </w:r>
           </w:p>
         </w:tc>
@@ -2500,951 +1630,7 @@
     </w:tbl>
     <w:p>
       <w:pPr>
-        <w:pStyle w:val="Heading3"/>
-        <w:spacing w:after="100" w:before="180"/>
-      </w:pPr>
-      <w:r>
-        <w:rPr>
-          <w:rFonts w:ascii="Times New Roman" w:cs="Times New Roman" w:eastAsia="Times New Roman" w:hAnsi="Times New Roman"/>
-          <w:b/>
-          <w:bCs/>
-          <w:sz w:val="24"/>
-          <w:szCs w:val="24"/>
-        </w:rPr>
-        <w:t xml:space="preserve">Перегоны между остановками</w:t>
-      </w:r>
-    </w:p>
-    <w:tbl>
-      <w:tblPr>
-        <w:tblW w:type="dxa" w:w="9840"/>
-        <w:tblBorders>
-          <w:top w:val="single" w:color="auto" w:sz="4"/>
-          <w:left w:val="single" w:color="auto" w:sz="4"/>
-          <w:bottom w:val="single" w:color="auto" w:sz="4"/>
-          <w:right w:val="single" w:color="auto" w:sz="4"/>
-          <w:insideH w:val="single" w:color="auto" w:sz="4"/>
-          <w:insideV w:val="single" w:color="auto" w:sz="4"/>
-        </w:tblBorders>
-      </w:tblPr>
-      <w:tblGrid>
-        <w:gridCol w:w="600"/>
-        <w:gridCol w:w="2700"/>
-        <w:gridCol w:w="1600"/>
-        <w:gridCol w:w="1300"/>
-        <w:gridCol w:w="3640"/>
-      </w:tblGrid>
-      <w:tr>
-        <w:trPr>
-          <w:tblHeader/>
-        </w:trPr>
-        <w:tc>
-          <w:tcPr>
-            <w:tcW w:type="dxa" w:w="600"/>
-            <w:shd w:fill="EDE7DA" w:val="clear"/>
-            <w:tcMar>
-              <w:top w:type="dxa" w:w="60"/>
-              <w:left w:type="dxa" w:w="100"/>
-              <w:bottom w:type="dxa" w:w="60"/>
-              <w:right w:type="dxa" w:w="100"/>
-            </w:tcMar>
-          </w:tcPr>
-          <w:p>
-            <w:pPr>
-              <w:spacing w:after="0"/>
-              <w:jc w:val="left"/>
-            </w:pPr>
-            <w:r>
-              <w:rPr>
-                <w:rFonts w:ascii="Times New Roman" w:cs="Times New Roman" w:eastAsia="Times New Roman" w:hAnsi="Times New Roman"/>
-                <w:b/>
-                <w:bCs/>
-                <w:sz w:val="24"/>
-                <w:szCs w:val="24"/>
-              </w:rPr>
-              <w:t xml:space="preserve">№</w:t>
-            </w:r>
-          </w:p>
-        </w:tc>
-        <w:tc>
-          <w:tcPr>
-            <w:tcW w:type="dxa" w:w="2700"/>
-            <w:shd w:fill="EDE7DA" w:val="clear"/>
-            <w:tcMar>
-              <w:top w:type="dxa" w:w="60"/>
-              <w:left w:type="dxa" w:w="100"/>
-              <w:bottom w:type="dxa" w:w="60"/>
-              <w:right w:type="dxa" w:w="100"/>
-            </w:tcMar>
-          </w:tcPr>
-          <w:p>
-            <w:pPr>
-              <w:spacing w:after="0"/>
-              <w:jc w:val="left"/>
-            </w:pPr>
-            <w:r>
-              <w:rPr>
-                <w:rFonts w:ascii="Times New Roman" w:cs="Times New Roman" w:eastAsia="Times New Roman" w:hAnsi="Times New Roman"/>
-                <w:b/>
-                <w:bCs/>
-                <w:sz w:val="24"/>
-                <w:szCs w:val="24"/>
-              </w:rPr>
-              <w:t xml:space="preserve">Участок</w:t>
-            </w:r>
-          </w:p>
-        </w:tc>
-        <w:tc>
-          <w:tcPr>
-            <w:tcW w:type="dxa" w:w="1600"/>
-            <w:shd w:fill="EDE7DA" w:val="clear"/>
-            <w:tcMar>
-              <w:top w:type="dxa" w:w="60"/>
-              <w:left w:type="dxa" w:w="100"/>
-              <w:bottom w:type="dxa" w:w="60"/>
-              <w:right w:type="dxa" w:w="100"/>
-            </w:tcMar>
-          </w:tcPr>
-          <w:p>
-            <w:pPr>
-              <w:spacing w:after="0"/>
-              <w:jc w:val="left"/>
-            </w:pPr>
-            <w:r>
-              <w:rPr>
-                <w:rFonts w:ascii="Times New Roman" w:cs="Times New Roman" w:eastAsia="Times New Roman" w:hAnsi="Times New Roman"/>
-                <w:b/>
-                <w:bCs/>
-                <w:sz w:val="24"/>
-                <w:szCs w:val="24"/>
-              </w:rPr>
-              <w:t xml:space="preserve">Способ</w:t>
-            </w:r>
-          </w:p>
-        </w:tc>
-        <w:tc>
-          <w:tcPr>
-            <w:tcW w:type="dxa" w:w="1300"/>
-            <w:shd w:fill="EDE7DA" w:val="clear"/>
-            <w:tcMar>
-              <w:top w:type="dxa" w:w="60"/>
-              <w:left w:type="dxa" w:w="100"/>
-              <w:bottom w:type="dxa" w:w="60"/>
-              <w:right w:type="dxa" w:w="100"/>
-            </w:tcMar>
-          </w:tcPr>
-          <w:p>
-            <w:pPr>
-              <w:spacing w:after="0"/>
-              <w:jc w:val="left"/>
-            </w:pPr>
-            <w:r>
-              <w:rPr>
-                <w:rFonts w:ascii="Times New Roman" w:cs="Times New Roman" w:eastAsia="Times New Roman" w:hAnsi="Times New Roman"/>
-                <w:b/>
-                <w:bCs/>
-                <w:sz w:val="24"/>
-                <w:szCs w:val="24"/>
-              </w:rPr>
-              <w:t xml:space="preserve">Расстояние</w:t>
-            </w:r>
-          </w:p>
-        </w:tc>
-        <w:tc>
-          <w:tcPr>
-            <w:tcW w:type="dxa" w:w="3640"/>
-            <w:shd w:fill="EDE7DA" w:val="clear"/>
-            <w:tcMar>
-              <w:top w:type="dxa" w:w="60"/>
-              <w:left w:type="dxa" w:w="100"/>
-              <w:bottom w:type="dxa" w:w="60"/>
-              <w:right w:type="dxa" w:w="100"/>
-            </w:tcMar>
-          </w:tcPr>
-          <w:p>
-            <w:pPr>
-              <w:spacing w:after="0"/>
-              <w:jc w:val="left"/>
-            </w:pPr>
-            <w:r>
-              <w:rPr>
-                <w:rFonts w:ascii="Times New Roman" w:cs="Times New Roman" w:eastAsia="Times New Roman" w:hAnsi="Times New Roman"/>
-                <w:b/>
-                <w:bCs/>
-                <w:sz w:val="24"/>
-                <w:szCs w:val="24"/>
-              </w:rPr>
-              <w:t xml:space="preserve">Время</w:t>
-            </w:r>
-          </w:p>
-        </w:tc>
-      </w:tr>
-      <w:tr>
-        <w:tc>
-          <w:tcPr>
-            <w:tcW w:type="dxa" w:w="600"/>
-            <w:tcMar>
-              <w:top w:type="dxa" w:w="60"/>
-              <w:left w:type="dxa" w:w="100"/>
-              <w:bottom w:type="dxa" w:w="60"/>
-              <w:right w:type="dxa" w:w="100"/>
-            </w:tcMar>
-          </w:tcPr>
-          <w:p>
-            <w:pPr>
-              <w:spacing w:after="0"/>
-              <w:jc w:val="left"/>
-            </w:pPr>
-            <w:r>
-              <w:rPr>
-                <w:rFonts w:ascii="Times New Roman" w:cs="Times New Roman" w:eastAsia="Times New Roman" w:hAnsi="Times New Roman"/>
-                <w:b w:val="false"/>
-                <w:bCs w:val="false"/>
-                <w:sz w:val="24"/>
-                <w:szCs w:val="24"/>
-              </w:rPr>
-              <w:t xml:space="preserve">1</w:t>
-            </w:r>
-          </w:p>
-        </w:tc>
-        <w:tc>
-          <w:tcPr>
-            <w:tcW w:type="dxa" w:w="2700"/>
-            <w:tcMar>
-              <w:top w:type="dxa" w:w="60"/>
-              <w:left w:type="dxa" w:w="100"/>
-              <w:bottom w:type="dxa" w:w="60"/>
-              <w:right w:type="dxa" w:w="100"/>
-            </w:tcMar>
-          </w:tcPr>
-          <w:p>
-            <w:pPr>
-              <w:spacing w:after="0"/>
-              <w:jc w:val="left"/>
-            </w:pPr>
-            <w:r>
-              <w:rPr>
-                <w:rFonts w:ascii="Times New Roman" w:cs="Times New Roman" w:eastAsia="Times New Roman" w:hAnsi="Times New Roman"/>
-                <w:b w:val="false"/>
-                <w:bCs w:val="false"/>
-                <w:sz w:val="24"/>
-                <w:szCs w:val="24"/>
-              </w:rPr>
-              <w:t xml:space="preserve">Гродно — д. Гудевичи</w:t>
-            </w:r>
-          </w:p>
-        </w:tc>
-        <w:tc>
-          <w:tcPr>
-            <w:tcW w:type="dxa" w:w="1600"/>
-            <w:tcMar>
-              <w:top w:type="dxa" w:w="60"/>
-              <w:left w:type="dxa" w:w="100"/>
-              <w:bottom w:type="dxa" w:w="60"/>
-              <w:right w:type="dxa" w:w="100"/>
-            </w:tcMar>
-          </w:tcPr>
-          <w:p>
-            <w:pPr>
-              <w:spacing w:after="0"/>
-              <w:jc w:val="left"/>
-            </w:pPr>
-            <w:r>
-              <w:rPr>
-                <w:rFonts w:ascii="Times New Roman" w:cs="Times New Roman" w:eastAsia="Times New Roman" w:hAnsi="Times New Roman"/>
-                <w:b w:val="false"/>
-                <w:bCs w:val="false"/>
-                <w:sz w:val="24"/>
-                <w:szCs w:val="24"/>
-              </w:rPr>
-              <w:t xml:space="preserve">автомобиль, автобус</w:t>
-            </w:r>
-          </w:p>
-        </w:tc>
-        <w:tc>
-          <w:tcPr>
-            <w:tcW w:type="dxa" w:w="1300"/>
-            <w:tcMar>
-              <w:top w:type="dxa" w:w="60"/>
-              <w:left w:type="dxa" w:w="100"/>
-              <w:bottom w:type="dxa" w:w="60"/>
-              <w:right w:type="dxa" w:w="100"/>
-            </w:tcMar>
-          </w:tcPr>
-          <w:p>
-            <w:pPr>
-              <w:spacing w:after="0"/>
-              <w:jc w:val="left"/>
-            </w:pPr>
-            <w:r>
-              <w:rPr>
-                <w:rFonts w:ascii="Times New Roman" w:cs="Times New Roman" w:eastAsia="Times New Roman" w:hAnsi="Times New Roman"/>
-                <w:b w:val="false"/>
-                <w:bCs w:val="false"/>
-                <w:sz w:val="24"/>
-                <w:szCs w:val="24"/>
-              </w:rPr>
-              <w:t xml:space="preserve">52,8 км</w:t>
-            </w:r>
-          </w:p>
-        </w:tc>
-        <w:tc>
-          <w:tcPr>
-            <w:tcW w:type="dxa" w:w="3640"/>
-            <w:tcMar>
-              <w:top w:type="dxa" w:w="60"/>
-              <w:left w:type="dxa" w:w="100"/>
-              <w:bottom w:type="dxa" w:w="60"/>
-              <w:right w:type="dxa" w:w="100"/>
-            </w:tcMar>
-          </w:tcPr>
-          <w:p>
-            <w:pPr>
-              <w:spacing w:after="0"/>
-              <w:jc w:val="left"/>
-            </w:pPr>
-            <w:r>
-              <w:rPr>
-                <w:rFonts w:ascii="Times New Roman" w:cs="Times New Roman" w:eastAsia="Times New Roman" w:hAnsi="Times New Roman"/>
-                <w:b w:val="false"/>
-                <w:bCs w:val="false"/>
-                <w:sz w:val="24"/>
-                <w:szCs w:val="24"/>
-              </w:rPr>
-              <w:t xml:space="preserve">≈50 минут</w:t>
-            </w:r>
-          </w:p>
-        </w:tc>
-      </w:tr>
-      <w:tr>
-        <w:tc>
-          <w:tcPr>
-            <w:tcW w:type="dxa" w:w="600"/>
-            <w:tcMar>
-              <w:top w:type="dxa" w:w="60"/>
-              <w:left w:type="dxa" w:w="100"/>
-              <w:bottom w:type="dxa" w:w="60"/>
-              <w:right w:type="dxa" w:w="100"/>
-            </w:tcMar>
-          </w:tcPr>
-          <w:p>
-            <w:pPr>
-              <w:spacing w:after="0"/>
-              <w:jc w:val="left"/>
-            </w:pPr>
-            <w:r>
-              <w:rPr>
-                <w:rFonts w:ascii="Times New Roman" w:cs="Times New Roman" w:eastAsia="Times New Roman" w:hAnsi="Times New Roman"/>
-                <w:b w:val="false"/>
-                <w:bCs w:val="false"/>
-                <w:sz w:val="24"/>
-                <w:szCs w:val="24"/>
-              </w:rPr>
-              <w:t xml:space="preserve">2</w:t>
-            </w:r>
-          </w:p>
-        </w:tc>
-        <w:tc>
-          <w:tcPr>
-            <w:tcW w:type="dxa" w:w="2700"/>
-            <w:tcMar>
-              <w:top w:type="dxa" w:w="60"/>
-              <w:left w:type="dxa" w:w="100"/>
-              <w:bottom w:type="dxa" w:w="60"/>
-              <w:right w:type="dxa" w:w="100"/>
-            </w:tcMar>
-          </w:tcPr>
-          <w:p>
-            <w:pPr>
-              <w:spacing w:after="0"/>
-              <w:jc w:val="left"/>
-            </w:pPr>
-            <w:r>
-              <w:rPr>
-                <w:rFonts w:ascii="Times New Roman" w:cs="Times New Roman" w:eastAsia="Times New Roman" w:hAnsi="Times New Roman"/>
-                <w:b w:val="false"/>
-                <w:bCs w:val="false"/>
-                <w:sz w:val="24"/>
-                <w:szCs w:val="24"/>
-              </w:rPr>
-              <w:t xml:space="preserve">д. Гудевичи — д. Лунно</w:t>
-            </w:r>
-          </w:p>
-        </w:tc>
-        <w:tc>
-          <w:tcPr>
-            <w:tcW w:type="dxa" w:w="1600"/>
-            <w:tcMar>
-              <w:top w:type="dxa" w:w="60"/>
-              <w:left w:type="dxa" w:w="100"/>
-              <w:bottom w:type="dxa" w:w="60"/>
-              <w:right w:type="dxa" w:w="100"/>
-            </w:tcMar>
-          </w:tcPr>
-          <w:p>
-            <w:pPr>
-              <w:spacing w:after="0"/>
-              <w:jc w:val="left"/>
-            </w:pPr>
-            <w:r>
-              <w:rPr>
-                <w:rFonts w:ascii="Times New Roman" w:cs="Times New Roman" w:eastAsia="Times New Roman" w:hAnsi="Times New Roman"/>
-                <w:b w:val="false"/>
-                <w:bCs w:val="false"/>
-                <w:sz w:val="24"/>
-                <w:szCs w:val="24"/>
-              </w:rPr>
-              <w:t xml:space="preserve">пешком, автомобиль</w:t>
-            </w:r>
-          </w:p>
-        </w:tc>
-        <w:tc>
-          <w:tcPr>
-            <w:tcW w:type="dxa" w:w="1300"/>
-            <w:tcMar>
-              <w:top w:type="dxa" w:w="60"/>
-              <w:left w:type="dxa" w:w="100"/>
-              <w:bottom w:type="dxa" w:w="60"/>
-              <w:right w:type="dxa" w:w="100"/>
-            </w:tcMar>
-          </w:tcPr>
-          <w:p>
-            <w:pPr>
-              <w:spacing w:after="0"/>
-              <w:jc w:val="left"/>
-            </w:pPr>
-            <w:r>
-              <w:rPr>
-                <w:rFonts w:ascii="Times New Roman" w:cs="Times New Roman" w:eastAsia="Times New Roman" w:hAnsi="Times New Roman"/>
-                <w:b w:val="false"/>
-                <w:bCs w:val="false"/>
-                <w:sz w:val="24"/>
-                <w:szCs w:val="24"/>
-              </w:rPr>
-              <w:t xml:space="preserve">12,7 км</w:t>
-            </w:r>
-          </w:p>
-        </w:tc>
-        <w:tc>
-          <w:tcPr>
-            <w:tcW w:type="dxa" w:w="3640"/>
-            <w:tcMar>
-              <w:top w:type="dxa" w:w="60"/>
-              <w:left w:type="dxa" w:w="100"/>
-              <w:bottom w:type="dxa" w:w="60"/>
-              <w:right w:type="dxa" w:w="100"/>
-            </w:tcMar>
-          </w:tcPr>
-          <w:p>
-            <w:pPr>
-              <w:spacing w:after="0"/>
-              <w:jc w:val="left"/>
-            </w:pPr>
-            <w:r>
-              <w:rPr>
-                <w:rFonts w:ascii="Times New Roman" w:cs="Times New Roman" w:eastAsia="Times New Roman" w:hAnsi="Times New Roman"/>
-                <w:b w:val="false"/>
-                <w:bCs w:val="false"/>
-                <w:sz w:val="24"/>
-                <w:szCs w:val="24"/>
-              </w:rPr>
-              <w:t xml:space="preserve">≈12 минут на машине / ≈2 ч 50 мин пешком</w:t>
-            </w:r>
-          </w:p>
-        </w:tc>
-      </w:tr>
-      <w:tr>
-        <w:tc>
-          <w:tcPr>
-            <w:tcW w:type="dxa" w:w="600"/>
-            <w:tcMar>
-              <w:top w:type="dxa" w:w="60"/>
-              <w:left w:type="dxa" w:w="100"/>
-              <w:bottom w:type="dxa" w:w="60"/>
-              <w:right w:type="dxa" w:w="100"/>
-            </w:tcMar>
-          </w:tcPr>
-          <w:p>
-            <w:pPr>
-              <w:spacing w:after="0"/>
-              <w:jc w:val="left"/>
-            </w:pPr>
-            <w:r>
-              <w:rPr>
-                <w:rFonts w:ascii="Times New Roman" w:cs="Times New Roman" w:eastAsia="Times New Roman" w:hAnsi="Times New Roman"/>
-                <w:b w:val="false"/>
-                <w:bCs w:val="false"/>
-                <w:sz w:val="24"/>
-                <w:szCs w:val="24"/>
-              </w:rPr>
-              <w:t xml:space="preserve">3</w:t>
-            </w:r>
-          </w:p>
-        </w:tc>
-        <w:tc>
-          <w:tcPr>
-            <w:tcW w:type="dxa" w:w="2700"/>
-            <w:tcMar>
-              <w:top w:type="dxa" w:w="60"/>
-              <w:left w:type="dxa" w:w="100"/>
-              <w:bottom w:type="dxa" w:w="60"/>
-              <w:right w:type="dxa" w:w="100"/>
-            </w:tcMar>
-          </w:tcPr>
-          <w:p>
-            <w:pPr>
-              <w:spacing w:after="0"/>
-              <w:jc w:val="left"/>
-            </w:pPr>
-            <w:r>
-              <w:rPr>
-                <w:rFonts w:ascii="Times New Roman" w:cs="Times New Roman" w:eastAsia="Times New Roman" w:hAnsi="Times New Roman"/>
-                <w:b w:val="false"/>
-                <w:bCs w:val="false"/>
-                <w:sz w:val="24"/>
-                <w:szCs w:val="24"/>
-              </w:rPr>
-              <w:t xml:space="preserve">д. Лунно — д. Дубно</w:t>
-            </w:r>
-          </w:p>
-        </w:tc>
-        <w:tc>
-          <w:tcPr>
-            <w:tcW w:type="dxa" w:w="1600"/>
-            <w:tcMar>
-              <w:top w:type="dxa" w:w="60"/>
-              <w:left w:type="dxa" w:w="100"/>
-              <w:bottom w:type="dxa" w:w="60"/>
-              <w:right w:type="dxa" w:w="100"/>
-            </w:tcMar>
-          </w:tcPr>
-          <w:p>
-            <w:pPr>
-              <w:spacing w:after="0"/>
-              <w:jc w:val="left"/>
-            </w:pPr>
-            <w:r>
-              <w:rPr>
-                <w:rFonts w:ascii="Times New Roman" w:cs="Times New Roman" w:eastAsia="Times New Roman" w:hAnsi="Times New Roman"/>
-                <w:b w:val="false"/>
-                <w:bCs w:val="false"/>
-                <w:sz w:val="24"/>
-                <w:szCs w:val="24"/>
-              </w:rPr>
-              <w:t xml:space="preserve">пешком, автомобиль</w:t>
-            </w:r>
-          </w:p>
-        </w:tc>
-        <w:tc>
-          <w:tcPr>
-            <w:tcW w:type="dxa" w:w="1300"/>
-            <w:tcMar>
-              <w:top w:type="dxa" w:w="60"/>
-              <w:left w:type="dxa" w:w="100"/>
-              <w:bottom w:type="dxa" w:w="60"/>
-              <w:right w:type="dxa" w:w="100"/>
-            </w:tcMar>
-          </w:tcPr>
-          <w:p>
-            <w:pPr>
-              <w:spacing w:after="0"/>
-              <w:jc w:val="left"/>
-            </w:pPr>
-            <w:r>
-              <w:rPr>
-                <w:rFonts w:ascii="Times New Roman" w:cs="Times New Roman" w:eastAsia="Times New Roman" w:hAnsi="Times New Roman"/>
-                <w:b w:val="false"/>
-                <w:bCs w:val="false"/>
-                <w:sz w:val="24"/>
-                <w:szCs w:val="24"/>
-              </w:rPr>
-              <w:t xml:space="preserve">16,3 км</w:t>
-            </w:r>
-          </w:p>
-        </w:tc>
-        <w:tc>
-          <w:tcPr>
-            <w:tcW w:type="dxa" w:w="3640"/>
-            <w:tcMar>
-              <w:top w:type="dxa" w:w="60"/>
-              <w:left w:type="dxa" w:w="100"/>
-              <w:bottom w:type="dxa" w:w="60"/>
-              <w:right w:type="dxa" w:w="100"/>
-            </w:tcMar>
-          </w:tcPr>
-          <w:p>
-            <w:pPr>
-              <w:spacing w:after="0"/>
-              <w:jc w:val="left"/>
-            </w:pPr>
-            <w:r>
-              <w:rPr>
-                <w:rFonts w:ascii="Times New Roman" w:cs="Times New Roman" w:eastAsia="Times New Roman" w:hAnsi="Times New Roman"/>
-                <w:b w:val="false"/>
-                <w:bCs w:val="false"/>
-                <w:sz w:val="24"/>
-                <w:szCs w:val="24"/>
-              </w:rPr>
-              <w:t xml:space="preserve">≈16 минут на машине / ≈3 ч 40 мин пешком</w:t>
-            </w:r>
-          </w:p>
-        </w:tc>
-      </w:tr>
-      <w:tr>
-        <w:tc>
-          <w:tcPr>
-            <w:tcW w:type="dxa" w:w="600"/>
-            <w:tcMar>
-              <w:top w:type="dxa" w:w="60"/>
-              <w:left w:type="dxa" w:w="100"/>
-              <w:bottom w:type="dxa" w:w="60"/>
-              <w:right w:type="dxa" w:w="100"/>
-            </w:tcMar>
-          </w:tcPr>
-          <w:p>
-            <w:pPr>
-              <w:spacing w:after="0"/>
-              <w:jc w:val="left"/>
-            </w:pPr>
-            <w:r>
-              <w:rPr>
-                <w:rFonts w:ascii="Times New Roman" w:cs="Times New Roman" w:eastAsia="Times New Roman" w:hAnsi="Times New Roman"/>
-                <w:b w:val="false"/>
-                <w:bCs w:val="false"/>
-                <w:sz w:val="24"/>
-                <w:szCs w:val="24"/>
-              </w:rPr>
-              <w:t xml:space="preserve">4</w:t>
-            </w:r>
-          </w:p>
-        </w:tc>
-        <w:tc>
-          <w:tcPr>
-            <w:tcW w:type="dxa" w:w="2700"/>
-            <w:tcMar>
-              <w:top w:type="dxa" w:w="60"/>
-              <w:left w:type="dxa" w:w="100"/>
-              <w:bottom w:type="dxa" w:w="60"/>
-              <w:right w:type="dxa" w:w="100"/>
-            </w:tcMar>
-          </w:tcPr>
-          <w:p>
-            <w:pPr>
-              <w:spacing w:after="0"/>
-              <w:jc w:val="left"/>
-            </w:pPr>
-            <w:r>
-              <w:rPr>
-                <w:rFonts w:ascii="Times New Roman" w:cs="Times New Roman" w:eastAsia="Times New Roman" w:hAnsi="Times New Roman"/>
-                <w:b w:val="false"/>
-                <w:bCs w:val="false"/>
-                <w:sz w:val="24"/>
-                <w:szCs w:val="24"/>
-              </w:rPr>
-              <w:t xml:space="preserve">д. Дубно — г. Мосты</w:t>
-            </w:r>
-          </w:p>
-        </w:tc>
-        <w:tc>
-          <w:tcPr>
-            <w:tcW w:type="dxa" w:w="1600"/>
-            <w:tcMar>
-              <w:top w:type="dxa" w:w="60"/>
-              <w:left w:type="dxa" w:w="100"/>
-              <w:bottom w:type="dxa" w:w="60"/>
-              <w:right w:type="dxa" w:w="100"/>
-            </w:tcMar>
-          </w:tcPr>
-          <w:p>
-            <w:pPr>
-              <w:spacing w:after="0"/>
-              <w:jc w:val="left"/>
-            </w:pPr>
-            <w:r>
-              <w:rPr>
-                <w:rFonts w:ascii="Times New Roman" w:cs="Times New Roman" w:eastAsia="Times New Roman" w:hAnsi="Times New Roman"/>
-                <w:b w:val="false"/>
-                <w:bCs w:val="false"/>
-                <w:sz w:val="24"/>
-                <w:szCs w:val="24"/>
-              </w:rPr>
-              <w:t xml:space="preserve">автомобиль, автобус</w:t>
-            </w:r>
-          </w:p>
-        </w:tc>
-        <w:tc>
-          <w:tcPr>
-            <w:tcW w:type="dxa" w:w="1300"/>
-            <w:tcMar>
-              <w:top w:type="dxa" w:w="60"/>
-              <w:left w:type="dxa" w:w="100"/>
-              <w:bottom w:type="dxa" w:w="60"/>
-              <w:right w:type="dxa" w:w="100"/>
-            </w:tcMar>
-          </w:tcPr>
-          <w:p>
-            <w:pPr>
-              <w:spacing w:after="0"/>
-              <w:jc w:val="left"/>
-            </w:pPr>
-            <w:r>
-              <w:rPr>
-                <w:rFonts w:ascii="Times New Roman" w:cs="Times New Roman" w:eastAsia="Times New Roman" w:hAnsi="Times New Roman"/>
-                <w:b w:val="false"/>
-                <w:bCs w:val="false"/>
-                <w:sz w:val="24"/>
-                <w:szCs w:val="24"/>
-              </w:rPr>
-              <w:t xml:space="preserve">14,6 км</w:t>
-            </w:r>
-          </w:p>
-        </w:tc>
-        <w:tc>
-          <w:tcPr>
-            <w:tcW w:type="dxa" w:w="3640"/>
-            <w:tcMar>
-              <w:top w:type="dxa" w:w="60"/>
-              <w:left w:type="dxa" w:w="100"/>
-              <w:bottom w:type="dxa" w:w="60"/>
-              <w:right w:type="dxa" w:w="100"/>
-            </w:tcMar>
-          </w:tcPr>
-          <w:p>
-            <w:pPr>
-              <w:spacing w:after="0"/>
-              <w:jc w:val="left"/>
-            </w:pPr>
-            <w:r>
-              <w:rPr>
-                <w:rFonts w:ascii="Times New Roman" w:cs="Times New Roman" w:eastAsia="Times New Roman" w:hAnsi="Times New Roman"/>
-                <w:b w:val="false"/>
-                <w:bCs w:val="false"/>
-                <w:sz w:val="24"/>
-                <w:szCs w:val="24"/>
-              </w:rPr>
-              <w:t xml:space="preserve">≈15 минут</w:t>
-            </w:r>
-          </w:p>
-        </w:tc>
-      </w:tr>
-      <w:tr>
-        <w:tc>
-          <w:tcPr>
-            <w:tcW w:type="dxa" w:w="600"/>
-            <w:tcMar>
-              <w:top w:type="dxa" w:w="60"/>
-              <w:left w:type="dxa" w:w="100"/>
-              <w:bottom w:type="dxa" w:w="60"/>
-              <w:right w:type="dxa" w:w="100"/>
-            </w:tcMar>
-          </w:tcPr>
-          <w:p>
-            <w:pPr>
-              <w:spacing w:after="0"/>
-              <w:jc w:val="left"/>
-            </w:pPr>
-            <w:r>
-              <w:rPr>
-                <w:rFonts w:ascii="Times New Roman" w:cs="Times New Roman" w:eastAsia="Times New Roman" w:hAnsi="Times New Roman"/>
-                <w:b w:val="false"/>
-                <w:bCs w:val="false"/>
-                <w:sz w:val="24"/>
-                <w:szCs w:val="24"/>
-              </w:rPr>
-              <w:t xml:space="preserve">5</w:t>
-            </w:r>
-          </w:p>
-        </w:tc>
-        <w:tc>
-          <w:tcPr>
-            <w:tcW w:type="dxa" w:w="2700"/>
-            <w:tcMar>
-              <w:top w:type="dxa" w:w="60"/>
-              <w:left w:type="dxa" w:w="100"/>
-              <w:bottom w:type="dxa" w:w="60"/>
-              <w:right w:type="dxa" w:w="100"/>
-            </w:tcMar>
-          </w:tcPr>
-          <w:p>
-            <w:pPr>
-              <w:spacing w:after="0"/>
-              <w:jc w:val="left"/>
-            </w:pPr>
-            <w:r>
-              <w:rPr>
-                <w:rFonts w:ascii="Times New Roman" w:cs="Times New Roman" w:eastAsia="Times New Roman" w:hAnsi="Times New Roman"/>
-                <w:b w:val="false"/>
-                <w:bCs w:val="false"/>
-                <w:sz w:val="24"/>
-                <w:szCs w:val="24"/>
-              </w:rPr>
-              <w:t xml:space="preserve">г. Мосты — г. Гродно</w:t>
-            </w:r>
-          </w:p>
-        </w:tc>
-        <w:tc>
-          <w:tcPr>
-            <w:tcW w:type="dxa" w:w="1600"/>
-            <w:tcMar>
-              <w:top w:type="dxa" w:w="60"/>
-              <w:left w:type="dxa" w:w="100"/>
-              <w:bottom w:type="dxa" w:w="60"/>
-              <w:right w:type="dxa" w:w="100"/>
-            </w:tcMar>
-          </w:tcPr>
-          <w:p>
-            <w:pPr>
-              <w:spacing w:after="0"/>
-              <w:jc w:val="left"/>
-            </w:pPr>
-            <w:r>
-              <w:rPr>
-                <w:rFonts w:ascii="Times New Roman" w:cs="Times New Roman" w:eastAsia="Times New Roman" w:hAnsi="Times New Roman"/>
-                <w:b w:val="false"/>
-                <w:bCs w:val="false"/>
-                <w:sz w:val="24"/>
-                <w:szCs w:val="24"/>
-              </w:rPr>
-              <w:t xml:space="preserve">автомобиль, автобус</w:t>
-            </w:r>
-          </w:p>
-        </w:tc>
-        <w:tc>
-          <w:tcPr>
-            <w:tcW w:type="dxa" w:w="1300"/>
-            <w:tcMar>
-              <w:top w:type="dxa" w:w="60"/>
-              <w:left w:type="dxa" w:w="100"/>
-              <w:bottom w:type="dxa" w:w="60"/>
-              <w:right w:type="dxa" w:w="100"/>
-            </w:tcMar>
-          </w:tcPr>
-          <w:p>
-            <w:pPr>
-              <w:spacing w:after="0"/>
-              <w:jc w:val="left"/>
-            </w:pPr>
-            <w:r>
-              <w:rPr>
-                <w:rFonts w:ascii="Times New Roman" w:cs="Times New Roman" w:eastAsia="Times New Roman" w:hAnsi="Times New Roman"/>
-                <w:b w:val="false"/>
-                <w:bCs w:val="false"/>
-                <w:sz w:val="24"/>
-                <w:szCs w:val="24"/>
-              </w:rPr>
-              <w:t xml:space="preserve">63,8 км</w:t>
-            </w:r>
-          </w:p>
-        </w:tc>
-        <w:tc>
-          <w:tcPr>
-            <w:tcW w:type="dxa" w:w="3640"/>
-            <w:tcMar>
-              <w:top w:type="dxa" w:w="60"/>
-              <w:left w:type="dxa" w:w="100"/>
-              <w:bottom w:type="dxa" w:w="60"/>
-              <w:right w:type="dxa" w:w="100"/>
-            </w:tcMar>
-          </w:tcPr>
-          <w:p>
-            <w:pPr>
-              <w:spacing w:after="0"/>
-              <w:jc w:val="left"/>
-            </w:pPr>
-            <w:r>
-              <w:rPr>
-                <w:rFonts w:ascii="Times New Roman" w:cs="Times New Roman" w:eastAsia="Times New Roman" w:hAnsi="Times New Roman"/>
-                <w:b w:val="false"/>
-                <w:bCs w:val="false"/>
-                <w:sz w:val="24"/>
-                <w:szCs w:val="24"/>
-              </w:rPr>
-              <w:t xml:space="preserve">≈58 минут</w:t>
-            </w:r>
-          </w:p>
-        </w:tc>
-      </w:tr>
-    </w:tbl>
-    <w:p>
-      <w:pPr>
-        <w:pStyle w:val="Heading3"/>
-        <w:spacing w:after="100" w:before="180"/>
-      </w:pPr>
-      <w:r>
-        <w:rPr>
-          <w:rFonts w:ascii="Times New Roman" w:cs="Times New Roman" w:eastAsia="Times New Roman" w:hAnsi="Times New Roman"/>
-          <w:b/>
-          <w:bCs/>
-          <w:sz w:val="24"/>
-          <w:szCs w:val="24"/>
-        </w:rPr>
-        <w:t xml:space="preserve">Где начинается маршрут</w:t>
-      </w:r>
-    </w:p>
-    <w:p>
-      <w:pPr>
-        <w:spacing w:after="120" w:line="276"/>
-        <w:jc w:val="both"/>
-      </w:pPr>
-      <w:r>
-        <w:rPr>
-          <w:rFonts w:ascii="Times New Roman" w:cs="Times New Roman" w:eastAsia="Times New Roman" w:hAnsi="Times New Roman"/>
-          <w:b/>
-          <w:bCs/>
-          <w:sz w:val="24"/>
-          <w:szCs w:val="24"/>
-        </w:rPr>
-        <w:t xml:space="preserve">Автовокзал Гродно</w:t>
-      </w:r>
-      <w:r>
-        <w:rPr>
-          <w:rFonts w:ascii="Times New Roman" w:cs="Times New Roman" w:eastAsia="Times New Roman" w:hAnsi="Times New Roman"/>
-          <w:sz w:val="24"/>
-          <w:szCs w:val="24"/>
-        </w:rPr>
-        <w:t xml:space="preserve"> — г. Гродно, ул. Ожешко, 25. Тел.: 8 (029) 803-08-08. справочная: 7:00–19:00.</w:t>
-      </w:r>
-    </w:p>
-    <w:p>
-      <w:pPr>
-        <w:spacing w:after="120" w:line="276"/>
-        <w:jc w:val="both"/>
-      </w:pPr>
-      <w:r>
-        <w:rPr>
-          <w:rFonts w:ascii="Times New Roman" w:cs="Times New Roman" w:eastAsia="Times New Roman" w:hAnsi="Times New Roman"/>
-          <w:b/>
-          <w:bCs/>
-          <w:sz w:val="24"/>
-          <w:szCs w:val="24"/>
-        </w:rPr>
-        <w:t xml:space="preserve">Автостанция «Мосты»</w:t>
-      </w:r>
-      <w:r>
-        <w:rPr>
-          <w:rFonts w:ascii="Times New Roman" w:cs="Times New Roman" w:eastAsia="Times New Roman" w:hAnsi="Times New Roman"/>
-          <w:sz w:val="24"/>
-          <w:szCs w:val="24"/>
-        </w:rPr>
-        <w:t xml:space="preserve"> — г. Мосты, ул. Цветочная, 1. Тел.: 8 (01515) 6-47-60. касса: вт, чт с 05:30, пн, ср с 06:00 до 20:00, пт–вс с 05:30 до 20:30, перерыв 12:00–13:00.</w:t>
-      </w:r>
-    </w:p>
-    <w:p>
-      <w:pPr>
-        <w:spacing w:after="120" w:line="276"/>
-        <w:jc w:val="both"/>
-      </w:pPr>
-      <w:r>
-        <w:rPr>
-          <w:rFonts w:ascii="Times New Roman" w:cs="Times New Roman" w:eastAsia="Times New Roman" w:hAnsi="Times New Roman"/>
-          <w:sz w:val="24"/>
-          <w:szCs w:val="24"/>
-        </w:rPr>
-        <w:t xml:space="preserve">Пригородные рейсы ходят не каждый день, и время меняется: перед поездкой дни и отправление подтверждают в кассе автостанции, по справочной автовокзала или в приложении «Транспорт BY».</w:t>
-      </w:r>
-    </w:p>
-    <w:p>
-      <w:pPr>
-        <w:spacing w:after="120" w:line="276"/>
+        <w:spacing w:before="100"/>
         <w:jc w:val="both"/>
       </w:pPr>
       <w:r>
@@ -3455,7 +1641,7 @@
           <w:sz w:val="20"/>
           <w:szCs w:val="20"/>
         </w:rPr>
-        <w:t xml:space="preserve">Проверено 16.09.2026. Источник: сайт и приложение «Транспорт BY» (официальный сервис областного оператора) — маршруты и время на остановках; расписания остановок на сайте ГП «Оператор пассажирских перевозок» (файлы по маршрутам Мостовского района, в том числе «Гудевичи на Гродно» и «Гудевичи на Мосты»); контакты автостанции «Мосты» — ОАО «Гроднооблавтотранс» (grodnotrans.by), контакты автовокзала Гродно — оттуда же.</w:t>
+        <w:t xml:space="preserve">Расстояния — по дорожным маршрутам OpenStreetMap от центров городов; время на автомобиле — оценка без учёта остановок и погоды. От автовокзала Гродно (ул. Ожешко, 25) путь длиннее: до Гудевичей около 59 км.</w:t>
       </w:r>
     </w:p>
     <w:p>
@@ -3471,7 +1657,69 @@
           <w:sz w:val="24"/>
           <w:szCs w:val="24"/>
         </w:rPr>
-        <w:t xml:space="preserve">Автобусы у остановок маршрута</w:t>
+        <w:t xml:space="preserve">Где начинается маршрут: автовокзал Гродно и автостанция «Мосты»</w:t>
+      </w:r>
+    </w:p>
+    <w:p>
+      <w:pPr>
+        <w:spacing w:after="120" w:line="276"/>
+        <w:jc w:val="both"/>
+      </w:pPr>
+      <w:r>
+        <w:rPr>
+          <w:rFonts w:ascii="Times New Roman" w:cs="Times New Roman" w:eastAsia="Times New Roman" w:hAnsi="Times New Roman"/>
+          <w:b/>
+          <w:bCs/>
+          <w:sz w:val="24"/>
+          <w:szCs w:val="24"/>
+        </w:rPr>
+        <w:t xml:space="preserve">Автовокзал Гродно</w:t>
+      </w:r>
+      <w:r>
+        <w:rPr>
+          <w:rFonts w:ascii="Times New Roman" w:cs="Times New Roman" w:eastAsia="Times New Roman" w:hAnsi="Times New Roman"/>
+          <w:sz w:val="24"/>
+          <w:szCs w:val="24"/>
+        </w:rPr>
+        <w:t xml:space="preserve"> — г. Гродно, ул. Ожешко, 25. Тел.: 8 (029) 803-08-08. справочная: 7:00–19:00.</w:t>
+      </w:r>
+    </w:p>
+    <w:p>
+      <w:pPr>
+        <w:spacing w:after="120" w:line="276"/>
+        <w:jc w:val="both"/>
+      </w:pPr>
+      <w:r>
+        <w:rPr>
+          <w:rFonts w:ascii="Times New Roman" w:cs="Times New Roman" w:eastAsia="Times New Roman" w:hAnsi="Times New Roman"/>
+          <w:b/>
+          <w:bCs/>
+          <w:sz w:val="24"/>
+          <w:szCs w:val="24"/>
+        </w:rPr>
+        <w:t xml:space="preserve">Автостанция «Мосты»</w:t>
+      </w:r>
+      <w:r>
+        <w:rPr>
+          <w:rFonts w:ascii="Times New Roman" w:cs="Times New Roman" w:eastAsia="Times New Roman" w:hAnsi="Times New Roman"/>
+          <w:sz w:val="24"/>
+          <w:szCs w:val="24"/>
+        </w:rPr>
+        <w:t xml:space="preserve"> — г. Мосты, ул. Цветочная, 1. Тел.: 8 (01515) 6-47-60. касса: вт, чт с 05:30, пн, ср с 06:00 до 20:00, пт–вс с 05:30 до 20:30, перерыв 12:00–13:00.</w:t>
+      </w:r>
+    </w:p>
+    <w:p>
+      <w:pPr>
+        <w:spacing w:after="120" w:line="276"/>
+        <w:jc w:val="both"/>
+      </w:pPr>
+      <w:r>
+        <w:rPr>
+          <w:rFonts w:ascii="Times New Roman" w:cs="Times New Roman" w:eastAsia="Times New Roman" w:hAnsi="Times New Roman"/>
+          <w:sz w:val="24"/>
+          <w:szCs w:val="24"/>
+        </w:rPr>
+        <w:t xml:space="preserve">Пригородные рейсы ходят не каждый день, и время меняется: перед поездкой дни и отправление подтверждают в кассе автостанции, по справочной автовокзала или в приложении «Транспорт BY».</w:t>
       </w:r>
     </w:p>
     <w:p>
@@ -3487,7 +1735,7 @@
           <w:sz w:val="20"/>
           <w:szCs w:val="20"/>
         </w:rPr>
-        <w:t xml:space="preserve">Время указано для самой остановки, дни недели — по расписанию областного оператора пассажирских перевозок; номера рейсов в приложении «Транспорт BY» могут отличаться.</w:t>
+        <w:t xml:space="preserve">Проверено 16.09.2026. Источник: сайт и приложение «Транспорт BY» (официальный сервис областного оператора) — маршруты и время на остановках; расписания остановок на сайте ГП «Оператор пассажирских перевозок» (файлы по маршрутам Мостовского района, в том числе «Гудевичи на Гродно» и «Гудевичи на Мосты»); контакты автостанции «Мосты» — ОАО «Гроднооблавтотранс» (grodnotrans.by), контакты автовокзала Гродно — оттуда же.</w:t>
       </w:r>
     </w:p>
     <w:p>
@@ -3503,109 +1751,7 @@
           <w:sz w:val="24"/>
           <w:szCs w:val="24"/>
         </w:rPr>
-        <w:t xml:space="preserve">д. Гудевичи — остановка «Гудевичи» (ул. Мира, дорога Н6012)</w:t>
-      </w:r>
-    </w:p>
-    <w:p>
-      <w:pPr>
-        <w:spacing w:after="120" w:line="276"/>
-        <w:jc w:val="left"/>
-      </w:pPr>
-      <w:r>
-        <w:rPr>
-          <w:rFonts w:ascii="Times New Roman" w:cs="Times New Roman" w:eastAsia="Times New Roman" w:hAnsi="Times New Roman"/>
-          <w:b/>
-          <w:bCs/>
-          <w:sz w:val="24"/>
-          <w:szCs w:val="24"/>
-        </w:rPr>
-        <w:t xml:space="preserve">к Гродно: </w:t>
-      </w:r>
-      <w:r>
-        <w:rPr>
-          <w:rFonts w:ascii="Times New Roman" w:cs="Times New Roman" w:eastAsia="Times New Roman" w:hAnsi="Times New Roman"/>
-          <w:sz w:val="24"/>
-          <w:szCs w:val="24"/>
-        </w:rPr>
-        <w:t xml:space="preserve">№ 340 «Гудевичи — Гродно автовокзал» (прямой рейс), № 316 «Мосты — Гродно автовокзал», № 322 «Репля — Гродно автовокзал» </w:t>
-      </w:r>
-      <w:r>
-        <w:rPr>
-          <w:rFonts w:ascii="Times New Roman" w:cs="Times New Roman" w:eastAsia="Times New Roman" w:hAnsi="Times New Roman"/>
-          <w:i/>
-          <w:iCs/>
-          <w:sz w:val="24"/>
-          <w:szCs w:val="24"/>
-        </w:rPr>
-        <w:t xml:space="preserve">(№ 340 — пт, вс 10:00; № 316 — сб 6:57 и пт–вс 16:07; № 322 — вс 15:30)</w:t>
-      </w:r>
-    </w:p>
-    <w:p>
-      <w:pPr>
-        <w:spacing w:after="120" w:line="276"/>
-        <w:jc w:val="left"/>
-      </w:pPr>
-      <w:r>
-        <w:rPr>
-          <w:rFonts w:ascii="Times New Roman" w:cs="Times New Roman" w:eastAsia="Times New Roman" w:hAnsi="Times New Roman"/>
-          <w:b/>
-          <w:bCs/>
-          <w:sz w:val="24"/>
-          <w:szCs w:val="24"/>
-        </w:rPr>
-        <w:t xml:space="preserve">из Мостов к Семеренкам: </w:t>
-      </w:r>
-      <w:r>
-        <w:rPr>
-          <w:rFonts w:ascii="Times New Roman" w:cs="Times New Roman" w:eastAsia="Times New Roman" w:hAnsi="Times New Roman"/>
-          <w:sz w:val="24"/>
-          <w:szCs w:val="24"/>
-        </w:rPr>
-        <w:t xml:space="preserve">№ 212С «Мосты — Семеренки» — этим рейсом приезжают к храму из Мостов </w:t>
-      </w:r>
-      <w:r>
-        <w:rPr>
-          <w:rFonts w:ascii="Times New Roman" w:cs="Times New Roman" w:eastAsia="Times New Roman" w:hAnsi="Times New Roman"/>
-          <w:i/>
-          <w:iCs/>
-          <w:sz w:val="24"/>
-          <w:szCs w:val="24"/>
-        </w:rPr>
-        <w:t xml:space="preserve">(вт, ср 9:14 и 15:44)</w:t>
-      </w:r>
-    </w:p>
-    <w:p>
-      <w:pPr>
-        <w:spacing w:after="120" w:line="276"/>
-        <w:jc w:val="left"/>
-      </w:pPr>
-      <w:r>
-        <w:rPr>
-          <w:rFonts w:ascii="Times New Roman" w:cs="Times New Roman" w:eastAsia="Times New Roman" w:hAnsi="Times New Roman"/>
-          <w:b/>
-          <w:bCs/>
-          <w:sz w:val="24"/>
-          <w:szCs w:val="24"/>
-        </w:rPr>
-        <w:t xml:space="preserve">к Мостам: </w:t>
-      </w:r>
-      <w:r>
-        <w:rPr>
-          <w:rFonts w:ascii="Times New Roman" w:cs="Times New Roman" w:eastAsia="Times New Roman" w:hAnsi="Times New Roman"/>
-          <w:sz w:val="24"/>
-          <w:szCs w:val="24"/>
-        </w:rPr>
-        <w:t xml:space="preserve">№ 212С (обратно), № 316 «Гродно автовокзал — Мосты» </w:t>
-      </w:r>
-      <w:r>
-        <w:rPr>
-          <w:rFonts w:ascii="Times New Roman" w:cs="Times New Roman" w:eastAsia="Times New Roman" w:hAnsi="Times New Roman"/>
-          <w:i/>
-          <w:iCs/>
-          <w:sz w:val="24"/>
-          <w:szCs w:val="24"/>
-        </w:rPr>
-        <w:t xml:space="preserve">(№ 212С — вт, ср 9:51 и 16:21; № 316 — сб 10:15 и пт–вс 19:00)</w:t>
+        <w:t xml:space="preserve">Автобусы у остановок маршрута</w:t>
       </w:r>
     </w:p>
     <w:p>
@@ -3621,7 +1767,7 @@
           <w:sz w:val="20"/>
           <w:szCs w:val="20"/>
         </w:rPr>
-        <w:t xml:space="preserve">от остановки до храма ≈650 м — 8–9 минут пешком. Номер остановки в приложении «Транспорт BY»: 4165647.</w:t>
+        <w:t xml:space="preserve">Время указано для самой остановки, дни недели — по расписанию областного оператора пассажирских перевозок; номера рейсов в приложении «Транспорт BY» могут отличаться.</w:t>
       </w:r>
     </w:p>
     <w:p>
@@ -3637,7 +1783,7 @@
           <w:sz w:val="24"/>
           <w:szCs w:val="24"/>
         </w:rPr>
-        <w:t xml:space="preserve">д. Лунно — остановка «Лунно» (площадь Героев)</w:t>
+        <w:t xml:space="preserve">д. Гудевичи — остановка «Гудевичи» (ул. Мира)</w:t>
       </w:r>
     </w:p>
     <w:p>
@@ -3653,25 +1799,15 @@
           <w:sz w:val="24"/>
           <w:szCs w:val="24"/>
         </w:rPr>
-        <w:t xml:space="preserve">пригородные из Мостов: </w:t>
-      </w:r>
-      <w:r>
-        <w:rPr>
-          <w:rFonts w:ascii="Times New Roman" w:cs="Times New Roman" w:eastAsia="Times New Roman" w:hAnsi="Times New Roman"/>
-          <w:sz w:val="24"/>
-          <w:szCs w:val="24"/>
-        </w:rPr>
-        <w:t xml:space="preserve">№ 18в и 18г «Мосты АС — Мешетники», № 23г и 23в «Мосты АС — Щечицы» </w:t>
-      </w:r>
-      <w:r>
-        <w:rPr>
-          <w:rFonts w:ascii="Times New Roman" w:cs="Times New Roman" w:eastAsia="Times New Roman" w:hAnsi="Times New Roman"/>
-          <w:i/>
-          <w:iCs/>
-          <w:sz w:val="24"/>
-          <w:szCs w:val="24"/>
-        </w:rPr>
-        <w:t xml:space="preserve">(№ 18в и 18г — 6:37 и 7:39 (вт, чт, сб), 15:05 и 16:34 (вт, чт, сб, вс); № 23 — 10:05, 10:33, 16:14 и 16:44 (пн, ср))</w:t>
+        <w:t xml:space="preserve">Гродно: </w:t>
+      </w:r>
+      <w:r>
+        <w:rPr>
+          <w:rFonts w:ascii="Times New Roman" w:cs="Times New Roman" w:eastAsia="Times New Roman" w:hAnsi="Times New Roman"/>
+          <w:sz w:val="24"/>
+          <w:szCs w:val="24"/>
+        </w:rPr>
+        <w:t xml:space="preserve">пт, вс 10:00; сб 6:57 и пт–вс 16:07; вс 15:30</w:t>
       </w:r>
     </w:p>
     <w:p>
@@ -3687,25 +1823,15 @@
           <w:sz w:val="24"/>
           <w:szCs w:val="24"/>
         </w:rPr>
-        <w:t xml:space="preserve">из Гродно: </w:t>
-      </w:r>
-      <w:r>
-        <w:rPr>
-          <w:rFonts w:ascii="Times New Roman" w:cs="Times New Roman" w:eastAsia="Times New Roman" w:hAnsi="Times New Roman"/>
-          <w:sz w:val="24"/>
-          <w:szCs w:val="24"/>
-        </w:rPr>
-        <w:t xml:space="preserve">№ 340 «Гродно автовокзал — Гудевичи» проходит Лунно </w:t>
-      </w:r>
-      <w:r>
-        <w:rPr>
-          <w:rFonts w:ascii="Times New Roman" w:cs="Times New Roman" w:eastAsia="Times New Roman" w:hAnsi="Times New Roman"/>
-          <w:i/>
-          <w:iCs/>
-          <w:sz w:val="24"/>
-          <w:szCs w:val="24"/>
-        </w:rPr>
-        <w:t xml:space="preserve">(пт, вс 9:35 и 10:15)</w:t>
+        <w:t xml:space="preserve">Семеренки: </w:t>
+      </w:r>
+      <w:r>
+        <w:rPr>
+          <w:rFonts w:ascii="Times New Roman" w:cs="Times New Roman" w:eastAsia="Times New Roman" w:hAnsi="Times New Roman"/>
+          <w:sz w:val="24"/>
+          <w:szCs w:val="24"/>
+        </w:rPr>
+        <w:t xml:space="preserve">вт, ср 9:14 и 15:44</w:t>
       </w:r>
     </w:p>
     <w:p>
@@ -3721,25 +1847,15 @@
           <w:sz w:val="24"/>
           <w:szCs w:val="24"/>
         </w:rPr>
-        <w:t xml:space="preserve">междугородные: </w:t>
-      </w:r>
-      <w:r>
-        <w:rPr>
-          <w:rFonts w:ascii="Times New Roman" w:cs="Times New Roman" w:eastAsia="Times New Roman" w:hAnsi="Times New Roman"/>
-          <w:sz w:val="24"/>
-          <w:szCs w:val="24"/>
-        </w:rPr>
-        <w:t xml:space="preserve">«Гродно — Волковыск» (№ 304, 5001 и другие) — останавливаются в Лунно на дороге Р41 </w:t>
-      </w:r>
-      <w:r>
-        <w:rPr>
-          <w:rFonts w:ascii="Times New Roman" w:cs="Times New Roman" w:eastAsia="Times New Roman" w:hAnsi="Times New Roman"/>
-          <w:i/>
-          <w:iCs/>
-          <w:sz w:val="24"/>
-          <w:szCs w:val="24"/>
-        </w:rPr>
-        <w:t xml:space="preserve">(ежедневно, днём и вечером)</w:t>
+        <w:t xml:space="preserve">Мосты: </w:t>
+      </w:r>
+      <w:r>
+        <w:rPr>
+          <w:rFonts w:ascii="Times New Roman" w:cs="Times New Roman" w:eastAsia="Times New Roman" w:hAnsi="Times New Roman"/>
+          <w:sz w:val="24"/>
+          <w:szCs w:val="24"/>
+        </w:rPr>
+        <w:t xml:space="preserve">вт, ср 9:51 и 16:21; сб 10:15 и пт–вс 19:00</w:t>
       </w:r>
     </w:p>
     <w:p>
@@ -3755,7 +1871,7 @@
           <w:sz w:val="20"/>
           <w:szCs w:val="20"/>
         </w:rPr>
-        <w:t xml:space="preserve">остановка стоит у храма, в нескольких десятках метров. Номер остановки в приложении «Транспорт BY»: 3341327.</w:t>
+        <w:t xml:space="preserve">от остановки до храма ≈650 м — 8–9 минут пешком. Номер остановки в приложении «Транспорт BY»: 4165647.</w:t>
       </w:r>
     </w:p>
     <w:p>
@@ -3771,7 +1887,7 @@
           <w:sz w:val="24"/>
           <w:szCs w:val="24"/>
         </w:rPr>
-        <w:t xml:space="preserve">д. Дубно — остановка «Дубно» (дорога Н6377)</w:t>
+        <w:t xml:space="preserve">д. Лунно — остановка «Лунно» (площадь Героев)</w:t>
       </w:r>
     </w:p>
     <w:p>
@@ -3787,25 +1903,15 @@
           <w:sz w:val="24"/>
           <w:szCs w:val="24"/>
         </w:rPr>
-        <w:t xml:space="preserve">к Лунно и Мешетникам: </w:t>
-      </w:r>
-      <w:r>
-        <w:rPr>
-          <w:rFonts w:ascii="Times New Roman" w:cs="Times New Roman" w:eastAsia="Times New Roman" w:hAnsi="Times New Roman"/>
-          <w:sz w:val="24"/>
-          <w:szCs w:val="24"/>
-        </w:rPr>
-        <w:t xml:space="preserve">№ 18г «Мосты АС — Мешетники» </w:t>
-      </w:r>
-      <w:r>
-        <w:rPr>
-          <w:rFonts w:ascii="Times New Roman" w:cs="Times New Roman" w:eastAsia="Times New Roman" w:hAnsi="Times New Roman"/>
-          <w:i/>
-          <w:iCs/>
-          <w:sz w:val="24"/>
-          <w:szCs w:val="24"/>
-        </w:rPr>
-        <w:t xml:space="preserve">(вт, чт, сб, вс 14:42)</w:t>
+        <w:t xml:space="preserve">Мешетники: </w:t>
+      </w:r>
+      <w:r>
+        <w:rPr>
+          <w:rFonts w:ascii="Times New Roman" w:cs="Times New Roman" w:eastAsia="Times New Roman" w:hAnsi="Times New Roman"/>
+          <w:sz w:val="24"/>
+          <w:szCs w:val="24"/>
+        </w:rPr>
+        <w:t xml:space="preserve">6:37 и 7:39 (вт, чт, сб), 15:05 и 16:34 (вт, чт, сб, вс)</w:t>
       </w:r>
     </w:p>
     <w:p>
@@ -3821,25 +1927,63 @@
           <w:sz w:val="24"/>
           <w:szCs w:val="24"/>
         </w:rPr>
-        <w:t xml:space="preserve">к Мостам: </w:t>
-      </w:r>
-      <w:r>
-        <w:rPr>
-          <w:rFonts w:ascii="Times New Roman" w:cs="Times New Roman" w:eastAsia="Times New Roman" w:hAnsi="Times New Roman"/>
-          <w:sz w:val="24"/>
-          <w:szCs w:val="24"/>
-        </w:rPr>
-        <w:t xml:space="preserve">№ 18в «Мешетники — Мосты АС», № 19в «Русиновцы — Мосты АС» </w:t>
-      </w:r>
-      <w:r>
-        <w:rPr>
-          <w:rFonts w:ascii="Times New Roman" w:cs="Times New Roman" w:eastAsia="Times New Roman" w:hAnsi="Times New Roman"/>
-          <w:i/>
-          <w:iCs/>
-          <w:sz w:val="24"/>
-          <w:szCs w:val="24"/>
-        </w:rPr>
-        <w:t xml:space="preserve">(№ 18в — вт, чт, сб 8:02; № 19в — вт, пт 10:50)</w:t>
+        <w:t xml:space="preserve">Щечицы: </w:t>
+      </w:r>
+      <w:r>
+        <w:rPr>
+          <w:rFonts w:ascii="Times New Roman" w:cs="Times New Roman" w:eastAsia="Times New Roman" w:hAnsi="Times New Roman"/>
+          <w:sz w:val="24"/>
+          <w:szCs w:val="24"/>
+        </w:rPr>
+        <w:t xml:space="preserve">10:05, 10:33, 16:14 и 16:44 (пн, ср)</w:t>
+      </w:r>
+    </w:p>
+    <w:p>
+      <w:pPr>
+        <w:spacing w:after="120" w:line="276"/>
+        <w:jc w:val="left"/>
+      </w:pPr>
+      <w:r>
+        <w:rPr>
+          <w:rFonts w:ascii="Times New Roman" w:cs="Times New Roman" w:eastAsia="Times New Roman" w:hAnsi="Times New Roman"/>
+          <w:b/>
+          <w:bCs/>
+          <w:sz w:val="24"/>
+          <w:szCs w:val="24"/>
+        </w:rPr>
+        <w:t xml:space="preserve">Гродно: </w:t>
+      </w:r>
+      <w:r>
+        <w:rPr>
+          <w:rFonts w:ascii="Times New Roman" w:cs="Times New Roman" w:eastAsia="Times New Roman" w:hAnsi="Times New Roman"/>
+          <w:sz w:val="24"/>
+          <w:szCs w:val="24"/>
+        </w:rPr>
+        <w:t xml:space="preserve">9:35 и 10:15 (пт, вс)</w:t>
+      </w:r>
+    </w:p>
+    <w:p>
+      <w:pPr>
+        <w:spacing w:after="120" w:line="276"/>
+        <w:jc w:val="left"/>
+      </w:pPr>
+      <w:r>
+        <w:rPr>
+          <w:rFonts w:ascii="Times New Roman" w:cs="Times New Roman" w:eastAsia="Times New Roman" w:hAnsi="Times New Roman"/>
+          <w:b/>
+          <w:bCs/>
+          <w:sz w:val="24"/>
+          <w:szCs w:val="24"/>
+        </w:rPr>
+        <w:t xml:space="preserve">Волковыск: </w:t>
+      </w:r>
+      <w:r>
+        <w:rPr>
+          <w:rFonts w:ascii="Times New Roman" w:cs="Times New Roman" w:eastAsia="Times New Roman" w:hAnsi="Times New Roman"/>
+          <w:sz w:val="24"/>
+          <w:szCs w:val="24"/>
+        </w:rPr>
+        <w:t xml:space="preserve">ежедневно, днём и вечером</w:t>
       </w:r>
     </w:p>
     <w:p>
@@ -3855,6 +1999,86 @@
           <w:sz w:val="20"/>
           <w:szCs w:val="20"/>
         </w:rPr>
+        <w:t xml:space="preserve">остановка стоит у храма, в нескольких десятках метров. Номер остановки в приложении «Транспорт BY»: 3341327.</w:t>
+      </w:r>
+    </w:p>
+    <w:p>
+      <w:pPr>
+        <w:pStyle w:val="Heading3"/>
+        <w:spacing w:after="100" w:before="180"/>
+      </w:pPr>
+      <w:r>
+        <w:rPr>
+          <w:rFonts w:ascii="Times New Roman" w:cs="Times New Roman" w:eastAsia="Times New Roman" w:hAnsi="Times New Roman"/>
+          <w:b/>
+          <w:bCs/>
+          <w:sz w:val="24"/>
+          <w:szCs w:val="24"/>
+        </w:rPr>
+        <w:t xml:space="preserve">д. Дубно — остановка «Дубно»</w:t>
+      </w:r>
+    </w:p>
+    <w:p>
+      <w:pPr>
+        <w:spacing w:after="120" w:line="276"/>
+        <w:jc w:val="left"/>
+      </w:pPr>
+      <w:r>
+        <w:rPr>
+          <w:rFonts w:ascii="Times New Roman" w:cs="Times New Roman" w:eastAsia="Times New Roman" w:hAnsi="Times New Roman"/>
+          <w:b/>
+          <w:bCs/>
+          <w:sz w:val="24"/>
+          <w:szCs w:val="24"/>
+        </w:rPr>
+        <w:t xml:space="preserve">Лунно, Мешетники: </w:t>
+      </w:r>
+      <w:r>
+        <w:rPr>
+          <w:rFonts w:ascii="Times New Roman" w:cs="Times New Roman" w:eastAsia="Times New Roman" w:hAnsi="Times New Roman"/>
+          <w:sz w:val="24"/>
+          <w:szCs w:val="24"/>
+        </w:rPr>
+        <w:t xml:space="preserve">вт, чт, сб, вс 14:42</w:t>
+      </w:r>
+    </w:p>
+    <w:p>
+      <w:pPr>
+        <w:spacing w:after="120" w:line="276"/>
+        <w:jc w:val="left"/>
+      </w:pPr>
+      <w:r>
+        <w:rPr>
+          <w:rFonts w:ascii="Times New Roman" w:cs="Times New Roman" w:eastAsia="Times New Roman" w:hAnsi="Times New Roman"/>
+          <w:b/>
+          <w:bCs/>
+          <w:sz w:val="24"/>
+          <w:szCs w:val="24"/>
+        </w:rPr>
+        <w:t xml:space="preserve">Мосты: </w:t>
+      </w:r>
+      <w:r>
+        <w:rPr>
+          <w:rFonts w:ascii="Times New Roman" w:cs="Times New Roman" w:eastAsia="Times New Roman" w:hAnsi="Times New Roman"/>
+          <w:sz w:val="24"/>
+          <w:szCs w:val="24"/>
+        </w:rPr>
+        <w:t xml:space="preserve">вт, чт, сб 8:02; вт, пт 10:50</w:t>
+      </w:r>
+    </w:p>
+    <w:p>
+      <w:pPr>
+        <w:spacing w:after="120" w:line="276"/>
+        <w:jc w:val="both"/>
+      </w:pPr>
+      <w:r>
+        <w:rPr>
+          <w:rFonts w:ascii="Times New Roman" w:cs="Times New Roman" w:eastAsia="Times New Roman" w:hAnsi="Times New Roman"/>
+          <w:i/>
+          <w:iCs/>
+          <w:sz w:val="20"/>
+          <w:szCs w:val="20"/>
+        </w:rPr>
         <w:t xml:space="preserve">от остановки до храма ≈650 м — 8–9 минут пешком. Номер остановки в приложении «Транспорт BY»: 4235279.</w:t>
       </w:r>
     </w:p>
@@ -4082,30 +2306,6 @@
     </w:p>
     <w:p>
       <w:pPr>
-        <w:spacing w:after="120" w:line="276"/>
-        <w:jc w:val="both"/>
-      </w:pPr>
-      <w:r>
-        <w:rPr>
-          <w:rFonts w:ascii="Times New Roman" w:cs="Times New Roman" w:eastAsia="Times New Roman" w:hAnsi="Times New Roman"/>
-          <w:b/>
-          <w:bCs/>
-          <w:sz w:val="24"/>
-          <w:szCs w:val="24"/>
-        </w:rPr>
-        <w:t xml:space="preserve">Питание: </w:t>
-      </w:r>
-      <w:r>
-        <w:rPr>
-          <w:rFonts w:ascii="Times New Roman" w:cs="Times New Roman" w:eastAsia="Times New Roman" w:hAnsi="Times New Roman"/>
-          <w:sz w:val="24"/>
-          <w:szCs w:val="24"/>
-        </w:rPr>
-        <w:t xml:space="preserve">Пунктов питания в Гудевичи нет — воду и еду берите с собой. Ближайшие кафе и столовая — в Мостах.</w:t>
-      </w:r>
-    </w:p>
-    <w:p>
-      <w:pPr>
         <w:pStyle w:val="Heading3"/>
         <w:spacing w:after="100" w:before="180"/>
       </w:pPr>
@@ -4230,30 +2430,6 @@
     </w:p>
     <w:p>
       <w:pPr>
-        <w:spacing w:after="120" w:line="276"/>
-        <w:jc w:val="both"/>
-      </w:pPr>
-      <w:r>
-        <w:rPr>
-          <w:rFonts w:ascii="Times New Roman" w:cs="Times New Roman" w:eastAsia="Times New Roman" w:hAnsi="Times New Roman"/>
-          <w:b/>
-          <w:bCs/>
-          <w:sz w:val="24"/>
-          <w:szCs w:val="24"/>
-        </w:rPr>
-        <w:t xml:space="preserve">Питание: </w:t>
-      </w:r>
-      <w:r>
-        <w:rPr>
-          <w:rFonts w:ascii="Times New Roman" w:cs="Times New Roman" w:eastAsia="Times New Roman" w:hAnsi="Times New Roman"/>
-          <w:sz w:val="24"/>
-          <w:szCs w:val="24"/>
-        </w:rPr>
-        <w:t xml:space="preserve">Пунктов питания в Лунно нет — воду и еду берите с собой. Ближайшие кафе и столовая — в Мостах.</w:t>
-      </w:r>
-    </w:p>
-    <w:p>
-      <w:pPr>
         <w:pStyle w:val="Heading3"/>
         <w:spacing w:after="100" w:before="180"/>
       </w:pPr>
@@ -4281,42 +2457,6 @@
           <w:sz w:val="24"/>
           <w:szCs w:val="24"/>
         </w:rPr>
-        <w:t xml:space="preserve">Настоятель: </w:t>
-      </w:r>
-      <w:r>
-        <w:rPr>
-          <w:rFonts w:ascii="Times New Roman" w:cs="Times New Roman" w:eastAsia="Times New Roman" w:hAnsi="Times New Roman"/>
-          <w:sz w:val="24"/>
-          <w:szCs w:val="24"/>
-        </w:rPr>
-        <w:t xml:space="preserve">иерей Николай Гляд. </w:t>
-      </w:r>
-      <w:r>
-        <w:rPr>
-          <w:rFonts w:ascii="Times New Roman" w:cs="Times New Roman" w:eastAsia="Times New Roman" w:hAnsi="Times New Roman"/>
-          <w:b/>
-          <w:bCs/>
-          <w:sz w:val="24"/>
-          <w:szCs w:val="24"/>
-        </w:rPr>
-        <w:t xml:space="preserve">Телефон: </w:t>
-      </w:r>
-      <w:r>
-        <w:rPr>
-          <w:rFonts w:ascii="Times New Roman" w:cs="Times New Roman" w:eastAsia="Times New Roman" w:hAnsi="Times New Roman"/>
-          <w:sz w:val="24"/>
-          <w:szCs w:val="24"/>
-        </w:rPr>
-        <w:t xml:space="preserve">+375 29 582-30-21. </w:t>
-      </w:r>
-      <w:r>
-        <w:rPr>
-          <w:rFonts w:ascii="Times New Roman" w:cs="Times New Roman" w:eastAsia="Times New Roman" w:hAnsi="Times New Roman"/>
-          <w:b/>
-          <w:bCs/>
-          <w:sz w:val="24"/>
-          <w:szCs w:val="24"/>
-        </w:rPr>
         <w:t xml:space="preserve">Адрес: </w:t>
       </w:r>
       <w:r>
@@ -4350,30 +2490,6 @@
           <w:szCs w:val="24"/>
         </w:rPr>
         <w:t xml:space="preserve">Сб — 17:00; Вс — 9:00.</w:t>
-      </w:r>
-    </w:p>
-    <w:p>
-      <w:pPr>
-        <w:spacing w:after="120" w:line="276"/>
-        <w:jc w:val="both"/>
-      </w:pPr>
-      <w:r>
-        <w:rPr>
-          <w:rFonts w:ascii="Times New Roman" w:cs="Times New Roman" w:eastAsia="Times New Roman" w:hAnsi="Times New Roman"/>
-          <w:b/>
-          <w:bCs/>
-          <w:sz w:val="24"/>
-          <w:szCs w:val="24"/>
-        </w:rPr>
-        <w:t xml:space="preserve">Питание: </w:t>
-      </w:r>
-      <w:r>
-        <w:rPr>
-          <w:rFonts w:ascii="Times New Roman" w:cs="Times New Roman" w:eastAsia="Times New Roman" w:hAnsi="Times New Roman"/>
-          <w:sz w:val="24"/>
-          <w:szCs w:val="24"/>
-        </w:rPr>
-        <w:t xml:space="preserve">Пунктов питания в Дубно нет — воду и еду берите с собой. Ближайшие кафе и столовая — в Мостах, по пути обратно.</w:t>
       </w:r>
     </w:p>
     <w:p>
@@ -4389,7 +2505,7 @@
           <w:sz w:val="28"/>
           <w:szCs w:val="28"/>
         </w:rPr>
-        <w:t xml:space="preserve">Где поесть</w:t>
+        <w:t xml:space="preserve">Питание</w:t>
       </w:r>
     </w:p>
     <w:p>
@@ -4681,155 +2797,7 @@
           <w:sz w:val="36"/>
           <w:szCs w:val="36"/>
         </w:rPr>
-        <w:t xml:space="preserve">6. Фотоотчёт о личном посещении</w:t>
-      </w:r>
-    </w:p>
-    <w:p>
-      <w:pPr>
-        <w:spacing w:after="120" w:line="276"/>
-        <w:jc w:val="both"/>
-      </w:pPr>
-      <w:r>
-        <w:rPr>
-          <w:rFonts w:ascii="Times New Roman" w:cs="Times New Roman" w:eastAsia="Times New Roman" w:hAnsi="Times New Roman"/>
-          <w:sz w:val="24"/>
-          <w:szCs w:val="24"/>
-        </w:rPr>
-        <w:t xml:space="preserve">Отдел подтверждает личное посещение объектов: участники на фоне храмов и процесс движения по маршруту. Слоты заполняются после поездки — в них встанут фотографии авторов проекта.</w:t>
-      </w:r>
-    </w:p>
-    <w:p>
-      <w:pPr>
-        <w:spacing w:after="120" w:line="276"/>
-        <w:jc w:val="both"/>
-      </w:pPr>
-      <w:r>
-        <w:rPr>
-          <w:rFonts w:ascii="Times New Roman" w:cs="Times New Roman" w:eastAsia="Times New Roman" w:hAnsi="Times New Roman"/>
-          <w:sz w:val="24"/>
-          <w:szCs w:val="24"/>
-        </w:rPr>
-        <w:t xml:space="preserve">На интерактивном сайте блок фотоотчёта входит в страницу каждого храма: слоты заполняются после поездки, пока они честно пусты — чужие фотографии из интернета здесь не используются.</w:t>
-      </w:r>
-    </w:p>
-    <w:p>
-      <w:pPr>
-        <w:spacing w:after="40"/>
-        <w:jc w:val="both"/>
-      </w:pPr>
-      <w:r>
-        <w:rPr>
-          <w:rFonts w:ascii="Times New Roman" w:cs="Times New Roman" w:eastAsia="Times New Roman" w:hAnsi="Times New Roman"/>
-          <w:b/>
-          <w:bCs/>
-          <w:sz w:val="24"/>
-          <w:szCs w:val="24"/>
-        </w:rPr>
-        <w:t xml:space="preserve">Как заполняется:</w:t>
-      </w:r>
-    </w:p>
-    <w:p>
-      <w:pPr>
-        <w:pStyle w:val="ListParagraph"/>
-        <w:numPr>
-          <w:ilvl w:val="0"/>
-          <w:numId w:val="2"/>
-        </w:numPr>
-        <w:spacing w:after="60" w:line="276"/>
-      </w:pPr>
-      <w:r>
-        <w:rPr>
-          <w:rFonts w:ascii="Times New Roman" w:cs="Times New Roman" w:eastAsia="Times New Roman" w:hAnsi="Times New Roman"/>
-          <w:sz w:val="24"/>
-          <w:szCs w:val="24"/>
-        </w:rPr>
-        <w:t xml:space="preserve">Снять участников на фоне каждого из трёх храмов и в пути между ними.</w:t>
-      </w:r>
-    </w:p>
-    <w:p>
-      <w:pPr>
-        <w:pStyle w:val="ListParagraph"/>
-        <w:numPr>
-          <w:ilvl w:val="0"/>
-          <w:numId w:val="2"/>
-        </w:numPr>
-        <w:spacing w:after="60" w:line="276"/>
-      </w:pPr>
-      <w:r>
-        <w:rPr>
-          <w:rFonts w:ascii="Times New Roman" w:cs="Times New Roman" w:eastAsia="Times New Roman" w:hAnsi="Times New Roman"/>
-          <w:sz w:val="24"/>
-          <w:szCs w:val="24"/>
-        </w:rPr>
-        <w:t xml:space="preserve">Положить файлы в папку img/photos/visit/, например gudevichi-1.jpg.</w:t>
-      </w:r>
-    </w:p>
-    <w:p>
-      <w:pPr>
-        <w:pStyle w:val="ListParagraph"/>
-        <w:numPr>
-          <w:ilvl w:val="0"/>
-          <w:numId w:val="2"/>
-        </w:numPr>
-        <w:spacing w:after="60" w:line="276"/>
-      </w:pPr>
-      <w:r>
-        <w:rPr>
-          <w:rFonts w:ascii="Times New Roman" w:cs="Times New Roman" w:eastAsia="Times New Roman" w:hAnsi="Times New Roman"/>
-          <w:sz w:val="24"/>
-          <w:szCs w:val="24"/>
-        </w:rPr>
-        <w:t xml:space="preserve">Добавить их в js/data.js в поле храма visitPhotos: { src: "img/photos/visit/gudevichi-1.jpg", credit: "фото автора, дата" }.</w:t>
-      </w:r>
-    </w:p>
-    <w:p>
-      <w:pPr>
-        <w:pStyle w:val="ListParagraph"/>
-        <w:numPr>
-          <w:ilvl w:val="0"/>
-          <w:numId w:val="2"/>
-        </w:numPr>
-        <w:spacing w:after="60" w:line="276"/>
-      </w:pPr>
-      <w:r>
-        <w:rPr>
-          <w:rFonts w:ascii="Times New Roman" w:cs="Times New Roman" w:eastAsia="Times New Roman" w:hAnsi="Times New Roman"/>
-          <w:sz w:val="24"/>
-          <w:szCs w:val="24"/>
-        </w:rPr>
-        <w:t xml:space="preserve">Обновить страницу: слот заменится фотографией автоматически.</w:t>
-      </w:r>
-    </w:p>
-    <w:p>
-      <w:pPr>
-        <w:spacing w:after="120" w:line="276"/>
-        <w:jc w:val="both"/>
-      </w:pPr>
-      <w:r>
-        <w:rPr>
-          <w:rFonts w:ascii="Times New Roman" w:cs="Times New Roman" w:eastAsia="Times New Roman" w:hAnsi="Times New Roman"/>
-          <w:i/>
-          <w:iCs/>
-          <w:sz w:val="20"/>
-          <w:szCs w:val="20"/>
-        </w:rPr>
-        <w:t xml:space="preserve">Пока слоты пустые, страница честно показывает, что фотоотчёт ещё не снят: чужие фотографии из интернета здесь не используются.</w:t>
-      </w:r>
-    </w:p>
-    <w:p>
-      <w:pPr>
-        <w:pStyle w:val="Heading2"/>
-        <w:spacing w:after="120" w:before="240"/>
-      </w:pPr>
-      <w:r>
-        <w:rPr>
-          <w:rFonts w:ascii="Times New Roman" w:cs="Times New Roman" w:eastAsia="Times New Roman" w:hAnsi="Times New Roman"/>
-          <w:b/>
-          <w:bCs/>
-          <w:sz w:val="28"/>
-          <w:szCs w:val="28"/>
-        </w:rPr>
-        <w:t xml:space="preserve">Страницы храмов</w:t>
+        <w:t xml:space="preserve">6. Страницы храмов</w:t>
       </w:r>
     </w:p>
     <w:p>
@@ -4910,7 +2878,7 @@
         </w:rPr>
         <w:t xml:space="preserve">Автор: Сяргей Яраховіч (Валацуга), Wikimedia Commons, CC BY-SA 3.0 — </w:t>
       </w:r>
-      <w:hyperlink w:history="1" r:id="rIdbj9dsz6chssrg6fsebyzt">
+      <w:hyperlink w:history="1" r:id="rIdnb3-ysc1pqthe37n3sulv">
         <w:r>
           <w:rPr>
             <w:rFonts w:ascii="Times New Roman" w:cs="Times New Roman" w:eastAsia="Times New Roman" w:hAnsi="Times New Roman"/>
@@ -4946,31 +2914,137 @@
           <w:sz w:val="24"/>
           <w:szCs w:val="24"/>
         </w:rPr>
-        <w:t xml:space="preserve">Живая деревенская церковь с шатровой колокольней 1909 года: службы здесь не прекращались даже в военные годы, а настоятель ведёт занятия с тремя группами школьников — всего 94 человека.</w:t>
-      </w:r>
-    </w:p>
-    <w:p>
-      <w:pPr>
-        <w:spacing w:after="120" w:line="276"/>
-        <w:jc w:val="both"/>
-      </w:pPr>
-      <w:r>
-        <w:rPr>
-          <w:rFonts w:ascii="Times New Roman" w:cs="Times New Roman" w:eastAsia="Times New Roman" w:hAnsi="Times New Roman"/>
-          <w:b/>
-          <w:bCs/>
-          <w:sz w:val="24"/>
-          <w:szCs w:val="24"/>
-        </w:rPr>
-        <w:t xml:space="preserve">Как добраться: </w:t>
-      </w:r>
-      <w:r>
-        <w:rPr>
-          <w:rFonts w:ascii="Times New Roman" w:cs="Times New Roman" w:eastAsia="Times New Roman" w:hAnsi="Times New Roman"/>
-          <w:sz w:val="24"/>
-          <w:szCs w:val="24"/>
-        </w:rPr>
-        <w:t xml:space="preserve">Из Гродно — 52,8 км от центра города (≈50 минут на машине), от Мостов — 29,9 км (≈32 минуты). Автобусом: от автостанции «Мосты» — рейс № 212С (вт, ср), из Гродно — прямой рейс № 340 (пт, вс). Шатровую колокольню 1909 года видно от трассы, от остановки до храма ≈650 м пешком.</w:t>
+        <w:t xml:space="preserve">Живая деревенская церковь с шатровой колокольней 1909 года: службы здесь не прекращались даже в военные годы.</w:t>
+      </w:r>
+    </w:p>
+    <w:p>
+      <w:pPr>
+        <w:spacing w:after="120" w:line="276"/>
+        <w:jc w:val="both"/>
+      </w:pPr>
+      <w:r>
+        <w:rPr>
+          <w:rFonts w:ascii="Times New Roman" w:cs="Times New Roman" w:eastAsia="Times New Roman" w:hAnsi="Times New Roman"/>
+          <w:sz w:val="24"/>
+          <w:szCs w:val="24"/>
+        </w:rPr>
+        <w:t xml:space="preserve">Церковь Рождества Пресвятой Богородицы в Гудевичах была освящена в 1852 году. Это один из живописных сельских храмов района, выполненный в ретроспективно-русском стиле.</w:t>
+      </w:r>
+    </w:p>
+    <w:p>
+      <w:pPr>
+        <w:spacing w:after="120" w:line="276"/>
+        <w:jc w:val="both"/>
+      </w:pPr>
+      <w:r>
+        <w:rPr>
+          <w:rFonts w:ascii="Times New Roman" w:cs="Times New Roman" w:eastAsia="Times New Roman" w:hAnsi="Times New Roman"/>
+          <w:sz w:val="24"/>
+          <w:szCs w:val="24"/>
+        </w:rPr>
+        <w:t xml:space="preserve">В 1909 году к церкви была пристроена трёхъярусная шатровая колокольня из кирпича на фундаменте из тёсаного камня — она стала главной вертикалью деревни.</w:t>
+      </w:r>
+    </w:p>
+    <w:p>
+      <w:pPr>
+        <w:spacing w:after="120" w:line="276"/>
+        <w:jc w:val="both"/>
+      </w:pPr>
+      <w:r>
+        <w:rPr>
+          <w:rFonts w:ascii="Times New Roman" w:cs="Times New Roman" w:eastAsia="Times New Roman" w:hAnsi="Times New Roman"/>
+          <w:sz w:val="24"/>
+          <w:szCs w:val="24"/>
+        </w:rPr>
+        <w:t xml:space="preserve">Название деревни связывают с легендой: через местечко проходил шумный тракт, связывавший Гродно и Белосток, и проезжавшие купцы окрестили поселение «гудящим» — со временем это превратилось в «Гудевичи».</w:t>
+      </w:r>
+    </w:p>
+    <w:p>
+      <w:pPr>
+        <w:spacing w:after="40"/>
+        <w:jc w:val="both"/>
+      </w:pPr>
+      <w:r>
+        <w:rPr>
+          <w:rFonts w:ascii="Times New Roman" w:cs="Times New Roman" w:eastAsia="Times New Roman" w:hAnsi="Times New Roman"/>
+          <w:b/>
+          <w:bCs/>
+          <w:sz w:val="24"/>
+          <w:szCs w:val="24"/>
+        </w:rPr>
+        <w:t xml:space="preserve">Ключевые факты:</w:t>
+      </w:r>
+    </w:p>
+    <w:p>
+      <w:pPr>
+        <w:pStyle w:val="ListParagraph"/>
+        <w:numPr>
+          <w:ilvl w:val="0"/>
+          <w:numId w:val="2"/>
+        </w:numPr>
+        <w:spacing w:after="60" w:line="276"/>
+      </w:pPr>
+      <w:r>
+        <w:rPr>
+          <w:rFonts w:ascii="Times New Roman" w:cs="Times New Roman" w:eastAsia="Times New Roman" w:hAnsi="Times New Roman"/>
+          <w:sz w:val="24"/>
+          <w:szCs w:val="24"/>
+        </w:rPr>
+        <w:t xml:space="preserve">Освящена в 1852 году</w:t>
+      </w:r>
+    </w:p>
+    <w:p>
+      <w:pPr>
+        <w:pStyle w:val="ListParagraph"/>
+        <w:numPr>
+          <w:ilvl w:val="0"/>
+          <w:numId w:val="2"/>
+        </w:numPr>
+        <w:spacing w:after="60" w:line="276"/>
+      </w:pPr>
+      <w:r>
+        <w:rPr>
+          <w:rFonts w:ascii="Times New Roman" w:cs="Times New Roman" w:eastAsia="Times New Roman" w:hAnsi="Times New Roman"/>
+          <w:sz w:val="24"/>
+          <w:szCs w:val="24"/>
+        </w:rPr>
+        <w:t xml:space="preserve">Колокольня 1909 года — кирпичная, на каменном фундаменте</w:t>
+      </w:r>
+    </w:p>
+    <w:p>
+      <w:pPr>
+        <w:pStyle w:val="ListParagraph"/>
+        <w:numPr>
+          <w:ilvl w:val="0"/>
+          <w:numId w:val="2"/>
+        </w:numPr>
+        <w:spacing w:after="60" w:line="276"/>
+      </w:pPr>
+      <w:r>
+        <w:rPr>
+          <w:rFonts w:ascii="Times New Roman" w:cs="Times New Roman" w:eastAsia="Times New Roman" w:hAnsi="Times New Roman"/>
+          <w:sz w:val="24"/>
+          <w:szCs w:val="24"/>
+        </w:rPr>
+        <w:t xml:space="preserve">Богослужения не прекращались даже в военные годы</w:t>
+      </w:r>
+    </w:p>
+    <w:p>
+      <w:pPr>
+        <w:pStyle w:val="ListParagraph"/>
+        <w:numPr>
+          <w:ilvl w:val="0"/>
+          <w:numId w:val="2"/>
+        </w:numPr>
+        <w:spacing w:after="60" w:line="276"/>
+      </w:pPr>
+      <w:r>
+        <w:rPr>
+          <w:rFonts w:ascii="Times New Roman" w:cs="Times New Roman" w:eastAsia="Times New Roman" w:hAnsi="Times New Roman"/>
+          <w:sz w:val="24"/>
+          <w:szCs w:val="24"/>
+        </w:rPr>
+        <w:t xml:space="preserve">Адрес: ул. Центральная, 6а</w:t>
       </w:r>
     </w:p>
     <w:p>
@@ -5227,7 +3301,7 @@
         </w:rPr>
         <w:t xml:space="preserve">Автор: В.Васіленка (fgb.by), Wikimedia Commons, CC BY-SA 3.0 — </w:t>
       </w:r>
-      <w:hyperlink w:history="1" r:id="rIdc_ob1hhe8br4rj4lrhmxc">
+      <w:hyperlink w:history="1" r:id="rIdifmwp_p3dmt_p0fpc8jrf">
         <w:r>
           <w:rPr>
             <w:rFonts w:ascii="Times New Roman" w:cs="Times New Roman" w:eastAsia="Times New Roman" w:hAnsi="Times New Roman"/>
@@ -5274,44 +3348,176 @@
       <w:r>
         <w:rPr>
           <w:rFonts w:ascii="Times New Roman" w:cs="Times New Roman" w:eastAsia="Times New Roman" w:hAnsi="Times New Roman"/>
-          <w:b/>
-          <w:bCs/>
-          <w:sz w:val="24"/>
-          <w:szCs w:val="24"/>
-        </w:rPr>
-        <w:t xml:space="preserve">Как добраться: </w:t>
-      </w:r>
-      <w:r>
-        <w:rPr>
-          <w:rFonts w:ascii="Times New Roman" w:cs="Times New Roman" w:eastAsia="Times New Roman" w:hAnsi="Times New Roman"/>
-          <w:sz w:val="24"/>
-          <w:szCs w:val="24"/>
-        </w:rPr>
-        <w:t xml:space="preserve">Из Гродно — 41,0 км от центра города (≈40 минут на машине), от Мостов — 25,9 км (≈24 минуты). Автобусом: из Мостов — рейсы № 18в и 18г «Мосты — Мешетники» (вт, чт, сб, вс) и № 23г «Мосты — Щечицы» (пн, ср), из Гродно — рейс № 340 (пт, вс). Остановка на площади Героев стоит рядом с храмом. От Гудевичей до Лунно 12,7 км: этот перегон можно пройти пешком за ≈2 часа 50 минут.</w:t>
-      </w:r>
-    </w:p>
-    <w:p>
-      <w:pPr>
-        <w:spacing w:after="120" w:line="276"/>
-        <w:jc w:val="both"/>
-      </w:pPr>
-      <w:r>
-        <w:rPr>
-          <w:rFonts w:ascii="Times New Roman" w:cs="Times New Roman" w:eastAsia="Times New Roman" w:hAnsi="Times New Roman"/>
-          <w:b/>
-          <w:bCs/>
-          <w:sz w:val="24"/>
-          <w:szCs w:val="24"/>
-        </w:rPr>
-        <w:t xml:space="preserve">Примечание: </w:t>
-      </w:r>
-      <w:r>
-        <w:rPr>
-          <w:rFonts w:ascii="Times New Roman" w:cs="Times New Roman" w:eastAsia="Times New Roman" w:hAnsi="Times New Roman"/>
-          <w:sz w:val="24"/>
-          <w:szCs w:val="24"/>
-        </w:rPr>
-        <w:t xml:space="preserve">К приходу приписан храм Рождества Пресвятой Богородицы в д. Черлёна.</w:t>
+          <w:sz w:val="24"/>
+          <w:szCs w:val="24"/>
+        </w:rPr>
+        <w:t xml:space="preserve">Церковь Рождества Иоанна Предтечи в Лунно датируется 1889 годом. Строительные работы велись на средства, выделенные из казны. Облик храма напоминает небольшую крепость: в нём присутствуют черты ренессансной и готической архитектуры.</w:t>
+      </w:r>
+    </w:p>
+    <w:p>
+      <w:pPr>
+        <w:spacing w:after="120" w:line="276"/>
+        <w:jc w:val="both"/>
+      </w:pPr>
+      <w:r>
+        <w:rPr>
+          <w:rFonts w:ascii="Times New Roman" w:cs="Times New Roman" w:eastAsia="Times New Roman" w:hAnsi="Times New Roman"/>
+          <w:sz w:val="24"/>
+          <w:szCs w:val="24"/>
+        </w:rPr>
+        <w:t xml:space="preserve">Ретроспективно-русские декоративные элементы дополняют этот облик: две массивные башни, увенчанные шатровой крышей, и аркатурные пояски. Храм хорошо виден с дороги и остаётся одним из акцентов исторической застройки местечка.</w:t>
+      </w:r>
+    </w:p>
+    <w:p>
+      <w:pPr>
+        <w:spacing w:after="120" w:line="276"/>
+        <w:jc w:val="both"/>
+      </w:pPr>
+      <w:r>
+        <w:rPr>
+          <w:rFonts w:ascii="Times New Roman" w:cs="Times New Roman" w:eastAsia="Times New Roman" w:hAnsi="Times New Roman"/>
+          <w:sz w:val="24"/>
+          <w:szCs w:val="24"/>
+        </w:rPr>
+        <w:t xml:space="preserve">Из описания прихода конца XIX века: церковь стояла в 40 верстах от Гродно, прихожан насчитывалось 1327 мужского и 1134 женского пола, а на службы собирались верующие из 17 окрестных селений. Самым дальним было селение Кухары в 8 верстах от Лунно.</w:t>
+      </w:r>
+    </w:p>
+    <w:p>
+      <w:pPr>
+        <w:spacing w:after="120" w:line="276"/>
+        <w:jc w:val="both"/>
+      </w:pPr>
+      <w:r>
+        <w:rPr>
+          <w:rFonts w:ascii="Times New Roman" w:cs="Times New Roman" w:eastAsia="Times New Roman" w:hAnsi="Times New Roman"/>
+          <w:sz w:val="24"/>
+          <w:szCs w:val="24"/>
+        </w:rPr>
+        <w:t xml:space="preserve">Причт состоял из двух человек — священника и псаломщика, каждый получал жалование 496 рублей; у церкви был собственный капитал в 1400 рублей, проценты с которого, как завещали Мучинские, наполовину шли на пользу причта. При церкви работали церковно-приходское попечительство, школы в четырёх окрестных деревнях на 39 учеников, народное училище и богадельня.</w:t>
+      </w:r>
+    </w:p>
+    <w:p>
+      <w:pPr>
+        <w:spacing w:after="40"/>
+        <w:jc w:val="both"/>
+      </w:pPr>
+      <w:r>
+        <w:rPr>
+          <w:rFonts w:ascii="Times New Roman" w:cs="Times New Roman" w:eastAsia="Times New Roman" w:hAnsi="Times New Roman"/>
+          <w:b/>
+          <w:bCs/>
+          <w:sz w:val="24"/>
+          <w:szCs w:val="24"/>
+        </w:rPr>
+        <w:t xml:space="preserve">Ключевые факты:</w:t>
+      </w:r>
+    </w:p>
+    <w:p>
+      <w:pPr>
+        <w:pStyle w:val="ListParagraph"/>
+        <w:numPr>
+          <w:ilvl w:val="0"/>
+          <w:numId w:val="2"/>
+        </w:numPr>
+        <w:spacing w:after="60" w:line="276"/>
+      </w:pPr>
+      <w:r>
+        <w:rPr>
+          <w:rFonts w:ascii="Times New Roman" w:cs="Times New Roman" w:eastAsia="Times New Roman" w:hAnsi="Times New Roman"/>
+          <w:sz w:val="24"/>
+          <w:szCs w:val="24"/>
+        </w:rPr>
+        <w:t xml:space="preserve">1889 год, построена на казённые средства</w:t>
+      </w:r>
+    </w:p>
+    <w:p>
+      <w:pPr>
+        <w:pStyle w:val="ListParagraph"/>
+        <w:numPr>
+          <w:ilvl w:val="0"/>
+          <w:numId w:val="2"/>
+        </w:numPr>
+        <w:spacing w:after="60" w:line="276"/>
+      </w:pPr>
+      <w:r>
+        <w:rPr>
+          <w:rFonts w:ascii="Times New Roman" w:cs="Times New Roman" w:eastAsia="Times New Roman" w:hAnsi="Times New Roman"/>
+          <w:sz w:val="24"/>
+          <w:szCs w:val="24"/>
+        </w:rPr>
+        <w:t xml:space="preserve">«Крепостной» облик: черты ренессанса и готики</w:t>
+      </w:r>
+    </w:p>
+    <w:p>
+      <w:pPr>
+        <w:pStyle w:val="ListParagraph"/>
+        <w:numPr>
+          <w:ilvl w:val="0"/>
+          <w:numId w:val="2"/>
+        </w:numPr>
+        <w:spacing w:after="60" w:line="276"/>
+      </w:pPr>
+      <w:r>
+        <w:rPr>
+          <w:rFonts w:ascii="Times New Roman" w:cs="Times New Roman" w:eastAsia="Times New Roman" w:hAnsi="Times New Roman"/>
+          <w:sz w:val="24"/>
+          <w:szCs w:val="24"/>
+        </w:rPr>
+        <w:t xml:space="preserve">Две массивные башни под шатровой крышей, аркатурные пояски</w:t>
+      </w:r>
+    </w:p>
+    <w:p>
+      <w:pPr>
+        <w:pStyle w:val="ListParagraph"/>
+        <w:numPr>
+          <w:ilvl w:val="0"/>
+          <w:numId w:val="2"/>
+        </w:numPr>
+        <w:spacing w:after="60" w:line="276"/>
+      </w:pPr>
+      <w:r>
+        <w:rPr>
+          <w:rFonts w:ascii="Times New Roman" w:cs="Times New Roman" w:eastAsia="Times New Roman" w:hAnsi="Times New Roman"/>
+          <w:sz w:val="24"/>
+          <w:szCs w:val="24"/>
+        </w:rPr>
+        <w:t xml:space="preserve">В конце XIX века — 2461 прихожанин из 17 селений</w:t>
+      </w:r>
+    </w:p>
+    <w:p>
+      <w:pPr>
+        <w:pStyle w:val="ListParagraph"/>
+        <w:numPr>
+          <w:ilvl w:val="0"/>
+          <w:numId w:val="2"/>
+        </w:numPr>
+        <w:spacing w:after="60" w:line="276"/>
+      </w:pPr>
+      <w:r>
+        <w:rPr>
+          <w:rFonts w:ascii="Times New Roman" w:cs="Times New Roman" w:eastAsia="Times New Roman" w:hAnsi="Times New Roman"/>
+          <w:sz w:val="24"/>
+          <w:szCs w:val="24"/>
+        </w:rPr>
+        <w:t xml:space="preserve">Причт — 2 человека, жалование 496 рублей каждому</w:t>
+      </w:r>
+    </w:p>
+    <w:p>
+      <w:pPr>
+        <w:pStyle w:val="ListParagraph"/>
+        <w:numPr>
+          <w:ilvl w:val="0"/>
+          <w:numId w:val="2"/>
+        </w:numPr>
+        <w:spacing w:after="60" w:line="276"/>
+      </w:pPr>
+      <w:r>
+        <w:rPr>
+          <w:rFonts w:ascii="Times New Roman" w:cs="Times New Roman" w:eastAsia="Times New Roman" w:hAnsi="Times New Roman"/>
+          <w:sz w:val="24"/>
+          <w:szCs w:val="24"/>
+        </w:rPr>
+        <w:t xml:space="preserve">Адрес: пл. Героев, 15</w:t>
       </w:r>
     </w:p>
     <w:p>
@@ -5496,7 +3702,7 @@
       <w:r>
         <w:drawing>
           <wp:inline distT="0" distB="0" distL="0" distR="0">
-            <wp:extent cx="4381500" cy="3286125"/>
+            <wp:extent cx="4381500" cy="2466975"/>
             <wp:effectExtent t="0" r="0" b="0" l="0"/>
             <wp:docPr id="1" name="" descr="" title=""/>
             <wp:cNvGraphicFramePr>
@@ -5521,7 +3727,7 @@
                   <pic:spPr bwMode="auto">
                     <a:xfrm>
                       <a:off x="0" y="0"/>
-                      <a:ext cx="4381500" cy="3286125"/>
+                      <a:ext cx="4381500" cy="2466975"/>
                     </a:xfrm>
                     <a:prstGeom prst="rect">
                       <a:avLst/>
@@ -5548,9 +3754,9 @@
           <w:sz w:val="18"/>
           <w:szCs w:val="18"/>
         </w:rPr>
-        <w:t xml:space="preserve">Автор: Борис Мавлютов, Wikimedia Commons, CC BY-SA 3.0 — </w:t>
-      </w:r>
-      <w:hyperlink w:history="1" r:id="rIdtso7exogneqszhq8lxqeu">
+        <w:t xml:space="preserve">Автор: desukov (Panoramio), Wikimedia Commons, CC BY 3.0 — </w:t>
+      </w:r>
+      <w:hyperlink w:history="1" r:id="rIdruawmbqcwccp-xwqn0q1d">
         <w:r>
           <w:rPr>
             <w:rFonts w:ascii="Times New Roman" w:cs="Times New Roman" w:eastAsia="Times New Roman" w:hAnsi="Times New Roman"/>
@@ -5597,44 +3803,158 @@
       <w:r>
         <w:rPr>
           <w:rFonts w:ascii="Times New Roman" w:cs="Times New Roman" w:eastAsia="Times New Roman" w:hAnsi="Times New Roman"/>
-          <w:b/>
-          <w:bCs/>
-          <w:sz w:val="24"/>
-          <w:szCs w:val="24"/>
-        </w:rPr>
-        <w:t xml:space="preserve">Как добраться: </w:t>
-      </w:r>
-      <w:r>
-        <w:rPr>
-          <w:rFonts w:ascii="Times New Roman" w:cs="Times New Roman" w:eastAsia="Times New Roman" w:hAnsi="Times New Roman"/>
-          <w:sz w:val="24"/>
-          <w:szCs w:val="24"/>
-        </w:rPr>
-        <w:t xml:space="preserve">Из Гродно — 54,2 км от центра города (≈49 минут на машине), от Мостов — 14,5 км (≈14 минут). Автобусом от автостанции «Мосты» — рейсы № 18г и 18в через Лунно (вт, чт, сб, вс) и № 19в (вт, пт); остановка «Дубно» — в ≈650 м от храма. От Лунно до Дубно 16,3 км: этот перегон можно пройти пешком за ≈3 часа 40 минут.</w:t>
-      </w:r>
-    </w:p>
-    <w:p>
-      <w:pPr>
-        <w:spacing w:after="120" w:line="276"/>
-        <w:jc w:val="both"/>
-      </w:pPr>
-      <w:r>
-        <w:rPr>
-          <w:rFonts w:ascii="Times New Roman" w:cs="Times New Roman" w:eastAsia="Times New Roman" w:hAnsi="Times New Roman"/>
-          <w:b/>
-          <w:bCs/>
-          <w:sz w:val="24"/>
-          <w:szCs w:val="24"/>
-        </w:rPr>
-        <w:t xml:space="preserve">Примечание: </w:t>
-      </w:r>
-      <w:r>
-        <w:rPr>
-          <w:rFonts w:ascii="Times New Roman" w:cs="Times New Roman" w:eastAsia="Times New Roman" w:hAnsi="Times New Roman"/>
-          <w:sz w:val="24"/>
-          <w:szCs w:val="24"/>
-        </w:rPr>
-        <w:t xml:space="preserve">фото на Commons подписано «Церковь Вознесения Господня» — согласуется с одним из трёх престолов; главный престол — Николая Чудотворца</w:t>
+          <w:sz w:val="24"/>
+          <w:szCs w:val="24"/>
+        </w:rPr>
+        <w:t xml:space="preserve">Никольский храм в Дубно строился в 1842–1844 годах и был освящён в 1850 году епископом Брестским Игнатием. Это один из самых крупных сельских храмов района: площадь 720 м², вместимость до 3000 человек, высота центрального купола 35 метров.</w:t>
+      </w:r>
+    </w:p>
+    <w:p>
+      <w:pPr>
+        <w:spacing w:after="120" w:line="276"/>
+        <w:jc w:val="both"/>
+      </w:pPr>
+      <w:r>
+        <w:rPr>
+          <w:rFonts w:ascii="Times New Roman" w:cs="Times New Roman" w:eastAsia="Times New Roman" w:hAnsi="Times New Roman"/>
+          <w:sz w:val="24"/>
+          <w:szCs w:val="24"/>
+        </w:rPr>
+        <w:t xml:space="preserve">В 1864 году храм реконструировали с использованием черт ретроспективно-русского стиля; монументально квадратный в плане двухъярусный объём завершается огромным цилиндрическим световым барабаном под луковичным куполом. Главный элемент интерьера — именно этот световой барабан, придающий храму воздушный, торжественный вид; восточная, северная и южная стены оборудованы узкими галереями хоров, а приподнятое пространство у алтаря делит алтарную часть на два клироса.</w:t>
+      </w:r>
+    </w:p>
+    <w:p>
+      <w:pPr>
+        <w:spacing w:after="120" w:line="276"/>
+        <w:jc w:val="both"/>
+      </w:pPr>
+      <w:r>
+        <w:rPr>
+          <w:rFonts w:ascii="Times New Roman" w:cs="Times New Roman" w:eastAsia="Times New Roman" w:hAnsi="Times New Roman"/>
+          <w:sz w:val="24"/>
+          <w:szCs w:val="24"/>
+        </w:rPr>
+        <w:t xml:space="preserve">В храме три престола: святителя Николая Чудотворца, Евстафия Плакиды и Вознесения Господня. Пятикупольное здание сочетает ретроспективно-русский стиль с классицизмом.</w:t>
+      </w:r>
+    </w:p>
+    <w:p>
+      <w:pPr>
+        <w:spacing w:after="120" w:line="276"/>
+        <w:jc w:val="both"/>
+      </w:pPr>
+      <w:r>
+        <w:rPr>
+          <w:rFonts w:ascii="Times New Roman" w:cs="Times New Roman" w:eastAsia="Times New Roman" w:hAnsi="Times New Roman"/>
+          <w:sz w:val="24"/>
+          <w:szCs w:val="24"/>
+        </w:rPr>
+        <w:t xml:space="preserve">С храмом связана легенда: будто проект готовился для украинского города Дубна Ровенской области, но строители перепутали и возвели храм в деревне Дубно под Мостами. В главном алтаре сохранились иконы в необычном стиле, похожие на чёрно-белые фотографии, и образ Иоасафа Белгородского, написанный на металле — в северорусской традиции. Службы в храме не прекращались со дня освящения.</w:t>
+      </w:r>
+    </w:p>
+    <w:p>
+      <w:pPr>
+        <w:spacing w:after="40"/>
+        <w:jc w:val="both"/>
+      </w:pPr>
+      <w:r>
+        <w:rPr>
+          <w:rFonts w:ascii="Times New Roman" w:cs="Times New Roman" w:eastAsia="Times New Roman" w:hAnsi="Times New Roman"/>
+          <w:b/>
+          <w:bCs/>
+          <w:sz w:val="24"/>
+          <w:szCs w:val="24"/>
+        </w:rPr>
+        <w:t xml:space="preserve">Ключевые факты:</w:t>
+      </w:r>
+    </w:p>
+    <w:p>
+      <w:pPr>
+        <w:pStyle w:val="ListParagraph"/>
+        <w:numPr>
+          <w:ilvl w:val="0"/>
+          <w:numId w:val="2"/>
+        </w:numPr>
+        <w:spacing w:after="60" w:line="276"/>
+      </w:pPr>
+      <w:r>
+        <w:rPr>
+          <w:rFonts w:ascii="Times New Roman" w:cs="Times New Roman" w:eastAsia="Times New Roman" w:hAnsi="Times New Roman"/>
+          <w:sz w:val="24"/>
+          <w:szCs w:val="24"/>
+        </w:rPr>
+        <w:t xml:space="preserve">Строительство 1842–1844, освящён в 1850</w:t>
+      </w:r>
+    </w:p>
+    <w:p>
+      <w:pPr>
+        <w:pStyle w:val="ListParagraph"/>
+        <w:numPr>
+          <w:ilvl w:val="0"/>
+          <w:numId w:val="2"/>
+        </w:numPr>
+        <w:spacing w:after="60" w:line="276"/>
+      </w:pPr>
+      <w:r>
+        <w:rPr>
+          <w:rFonts w:ascii="Times New Roman" w:cs="Times New Roman" w:eastAsia="Times New Roman" w:hAnsi="Times New Roman"/>
+          <w:sz w:val="24"/>
+          <w:szCs w:val="24"/>
+        </w:rPr>
+        <w:t xml:space="preserve">Вместимость — до 3000 человек, купол высотой 35 м</w:t>
+      </w:r>
+    </w:p>
+    <w:p>
+      <w:pPr>
+        <w:pStyle w:val="ListParagraph"/>
+        <w:numPr>
+          <w:ilvl w:val="0"/>
+          <w:numId w:val="2"/>
+        </w:numPr>
+        <w:spacing w:after="60" w:line="276"/>
+      </w:pPr>
+      <w:r>
+        <w:rPr>
+          <w:rFonts w:ascii="Times New Roman" w:cs="Times New Roman" w:eastAsia="Times New Roman" w:hAnsi="Times New Roman"/>
+          <w:sz w:val="24"/>
+          <w:szCs w:val="24"/>
+        </w:rPr>
+        <w:t xml:space="preserve">Три престола: Николая Чудотворца, Евстафия Плакиды, Вознесения Господня</w:t>
+      </w:r>
+    </w:p>
+    <w:p>
+      <w:pPr>
+        <w:pStyle w:val="ListParagraph"/>
+        <w:numPr>
+          <w:ilvl w:val="0"/>
+          <w:numId w:val="2"/>
+        </w:numPr>
+        <w:spacing w:after="60" w:line="276"/>
+      </w:pPr>
+      <w:r>
+        <w:rPr>
+          <w:rFonts w:ascii="Times New Roman" w:cs="Times New Roman" w:eastAsia="Times New Roman" w:hAnsi="Times New Roman"/>
+          <w:sz w:val="24"/>
+          <w:szCs w:val="24"/>
+        </w:rPr>
+        <w:t xml:space="preserve">Легенда о «перепутанном проекте» для украинского Дубна</w:t>
+      </w:r>
+    </w:p>
+    <w:p>
+      <w:pPr>
+        <w:pStyle w:val="ListParagraph"/>
+        <w:numPr>
+          <w:ilvl w:val="0"/>
+          <w:numId w:val="2"/>
+        </w:numPr>
+        <w:spacing w:after="60" w:line="276"/>
+      </w:pPr>
+      <w:r>
+        <w:rPr>
+          <w:rFonts w:ascii="Times New Roman" w:cs="Times New Roman" w:eastAsia="Times New Roman" w:hAnsi="Times New Roman"/>
+          <w:sz w:val="24"/>
+          <w:szCs w:val="24"/>
+        </w:rPr>
+        <w:t xml:space="preserve">Службы не прекращались со дня освящения</w:t>
       </w:r>
     </w:p>
     <w:p>

</xml_diff>

<commit_message>
copy: cut the review findings — blurbs, self-scored sources, check stamps
Owner review of the rendered pages: the three «чем привлекателен» blurbs, the
OpenStreetMap check stamps and the source checklist that graded the project
against criteria it wrote itself read as padding, and the developer's name was
wrong. Remove them from the site and from every church page, keep the
historical notes, the route appeal and the about page's real source list, name
the authors in «Справочная информация», and rebuild the printed copy so it
repeats the site again.

🤖 Generated with Codebuff
Co-Authored-By: Codebuff <noreply@codebuff.com>
</commit_message>
<xml_diff>
--- a/Дорогами-духовности-сайт.docx
+++ b/Дорогами-духовности-сайт.docx
@@ -94,7 +94,7 @@
           <w:sz w:val="24"/>
           <w:szCs w:val="24"/>
         </w:rPr>
-        <w:t xml:space="preserve">Юлиана Ступчика</w:t>
+        <w:t xml:space="preserve">Юлиан Ступчик</w:t>
       </w:r>
     </w:p>
     <w:p>
@@ -206,20 +206,6 @@
     </w:p>
     <w:p>
       <w:pPr>
-        <w:spacing w:after="120" w:line="276"/>
-        <w:jc w:val="both"/>
-      </w:pPr>
-      <w:r>
-        <w:rPr>
-          <w:rFonts w:ascii="Times New Roman" w:cs="Times New Roman" w:eastAsia="Times New Roman" w:hAnsi="Times New Roman"/>
-          <w:sz w:val="24"/>
-          <w:szCs w:val="24"/>
-        </w:rPr>
-        <w:t xml:space="preserve">Три сельские церкви XIX века в Мостовском районе Гродненской области: Гудевичи (1852), Лунно (1889) и Дубно (1844). Маршрут начинается в Гродно и идёт с запада на восток: от шатровой колокольни Гудевичей к «крепостному» храму Лунно и дальше к самому крупному храму тройки в Дубно, а заканчивается в Мостах — районном центре.</w:t>
-      </w:r>
-    </w:p>
-    <w:p>
-      <w:pPr>
         <w:pStyle w:val="Heading3"/>
         <w:spacing w:after="100" w:before="180"/>
       </w:pPr>
@@ -352,20 +338,6 @@
           <w:szCs w:val="36"/>
         </w:rPr>
         <w:t xml:space="preserve">2. Карта-схема</w:t>
-      </w:r>
-    </w:p>
-    <w:p>
-      <w:pPr>
-        <w:spacing w:after="120" w:line="276"/>
-        <w:jc w:val="both"/>
-      </w:pPr>
-      <w:r>
-        <w:rPr>
-          <w:rFonts w:ascii="Times New Roman" w:cs="Times New Roman" w:eastAsia="Times New Roman" w:hAnsi="Times New Roman"/>
-          <w:sz w:val="24"/>
-          <w:szCs w:val="24"/>
-        </w:rPr>
-        <w:t xml:space="preserve">Схема маршрута на реальной географии: границы района, Нёман и дороги — данные OpenStreetMap.</w:t>
       </w:r>
     </w:p>
     <w:p>
@@ -427,7 +399,7 @@
           <w:sz w:val="20"/>
           <w:szCs w:val="20"/>
         </w:rPr>
-        <w:t xml:space="preserve">Условные знаки: иконка церкви с номером шага — остановка маршрута; красный пунктир — нитка маршрута по дорогам; жёлтые линии — автодороги; штриховая чёрная — железная дорога; синяя линия — река Неман. Геометрия района, реки и дорог, автопуть маршрута — © OpenStreetMap contributors (ODbL 1.0), маршрут — OSRM.</w:t>
+        <w:t xml:space="preserve">Условные знаки: жёлтые линии — автодороги; штриховая чёрная — железная дорога; синяя линия — река Неман. Геометрия района, реки и дорог, автопуть маршрута — © OpenStreetMap contributors (ODbL 1.0), маршрут — OSRM.</w:t>
       </w:r>
     </w:p>
     <w:p>
@@ -680,22 +652,6 @@
       <w:r>
         <w:rPr>
           <w:rFonts w:ascii="Times New Roman" w:cs="Times New Roman" w:eastAsia="Times New Roman" w:hAnsi="Times New Roman"/>
-          <w:i/>
-          <w:iCs/>
-          <w:sz w:val="24"/>
-          <w:szCs w:val="24"/>
-        </w:rPr>
-        <w:t xml:space="preserve">Живая деревенская церковь с шатровой колокольней 1909 года: службы здесь не прекращались даже в военные годы.</w:t>
-      </w:r>
-    </w:p>
-    <w:p>
-      <w:pPr>
-        <w:spacing w:after="120" w:line="276"/>
-        <w:jc w:val="both"/>
-      </w:pPr>
-      <w:r>
-        <w:rPr>
-          <w:rFonts w:ascii="Times New Roman" w:cs="Times New Roman" w:eastAsia="Times New Roman" w:hAnsi="Times New Roman"/>
           <w:sz w:val="24"/>
           <w:szCs w:val="24"/>
         </w:rPr>
@@ -842,22 +798,6 @@
       <w:r>
         <w:rPr>
           <w:rFonts w:ascii="Times New Roman" w:cs="Times New Roman" w:eastAsia="Times New Roman" w:hAnsi="Times New Roman"/>
-          <w:i/>
-          <w:iCs/>
-          <w:sz w:val="24"/>
-          <w:szCs w:val="24"/>
-        </w:rPr>
-        <w:t xml:space="preserve">«Крепостной» облик с двумя башнями под шатром и богатая приходская история: в конце XIX века церковь собирала 2461 прихожанина из 17 селений, а при ней работали школы в четырёх деревнях и богадельня.</w:t>
-      </w:r>
-    </w:p>
-    <w:p>
-      <w:pPr>
-        <w:spacing w:after="120" w:line="276"/>
-        <w:jc w:val="both"/>
-      </w:pPr>
-      <w:r>
-        <w:rPr>
-          <w:rFonts w:ascii="Times New Roman" w:cs="Times New Roman" w:eastAsia="Times New Roman" w:hAnsi="Times New Roman"/>
           <w:sz w:val="24"/>
           <w:szCs w:val="24"/>
         </w:rPr>
@@ -1044,22 +984,6 @@
           <w:szCs w:val="24"/>
         </w:rPr>
         <w:t xml:space="preserve">3. Церковь Святителя Николая Чудотворца (1844)</w:t>
-      </w:r>
-    </w:p>
-    <w:p>
-      <w:pPr>
-        <w:spacing w:after="120" w:line="276"/>
-        <w:jc w:val="both"/>
-      </w:pPr>
-      <w:r>
-        <w:rPr>
-          <w:rFonts w:ascii="Times New Roman" w:cs="Times New Roman" w:eastAsia="Times New Roman" w:hAnsi="Times New Roman"/>
-          <w:i/>
-          <w:iCs/>
-          <w:sz w:val="24"/>
-          <w:szCs w:val="24"/>
-        </w:rPr>
-        <w:t xml:space="preserve">Самый крупный храм тройки: три престола, 35-метровый купол и вместимость до 3000 человек — плюс легенда о «перепутанном» проекте, будто готовившемся для украинского Дубна.</w:t>
       </w:r>
     </w:p>
     <w:p>
@@ -1253,7 +1177,7 @@
           <w:sz w:val="24"/>
           <w:szCs w:val="24"/>
         </w:rPr>
-        <w:t xml:space="preserve">Способы передвижения и расстояния до каждой остановки — от Гродно (областной центр) и от Мостов (районный центр).</w:t>
+        <w:t xml:space="preserve">Способы передвижения и расстояния до каждой остановки: Гродно (областной центр), Мосты (районный центр).</w:t>
       </w:r>
     </w:p>
     <w:p>
@@ -1657,7 +1581,7 @@
           <w:sz w:val="24"/>
           <w:szCs w:val="24"/>
         </w:rPr>
-        <w:t xml:space="preserve">Где начинается маршрут: автовокзал Гродно и автостанция «Мосты»</w:t>
+        <w:t xml:space="preserve">Начало маршрута: автовокзал Гродно, автостанция «Мосты»</w:t>
       </w:r>
     </w:p>
     <w:p>
@@ -1735,7 +1659,7 @@
           <w:sz w:val="20"/>
           <w:szCs w:val="20"/>
         </w:rPr>
-        <w:t xml:space="preserve">Проверено 16.09.2026. Источник: сайт и приложение «Транспорт BY» (официальный сервис областного оператора) — маршруты и время на остановках; расписания остановок на сайте ГП «Оператор пассажирских перевозок» (файлы по маршрутам Мостовского района, в том числе «Гудевичи на Гродно» и «Гудевичи на Мосты»); контакты автостанции «Мосты» — ОАО «Гроднооблавтотранс» (grodnotrans.by), контакты автовокзала Гродно — оттуда же.</w:t>
+        <w:t xml:space="preserve">Источник: сайт и приложение «Транспорт BY» (официальный сервис областного оператора) — маршруты и время на остановках; расписания остановок на сайте ГП «Оператор пассажирских перевозок» (файлы по маршрутам Мостовского района, в том числе «Гудевичи на Гродно» и «Гудевичи на Мосты»); контакты автостанции «Мосты» — ОАО «Гроднооблавтотранс» (grodnotrans.by), контакты автовокзала Гродно — оттуда же.</w:t>
       </w:r>
     </w:p>
     <w:p>
@@ -2510,122 +2434,92 @@
     </w:p>
     <w:p>
       <w:pPr>
-        <w:spacing w:after="120" w:line="276"/>
-        <w:jc w:val="both"/>
-      </w:pPr>
-      <w:r>
-        <w:rPr>
-          <w:rFonts w:ascii="Times New Roman" w:cs="Times New Roman" w:eastAsia="Times New Roman" w:hAnsi="Times New Roman"/>
-          <w:sz w:val="24"/>
-          <w:szCs w:val="24"/>
-        </w:rPr>
-        <w:t xml:space="preserve">В деревнях Гудевичи, Лунно и Дубно пунктов питания нет — берите воду и еду с собой. Кафе и столовая есть в Мостах, на обратном пути.</w:t>
-      </w:r>
-    </w:p>
-    <w:p>
-      <w:pPr>
-        <w:pStyle w:val="ListParagraph"/>
-        <w:numPr>
-          <w:ilvl w:val="0"/>
-          <w:numId w:val="2"/>
-        </w:numPr>
-        <w:spacing w:after="60" w:line="276"/>
-      </w:pPr>
-      <w:r>
-        <w:rPr>
-          <w:rFonts w:ascii="Times New Roman" w:cs="Times New Roman" w:eastAsia="Times New Roman" w:hAnsi="Times New Roman"/>
-          <w:sz w:val="24"/>
-          <w:szCs w:val="24"/>
-        </w:rPr>
-        <w:t xml:space="preserve">Столовая «Мостовдрев» — г. Мосты, ул. Советская, 40, пн–пт 9:00–18:00 — адрес и часы сверены с OpenStreetMap 16.09.2026</w:t>
-      </w:r>
-    </w:p>
-    <w:p>
-      <w:pPr>
-        <w:pStyle w:val="ListParagraph"/>
-        <w:numPr>
-          <w:ilvl w:val="0"/>
-          <w:numId w:val="2"/>
-        </w:numPr>
-        <w:spacing w:after="60" w:line="276"/>
-      </w:pPr>
-      <w:r>
-        <w:rPr>
-          <w:rFonts w:ascii="Times New Roman" w:cs="Times New Roman" w:eastAsia="Times New Roman" w:hAnsi="Times New Roman"/>
-          <w:sz w:val="24"/>
-          <w:szCs w:val="24"/>
-        </w:rPr>
-        <w:t xml:space="preserve">Пиццерия «Томат» — г. Мосты, ул. Советская, 19, пн–чт 14:00–23:00, пт–вс 11:00–00:00 — адрес и часы сверены с OpenStreetMap 16.09.2026</w:t>
-      </w:r>
-    </w:p>
-    <w:p>
-      <w:pPr>
-        <w:pStyle w:val="ListParagraph"/>
-        <w:numPr>
-          <w:ilvl w:val="0"/>
-          <w:numId w:val="2"/>
-        </w:numPr>
-        <w:spacing w:after="60" w:line="276"/>
-      </w:pPr>
-      <w:r>
-        <w:rPr>
-          <w:rFonts w:ascii="Times New Roman" w:cs="Times New Roman" w:eastAsia="Times New Roman" w:hAnsi="Times New Roman"/>
-          <w:sz w:val="24"/>
-          <w:szCs w:val="24"/>
-        </w:rPr>
-        <w:t xml:space="preserve">Кафе «Сабрина» — г. Мосты, ул. Ленина — адрес и часы сверены с OpenStreetMap 16.09.2026</w:t>
-      </w:r>
-    </w:p>
-    <w:p>
-      <w:pPr>
-        <w:pStyle w:val="ListParagraph"/>
-        <w:numPr>
-          <w:ilvl w:val="0"/>
-          <w:numId w:val="2"/>
-        </w:numPr>
-        <w:spacing w:after="60" w:line="276"/>
-      </w:pPr>
-      <w:r>
-        <w:rPr>
-          <w:rFonts w:ascii="Times New Roman" w:cs="Times New Roman" w:eastAsia="Times New Roman" w:hAnsi="Times New Roman"/>
-          <w:sz w:val="24"/>
-          <w:szCs w:val="24"/>
-        </w:rPr>
-        <w:t xml:space="preserve">Кафе «Неман» — г. Мосты, пер. Пушкина, 2 — место указано по ранним записям, проверьте перед поездкой</w:t>
-      </w:r>
-    </w:p>
-    <w:p>
-      <w:pPr>
-        <w:pStyle w:val="ListParagraph"/>
-        <w:numPr>
-          <w:ilvl w:val="0"/>
-          <w:numId w:val="2"/>
-        </w:numPr>
-        <w:spacing w:after="60" w:line="276"/>
-      </w:pPr>
-      <w:r>
-        <w:rPr>
-          <w:rFonts w:ascii="Times New Roman" w:cs="Times New Roman" w:eastAsia="Times New Roman" w:hAnsi="Times New Roman"/>
-          <w:sz w:val="24"/>
-          <w:szCs w:val="24"/>
-        </w:rPr>
-        <w:t xml:space="preserve">Закусочная «Тмин» — г. Мосты, ул. Советская, 48 — место указано по ранним записям, проверьте перед поездкой</w:t>
-      </w:r>
-    </w:p>
-    <w:p>
-      <w:pPr>
-        <w:spacing w:after="120" w:line="276"/>
-        <w:jc w:val="both"/>
-      </w:pPr>
-      <w:r>
-        <w:rPr>
-          <w:rFonts w:ascii="Times New Roman" w:cs="Times New Roman" w:eastAsia="Times New Roman" w:hAnsi="Times New Roman"/>
-          <w:i/>
-          <w:iCs/>
-          <w:sz w:val="20"/>
-          <w:szCs w:val="20"/>
-        </w:rPr>
-        <w:t xml:space="preserve">адреса и часы работы сверены с OpenStreetMap 16.09.2026; пункты без пометки «проверено» требуют проверки перед поездкой</w:t>
+        <w:pStyle w:val="ListParagraph"/>
+        <w:numPr>
+          <w:ilvl w:val="0"/>
+          <w:numId w:val="2"/>
+        </w:numPr>
+        <w:spacing w:after="60" w:line="276"/>
+      </w:pPr>
+      <w:r>
+        <w:rPr>
+          <w:rFonts w:ascii="Times New Roman" w:cs="Times New Roman" w:eastAsia="Times New Roman" w:hAnsi="Times New Roman"/>
+          <w:sz w:val="24"/>
+          <w:szCs w:val="24"/>
+        </w:rPr>
+        <w:t xml:space="preserve">Столовая «Мостовдрев» — г. Мосты, ул. Советская, 40, пн–пт 9:00–18:00</w:t>
+      </w:r>
+    </w:p>
+    <w:p>
+      <w:pPr>
+        <w:pStyle w:val="ListParagraph"/>
+        <w:numPr>
+          <w:ilvl w:val="0"/>
+          <w:numId w:val="2"/>
+        </w:numPr>
+        <w:spacing w:after="60" w:line="276"/>
+      </w:pPr>
+      <w:r>
+        <w:rPr>
+          <w:rFonts w:ascii="Times New Roman" w:cs="Times New Roman" w:eastAsia="Times New Roman" w:hAnsi="Times New Roman"/>
+          <w:sz w:val="24"/>
+          <w:szCs w:val="24"/>
+        </w:rPr>
+        <w:t xml:space="preserve">Пиццерия «Томат» — г. Мосты, ул. Советская, 19, пн–чт 14:00–23:00, пт–вс 11:00–00:00</w:t>
+      </w:r>
+    </w:p>
+    <w:p>
+      <w:pPr>
+        <w:pStyle w:val="ListParagraph"/>
+        <w:numPr>
+          <w:ilvl w:val="0"/>
+          <w:numId w:val="2"/>
+        </w:numPr>
+        <w:spacing w:after="60" w:line="276"/>
+      </w:pPr>
+      <w:r>
+        <w:rPr>
+          <w:rFonts w:ascii="Times New Roman" w:cs="Times New Roman" w:eastAsia="Times New Roman" w:hAnsi="Times New Roman"/>
+          <w:sz w:val="24"/>
+          <w:szCs w:val="24"/>
+        </w:rPr>
+        <w:t xml:space="preserve">Кафе «Сабрина» — г. Мосты, ул. Ленина</w:t>
+      </w:r>
+    </w:p>
+    <w:p>
+      <w:pPr>
+        <w:pStyle w:val="ListParagraph"/>
+        <w:numPr>
+          <w:ilvl w:val="0"/>
+          <w:numId w:val="2"/>
+        </w:numPr>
+        <w:spacing w:after="60" w:line="276"/>
+      </w:pPr>
+      <w:r>
+        <w:rPr>
+          <w:rFonts w:ascii="Times New Roman" w:cs="Times New Roman" w:eastAsia="Times New Roman" w:hAnsi="Times New Roman"/>
+          <w:sz w:val="24"/>
+          <w:szCs w:val="24"/>
+        </w:rPr>
+        <w:t xml:space="preserve">Кафе «Неман» — г. Мосты, пер. Пушкина, 2 — проверьте перед поездкой</w:t>
+      </w:r>
+    </w:p>
+    <w:p>
+      <w:pPr>
+        <w:pStyle w:val="ListParagraph"/>
+        <w:numPr>
+          <w:ilvl w:val="0"/>
+          <w:numId w:val="2"/>
+        </w:numPr>
+        <w:spacing w:after="60" w:line="276"/>
+      </w:pPr>
+      <w:r>
+        <w:rPr>
+          <w:rFonts w:ascii="Times New Roman" w:cs="Times New Roman" w:eastAsia="Times New Roman" w:hAnsi="Times New Roman"/>
+          <w:sz w:val="24"/>
+          <w:szCs w:val="24"/>
+        </w:rPr>
+        <w:t xml:space="preserve">Закусочная «Тмин» — г. Мосты, ул. Советская, 48 — проверьте перед поездкой</w:t>
       </w:r>
     </w:p>
     <w:p>
@@ -2641,145 +2535,49 @@
           <w:sz w:val="28"/>
           <w:szCs w:val="28"/>
         </w:rPr>
-        <w:t xml:space="preserve">Список источников</w:t>
-      </w:r>
-    </w:p>
-    <w:p>
-      <w:pPr>
-        <w:spacing w:after="120" w:line="276"/>
-        <w:jc w:val="both"/>
-      </w:pPr>
-      <w:r>
-        <w:rPr>
-          <w:rFonts w:ascii="Times New Roman" w:cs="Times New Roman" w:eastAsia="Times New Roman" w:hAnsi="Times New Roman"/>
-          <w:sz w:val="24"/>
-          <w:szCs w:val="24"/>
-        </w:rPr>
-        <w:t xml:space="preserve">Критерии конкурса требуют не менее пяти источников, включая беседу со священником или старожилом. Готово 5 из 6.</w:t>
-      </w:r>
-    </w:p>
-    <w:p>
-      <w:pPr>
-        <w:pStyle w:val="ListParagraph"/>
-        <w:numPr>
-          <w:ilvl w:val="0"/>
-          <w:numId w:val="2"/>
-        </w:numPr>
-        <w:spacing w:after="60" w:line="276"/>
-      </w:pPr>
-      <w:r>
-        <w:rPr>
-          <w:rFonts w:ascii="Times New Roman" w:cs="Times New Roman" w:eastAsia="Times New Roman" w:hAnsi="Times New Roman"/>
-          <w:sz w:val="24"/>
-          <w:szCs w:val="24"/>
-        </w:rPr>
-        <w:t xml:space="preserve">[выполнено] orthos.org — карточки храмов: настоятели, расписание, телефоны</w:t>
-      </w:r>
-    </w:p>
-    <w:p>
-      <w:pPr>
-        <w:pStyle w:val="ListParagraph"/>
-        <w:numPr>
-          <w:ilvl w:val="0"/>
-          <w:numId w:val="2"/>
-        </w:numPr>
-        <w:spacing w:after="60" w:line="276"/>
-      </w:pPr>
-      <w:r>
-        <w:rPr>
-          <w:rFonts w:ascii="Times New Roman" w:cs="Times New Roman" w:eastAsia="Times New Roman" w:hAnsi="Times New Roman"/>
-          <w:sz w:val="24"/>
-          <w:szCs w:val="24"/>
-        </w:rPr>
-        <w:t xml:space="preserve">[выполнено] «Достопримечательности Мостовского района» — официальный туристический сборник района</w:t>
-      </w:r>
-    </w:p>
-    <w:p>
-      <w:pPr>
-        <w:pStyle w:val="ListParagraph"/>
-        <w:numPr>
-          <w:ilvl w:val="0"/>
-          <w:numId w:val="2"/>
-        </w:numPr>
-        <w:spacing w:after="60" w:line="276"/>
-      </w:pPr>
-      <w:r>
-        <w:rPr>
-          <w:rFonts w:ascii="Times New Roman" w:cs="Times New Roman" w:eastAsia="Times New Roman" w:hAnsi="Times New Roman"/>
-          <w:sz w:val="24"/>
-          <w:szCs w:val="24"/>
-        </w:rPr>
-        <w:t xml:space="preserve">[выполнено] planetabelarus.by — координаты и описания объектов</w:t>
-      </w:r>
-    </w:p>
-    <w:p>
-      <w:pPr>
-        <w:pStyle w:val="ListParagraph"/>
-        <w:numPr>
-          <w:ilvl w:val="0"/>
-          <w:numId w:val="2"/>
-        </w:numPr>
-        <w:spacing w:after="60" w:line="276"/>
-      </w:pPr>
-      <w:r>
-        <w:rPr>
-          <w:rFonts w:ascii="Times New Roman" w:cs="Times New Roman" w:eastAsia="Times New Roman" w:hAnsi="Times New Roman"/>
-          <w:sz w:val="24"/>
-          <w:szCs w:val="24"/>
-        </w:rPr>
-        <w:t xml:space="preserve">[выполнено] sobory.ru — каталог православных храмов</w:t>
-      </w:r>
-    </w:p>
-    <w:p>
-      <w:pPr>
-        <w:pStyle w:val="ListParagraph"/>
-        <w:numPr>
-          <w:ilvl w:val="0"/>
-          <w:numId w:val="2"/>
-        </w:numPr>
-        <w:spacing w:after="60" w:line="276"/>
-      </w:pPr>
-      <w:r>
-        <w:rPr>
-          <w:rFonts w:ascii="Times New Roman" w:cs="Times New Roman" w:eastAsia="Times New Roman" w:hAnsi="Times New Roman"/>
-          <w:sz w:val="24"/>
-          <w:szCs w:val="24"/>
-        </w:rPr>
-        <w:t xml:space="preserve">[выполнено] OpenStreetMap — дорожные маршруты и километраж</w:t>
-      </w:r>
-    </w:p>
-    <w:p>
-      <w:pPr>
-        <w:pStyle w:val="ListParagraph"/>
-        <w:numPr>
-          <w:ilvl w:val="0"/>
-          <w:numId w:val="2"/>
-        </w:numPr>
-        <w:spacing w:after="60" w:line="276"/>
-      </w:pPr>
-      <w:r>
-        <w:rPr>
-          <w:rFonts w:ascii="Times New Roman" w:cs="Times New Roman" w:eastAsia="Times New Roman" w:hAnsi="Times New Roman"/>
-          <w:sz w:val="24"/>
-          <w:szCs w:val="24"/>
-        </w:rPr>
-        <w:t xml:space="preserve">[в работе] Беседа со священником или старожилом — запись интервью</w:t>
-      </w:r>
-    </w:p>
-    <w:p>
-      <w:pPr>
-        <w:spacing w:after="120" w:line="276"/>
-        <w:jc w:val="both"/>
-      </w:pPr>
-      <w:r>
-        <w:rPr>
-          <w:rFonts w:ascii="Times New Roman" w:cs="Times New Roman" w:eastAsia="Times New Roman" w:hAnsi="Times New Roman"/>
-          <w:i/>
-          <w:iCs/>
-          <w:sz w:val="20"/>
-          <w:szCs w:val="20"/>
-        </w:rPr>
-        <w:t xml:space="preserve">Незакрытые пункты завершает автор проекта: запись беседы собирается во время поездки.</w:t>
+        <w:t xml:space="preserve">Авторы проекта</w:t>
+      </w:r>
+    </w:p>
+    <w:p>
+      <w:pPr>
+        <w:spacing w:after="120" w:line="276"/>
+        <w:jc w:val="both"/>
+      </w:pPr>
+      <w:r>
+        <w:rPr>
+          <w:rFonts w:ascii="Times New Roman" w:cs="Times New Roman" w:eastAsia="Times New Roman" w:hAnsi="Times New Roman"/>
+          <w:b/>
+          <w:bCs/>
+          <w:sz w:val="24"/>
+          <w:szCs w:val="24"/>
+        </w:rPr>
+        <w:t xml:space="preserve">Руководитель проекта: </w:t>
+      </w:r>
+      <w:r>
+        <w:rPr>
+          <w:rFonts w:ascii="Times New Roman" w:cs="Times New Roman" w:eastAsia="Times New Roman" w:hAnsi="Times New Roman"/>
+          <w:sz w:val="24"/>
+          <w:szCs w:val="24"/>
+        </w:rPr>
+        <w:t xml:space="preserve">Величко Татьяна Фредьевна. </w:t>
+      </w:r>
+      <w:r>
+        <w:rPr>
+          <w:rFonts w:ascii="Times New Roman" w:cs="Times New Roman" w:eastAsia="Times New Roman" w:hAnsi="Times New Roman"/>
+          <w:b/>
+          <w:bCs/>
+          <w:sz w:val="24"/>
+          <w:szCs w:val="24"/>
+        </w:rPr>
+        <w:t xml:space="preserve">Разработчик сайта: </w:t>
+      </w:r>
+      <w:r>
+        <w:rPr>
+          <w:rFonts w:ascii="Times New Roman" w:cs="Times New Roman" w:eastAsia="Times New Roman" w:hAnsi="Times New Roman"/>
+          <w:sz w:val="24"/>
+          <w:szCs w:val="24"/>
+        </w:rPr>
+        <w:t xml:space="preserve">Юлиан Ступчик.</w:t>
       </w:r>
     </w:p>
     <w:p>
@@ -2878,7 +2676,7 @@
         </w:rPr>
         <w:t xml:space="preserve">Автор: Сяргей Яраховіч (Валацуга), Wikimedia Commons, CC BY-SA 3.0 — </w:t>
       </w:r>
-      <w:hyperlink w:history="1" r:id="rIdnb3-ysc1pqthe37n3sulv">
+      <w:hyperlink w:history="1" r:id="rId312xnfnb0q87aicv8_7fy">
         <w:r>
           <w:rPr>
             <w:rFonts w:ascii="Times New Roman" w:cs="Times New Roman" w:eastAsia="Times New Roman" w:hAnsi="Times New Roman"/>
@@ -2892,30 +2690,6 @@
           <w:t xml:space="preserve">страница файла на Wikimedia Commons</w:t>
         </w:r>
       </w:hyperlink>
-    </w:p>
-    <w:p>
-      <w:pPr>
-        <w:spacing w:after="120" w:line="276"/>
-        <w:jc w:val="both"/>
-      </w:pPr>
-      <w:r>
-        <w:rPr>
-          <w:rFonts w:ascii="Times New Roman" w:cs="Times New Roman" w:eastAsia="Times New Roman" w:hAnsi="Times New Roman"/>
-          <w:b/>
-          <w:bCs/>
-          <w:sz w:val="24"/>
-          <w:szCs w:val="24"/>
-        </w:rPr>
-        <w:t xml:space="preserve">Чем привлекателен: </w:t>
-      </w:r>
-      <w:r>
-        <w:rPr>
-          <w:rFonts w:ascii="Times New Roman" w:cs="Times New Roman" w:eastAsia="Times New Roman" w:hAnsi="Times New Roman"/>
-          <w:sz w:val="24"/>
-          <w:szCs w:val="24"/>
-        </w:rPr>
-        <w:t xml:space="preserve">Живая деревенская церковь с шатровой колокольней 1909 года: службы здесь не прекращались даже в военные годы.</w:t>
-      </w:r>
     </w:p>
     <w:p>
       <w:pPr>
@@ -3301,7 +3075,7 @@
         </w:rPr>
         <w:t xml:space="preserve">Автор: В.Васіленка (fgb.by), Wikimedia Commons, CC BY-SA 3.0 — </w:t>
       </w:r>
-      <w:hyperlink w:history="1" r:id="rIdifmwp_p3dmt_p0fpc8jrf">
+      <w:hyperlink w:history="1" r:id="rId2sl5ehfbakg2bevha0fqp">
         <w:r>
           <w:rPr>
             <w:rFonts w:ascii="Times New Roman" w:cs="Times New Roman" w:eastAsia="Times New Roman" w:hAnsi="Times New Roman"/>
@@ -3315,30 +3089,6 @@
           <w:t xml:space="preserve">страница файла на Wikimedia Commons</w:t>
         </w:r>
       </w:hyperlink>
-    </w:p>
-    <w:p>
-      <w:pPr>
-        <w:spacing w:after="120" w:line="276"/>
-        <w:jc w:val="both"/>
-      </w:pPr>
-      <w:r>
-        <w:rPr>
-          <w:rFonts w:ascii="Times New Roman" w:cs="Times New Roman" w:eastAsia="Times New Roman" w:hAnsi="Times New Roman"/>
-          <w:b/>
-          <w:bCs/>
-          <w:sz w:val="24"/>
-          <w:szCs w:val="24"/>
-        </w:rPr>
-        <w:t xml:space="preserve">Чем привлекателен: </w:t>
-      </w:r>
-      <w:r>
-        <w:rPr>
-          <w:rFonts w:ascii="Times New Roman" w:cs="Times New Roman" w:eastAsia="Times New Roman" w:hAnsi="Times New Roman"/>
-          <w:sz w:val="24"/>
-          <w:szCs w:val="24"/>
-        </w:rPr>
-        <w:t xml:space="preserve">«Крепостной» облик с двумя башнями под шатром и богатая приходская история: в конце XIX века церковь собирала 2461 прихожанина из 17 селений, а при ней работали школы в четырёх деревнях и богадельня.</w:t>
-      </w:r>
     </w:p>
     <w:p>
       <w:pPr>
@@ -3756,7 +3506,7 @@
         </w:rPr>
         <w:t xml:space="preserve">Автор: desukov (Panoramio), Wikimedia Commons, CC BY 3.0 — </w:t>
       </w:r>
-      <w:hyperlink w:history="1" r:id="rIdruawmbqcwccp-xwqn0q1d">
+      <w:hyperlink w:history="1" r:id="rIddtly_gxfa-n8qgqc25ohu">
         <w:r>
           <w:rPr>
             <w:rFonts w:ascii="Times New Roman" w:cs="Times New Roman" w:eastAsia="Times New Roman" w:hAnsi="Times New Roman"/>
@@ -3770,30 +3520,6 @@
           <w:t xml:space="preserve">страница файла на Wikimedia Commons</w:t>
         </w:r>
       </w:hyperlink>
-    </w:p>
-    <w:p>
-      <w:pPr>
-        <w:spacing w:after="120" w:line="276"/>
-        <w:jc w:val="both"/>
-      </w:pPr>
-      <w:r>
-        <w:rPr>
-          <w:rFonts w:ascii="Times New Roman" w:cs="Times New Roman" w:eastAsia="Times New Roman" w:hAnsi="Times New Roman"/>
-          <w:b/>
-          <w:bCs/>
-          <w:sz w:val="24"/>
-          <w:szCs w:val="24"/>
-        </w:rPr>
-        <w:t xml:space="preserve">Чем привлекателен: </w:t>
-      </w:r>
-      <w:r>
-        <w:rPr>
-          <w:rFonts w:ascii="Times New Roman" w:cs="Times New Roman" w:eastAsia="Times New Roman" w:hAnsi="Times New Roman"/>
-          <w:sz w:val="24"/>
-          <w:szCs w:val="24"/>
-        </w:rPr>
-        <w:t xml:space="preserve">Самый крупный храм тройки: три престола, 35-метровый купол и вместимость до 3000 человек — плюс легенда о «перепутанном» проекте, будто готовившемся для украинского Дубна.</w:t>
-      </w:r>
     </w:p>
     <w:p>
       <w:pPr>

</xml_diff>

<commit_message>
copy: drop the cafe caveat and the unrendered food fields; refresh the plan
Owner follow-up: the «проверьте перед поездкой» mark on the two unverified
cafes goes too, and the per-church food notes were removed outright — they
never rendered anywhere. MASTER-PLAN.md now describes the site as it is after
the 2026-09-27 review instead of documenting the removed checklist, check
stamps and appeal blurbs as live features.

🤖 Generated with Codebuff
Co-Authored-By: Codebuff <noreply@codebuff.com>
</commit_message>
<xml_diff>
--- a/Дорогами-духовности-сайт.docx
+++ b/Дорогами-духовности-сайт.docx
@@ -2501,25 +2501,25 @@
           <w:sz w:val="24"/>
           <w:szCs w:val="24"/>
         </w:rPr>
-        <w:t xml:space="preserve">Кафе «Неман» — г. Мосты, пер. Пушкина, 2 — проверьте перед поездкой</w:t>
-      </w:r>
-    </w:p>
-    <w:p>
-      <w:pPr>
-        <w:pStyle w:val="ListParagraph"/>
-        <w:numPr>
-          <w:ilvl w:val="0"/>
-          <w:numId w:val="2"/>
-        </w:numPr>
-        <w:spacing w:after="60" w:line="276"/>
-      </w:pPr>
-      <w:r>
-        <w:rPr>
-          <w:rFonts w:ascii="Times New Roman" w:cs="Times New Roman" w:eastAsia="Times New Roman" w:hAnsi="Times New Roman"/>
-          <w:sz w:val="24"/>
-          <w:szCs w:val="24"/>
-        </w:rPr>
-        <w:t xml:space="preserve">Закусочная «Тмин» — г. Мосты, ул. Советская, 48 — проверьте перед поездкой</w:t>
+        <w:t xml:space="preserve">Кафе «Неман» — г. Мосты, пер. Пушкина, 2</w:t>
+      </w:r>
+    </w:p>
+    <w:p>
+      <w:pPr>
+        <w:pStyle w:val="ListParagraph"/>
+        <w:numPr>
+          <w:ilvl w:val="0"/>
+          <w:numId w:val="2"/>
+        </w:numPr>
+        <w:spacing w:after="60" w:line="276"/>
+      </w:pPr>
+      <w:r>
+        <w:rPr>
+          <w:rFonts w:ascii="Times New Roman" w:cs="Times New Roman" w:eastAsia="Times New Roman" w:hAnsi="Times New Roman"/>
+          <w:sz w:val="24"/>
+          <w:szCs w:val="24"/>
+        </w:rPr>
+        <w:t xml:space="preserve">Закусочная «Тмин» — г. Мосты, ул. Советская, 48</w:t>
       </w:r>
     </w:p>
     <w:p>
@@ -2676,7 +2676,7 @@
         </w:rPr>
         <w:t xml:space="preserve">Автор: Сяргей Яраховіч (Валацуга), Wikimedia Commons, CC BY-SA 3.0 — </w:t>
       </w:r>
-      <w:hyperlink w:history="1" r:id="rId312xnfnb0q87aicv8_7fy">
+      <w:hyperlink w:history="1" r:id="rIda8iusydtihz61ngt1j3p-">
         <w:r>
           <w:rPr>
             <w:rFonts w:ascii="Times New Roman" w:cs="Times New Roman" w:eastAsia="Times New Roman" w:hAnsi="Times New Roman"/>
@@ -3075,7 +3075,7 @@
         </w:rPr>
         <w:t xml:space="preserve">Автор: В.Васіленка (fgb.by), Wikimedia Commons, CC BY-SA 3.0 — </w:t>
       </w:r>
-      <w:hyperlink w:history="1" r:id="rId2sl5ehfbakg2bevha0fqp">
+      <w:hyperlink w:history="1" r:id="rId_lmolikq6x9_nucrxvita">
         <w:r>
           <w:rPr>
             <w:rFonts w:ascii="Times New Roman" w:cs="Times New Roman" w:eastAsia="Times New Roman" w:hAnsi="Times New Roman"/>
@@ -3506,7 +3506,7 @@
         </w:rPr>
         <w:t xml:space="preserve">Автор: desukov (Panoramio), Wikimedia Commons, CC BY 3.0 — </w:t>
       </w:r>
-      <w:hyperlink w:history="1" r:id="rIddtly_gxfa-n8qgqc25ohu">
+      <w:hyperlink w:history="1" r:id="rId5duzptxzyhfhlxojtxmlk">
         <w:r>
           <w:rPr>
             <w:rFonts w:ascii="Times New Roman" w:cs="Times New Roman" w:eastAsia="Times New Roman" w:hAnsi="Times New Roman"/>

</xml_diff>